<commit_message>
Documentação de alteração dia a dia
</commit_message>
<xml_diff>
--- a/Pauta Claude.docx
+++ b/Pauta Claude.docx
@@ -44,7 +44,15 @@
         <w:t xml:space="preserve"> </w:t>
       </w:r>
       <w:r>
-        <w:t>Adicionado filtro de “Atualização”, onde teremos a possibilidade de organizar os leads pela ordem de atualização no Followize, permitindo assim analisar os leads que estão mais tempo parado e os que foram atualizados.</w:t>
+        <w:t xml:space="preserve">Adicionado filtro de “Atualização”, onde teremos a possibilidade de organizar os leads pela ordem de atualização no </w:t>
+      </w:r>
+      <w:proofErr w:type="spellStart"/>
+      <w:r>
+        <w:t>Followize</w:t>
+      </w:r>
+      <w:proofErr w:type="spellEnd"/>
+      <w:r>
+        <w:t>, permitindo assim analisar os leads que estão mais tempo parado e os que foram atualizados.</w:t>
       </w:r>
     </w:p>
     <w:p>
@@ -117,8 +125,44 @@
         <w:rPr>
           <w:rFonts w:ascii="Segoe UI Emoji" w:hAnsi="Segoe UI Emoji" w:cs="Segoe UI Emoji"/>
         </w:rPr>
-        <w:t xml:space="preserve"> Será importante analisar com Simone a atualização real do Followize das meninas, especialmente no tocante as vendas que são sinalizadas via Google Sheets no Grupo O2 Solution</w:t>
-      </w:r>
+        <w:t xml:space="preserve"> Será importante analisar com Simone a atualização real do </w:t>
+      </w:r>
+      <w:proofErr w:type="spellStart"/>
+      <w:r>
+        <w:rPr>
+          <w:rFonts w:ascii="Segoe UI Emoji" w:hAnsi="Segoe UI Emoji" w:cs="Segoe UI Emoji"/>
+        </w:rPr>
+        <w:t>Followize</w:t>
+      </w:r>
+      <w:proofErr w:type="spellEnd"/>
+      <w:r>
+        <w:rPr>
+          <w:rFonts w:ascii="Segoe UI Emoji" w:hAnsi="Segoe UI Emoji" w:cs="Segoe UI Emoji"/>
+        </w:rPr>
+        <w:t xml:space="preserve"> das meninas, especialmente no tocante as vendas que são sinalizadas via Google </w:t>
+      </w:r>
+      <w:proofErr w:type="spellStart"/>
+      <w:r>
+        <w:rPr>
+          <w:rFonts w:ascii="Segoe UI Emoji" w:hAnsi="Segoe UI Emoji" w:cs="Segoe UI Emoji"/>
+        </w:rPr>
+        <w:t>Sheets</w:t>
+      </w:r>
+      <w:proofErr w:type="spellEnd"/>
+      <w:r>
+        <w:rPr>
+          <w:rFonts w:ascii="Segoe UI Emoji" w:hAnsi="Segoe UI Emoji" w:cs="Segoe UI Emoji"/>
+        </w:rPr>
+        <w:t xml:space="preserve"> no Grupo O2 </w:t>
+      </w:r>
+      <w:proofErr w:type="spellStart"/>
+      <w:r>
+        <w:rPr>
+          <w:rFonts w:ascii="Segoe UI Emoji" w:hAnsi="Segoe UI Emoji" w:cs="Segoe UI Emoji"/>
+        </w:rPr>
+        <w:t>Solution</w:t>
+      </w:r>
+      <w:proofErr w:type="spellEnd"/>
       <w:r>
         <w:rPr>
           <w:rFonts w:ascii="Segoe UI Emoji" w:hAnsi="Segoe UI Emoji" w:cs="Segoe UI Emoji"/>
@@ -127,6 +171,11 @@
       </w:r>
     </w:p>
     <w:p>
+      <w:pPr>
+        <w:rPr>
+          <w:rFonts w:ascii="Segoe UI Emoji" w:hAnsi="Segoe UI Emoji" w:cs="Segoe UI Emoji"/>
+        </w:rPr>
+      </w:pPr>
       <w:r>
         <w:rPr>
           <w:rFonts w:ascii="Segoe UI Emoji" w:hAnsi="Segoe UI Emoji" w:cs="Segoe UI Emoji"/>
@@ -139,6 +188,1439 @@
         </w:rPr>
         <w:t xml:space="preserve"> No período da manhã de 07/05, será necessário atualizar o formato da data e hora da “última atualização” no campo “leads recentes”.</w:t>
       </w:r>
+    </w:p>
+    <w:p>
+      <w:pPr>
+        <w:ind w:left="2124"/>
+        <w:rPr>
+          <w:b/>
+          <w:bCs/>
+        </w:rPr>
+      </w:pPr>
+    </w:p>
+    <w:p>
+      <w:pPr>
+        <w:rPr>
+          <w:b/>
+          <w:bCs/>
+        </w:rPr>
+      </w:pPr>
+      <w:r>
+        <w:rPr>
+          <w:b/>
+          <w:bCs/>
+        </w:rPr>
+        <w:t xml:space="preserve">                                   </w:t>
+      </w:r>
+      <w:r>
+        <w:rPr>
+          <w:b/>
+          <w:bCs/>
+        </w:rPr>
+        <w:t xml:space="preserve">Pauta </w:t>
+      </w:r>
+      <w:r>
+        <w:rPr>
+          <w:b/>
+          <w:bCs/>
+        </w:rPr>
+        <w:t xml:space="preserve">desenvolvimento </w:t>
+      </w:r>
+      <w:r>
+        <w:rPr>
+          <w:b/>
+          <w:bCs/>
+        </w:rPr>
+        <w:t>– 0</w:t>
+      </w:r>
+      <w:r>
+        <w:rPr>
+          <w:b/>
+          <w:bCs/>
+        </w:rPr>
+        <w:t>7</w:t>
+      </w:r>
+      <w:r>
+        <w:rPr>
+          <w:b/>
+          <w:bCs/>
+        </w:rPr>
+        <w:t>/05</w:t>
+      </w:r>
+      <w:r>
+        <w:rPr>
+          <w:b/>
+          <w:bCs/>
+        </w:rPr>
+        <w:t xml:space="preserve"> </w:t>
+      </w:r>
+      <w:r>
+        <w:rPr>
+          <w:b/>
+          <w:bCs/>
+          <w:shd w:val="clear" w:color="auto" w:fill="FFFF00"/>
+        </w:rPr>
+        <w:t>(ATENÇÃO)</w:t>
+      </w:r>
+    </w:p>
+    <w:p>
+      <w:pPr>
+        <w:rPr>
+          <w:rFonts w:ascii="Segoe UI Emoji" w:hAnsi="Segoe UI Emoji" w:cs="Segoe UI Emoji"/>
+        </w:rPr>
+      </w:pPr>
+      <w:r>
+        <w:rPr>
+          <w:rFonts w:ascii="Segoe UI Emoji" w:hAnsi="Segoe UI Emoji" w:cs="Segoe UI Emoji"/>
+        </w:rPr>
+        <w:t>✅</w:t>
+      </w:r>
+      <w:r>
+        <w:rPr>
+          <w:rFonts w:ascii="Segoe UI Emoji" w:hAnsi="Segoe UI Emoji" w:cs="Segoe UI Emoji"/>
+        </w:rPr>
+        <w:t xml:space="preserve"> Inserir uma espécie de </w:t>
+      </w:r>
+      <w:r>
+        <w:rPr>
+          <w:rFonts w:ascii="Segoe UI Emoji" w:hAnsi="Segoe UI Emoji" w:cs="Segoe UI Emoji"/>
+        </w:rPr>
+        <w:t>separação entre as abas, pois, ao filtrar “funil de vendas”, não deve interferir em “visão geral”, por exemplo. Tendo isso, poderei fazer cada aba de forma independente.</w:t>
+      </w:r>
+    </w:p>
+    <w:p>
+      <w:pPr>
+        <w:rPr>
+          <w:rFonts w:ascii="Segoe UI Emoji" w:hAnsi="Segoe UI Emoji" w:cs="Segoe UI Emoji"/>
+        </w:rPr>
+      </w:pPr>
+      <w:r>
+        <w:rPr>
+          <w:rFonts w:ascii="Segoe UI Emoji" w:hAnsi="Segoe UI Emoji" w:cs="Segoe UI Emoji"/>
+        </w:rPr>
+        <w:t>✅</w:t>
+      </w:r>
+      <w:r>
+        <w:rPr>
+          <w:rFonts w:ascii="Segoe UI Emoji" w:hAnsi="Segoe UI Emoji" w:cs="Segoe UI Emoji"/>
+        </w:rPr>
+        <w:t xml:space="preserve">Alterar o nome “visão geral” para Equipe </w:t>
+      </w:r>
+      <w:r>
+        <w:rPr>
+          <w:rFonts w:ascii="Segoe UI Emoji" w:hAnsi="Segoe UI Emoji" w:cs="Segoe UI Emoji"/>
+        </w:rPr>
+        <w:t>–</w:t>
+      </w:r>
+      <w:r>
+        <w:rPr>
+          <w:rFonts w:ascii="Segoe UI Emoji" w:hAnsi="Segoe UI Emoji" w:cs="Segoe UI Emoji"/>
+        </w:rPr>
+        <w:t xml:space="preserve"> SDR</w:t>
+      </w:r>
+    </w:p>
+    <w:p>
+      <w:pPr>
+        <w:rPr>
+          <w:rFonts w:ascii="Segoe UI Emoji" w:hAnsi="Segoe UI Emoji" w:cs="Segoe UI Emoji"/>
+        </w:rPr>
+      </w:pPr>
+      <w:r>
+        <w:rPr>
+          <w:rFonts w:ascii="Segoe UI Emoji" w:hAnsi="Segoe UI Emoji" w:cs="Segoe UI Emoji"/>
+        </w:rPr>
+        <w:t>✅</w:t>
+      </w:r>
+      <w:r>
+        <w:rPr>
+          <w:rFonts w:ascii="Segoe UI Emoji" w:hAnsi="Segoe UI Emoji" w:cs="Segoe UI Emoji"/>
+        </w:rPr>
+        <w:t xml:space="preserve"> Seria possível adicionarmos um menu lateral com submenus? </w:t>
+      </w:r>
+      <w:proofErr w:type="spellStart"/>
+      <w:r>
+        <w:rPr>
+          <w:rFonts w:ascii="Segoe UI Emoji" w:hAnsi="Segoe UI Emoji" w:cs="Segoe UI Emoji"/>
+        </w:rPr>
+        <w:t>Ex</w:t>
+      </w:r>
+      <w:proofErr w:type="spellEnd"/>
+      <w:r>
+        <w:rPr>
+          <w:rFonts w:ascii="Segoe UI Emoji" w:hAnsi="Segoe UI Emoji" w:cs="Segoe UI Emoji"/>
+        </w:rPr>
+        <w:t>:</w:t>
+      </w:r>
+    </w:p>
+    <w:p>
+      <w:pPr>
+        <w:rPr>
+          <w:rFonts w:ascii="Segoe UI Emoji" w:hAnsi="Segoe UI Emoji" w:cs="Segoe UI Emoji"/>
+        </w:rPr>
+      </w:pPr>
+      <w:r>
+        <w:rPr>
+          <w:rFonts w:ascii="Segoe UI Emoji" w:hAnsi="Segoe UI Emoji" w:cs="Segoe UI Emoji"/>
+        </w:rPr>
+        <w:t xml:space="preserve">       </w:t>
+      </w:r>
+      <w:r>
+        <w:rPr>
+          <w:rFonts w:ascii="Segoe UI Emoji" w:hAnsi="Segoe UI Emoji" w:cs="Segoe UI Emoji"/>
+        </w:rPr>
+        <w:t>Menu inicial</w:t>
+      </w:r>
+      <w:r>
+        <w:rPr>
+          <w:rFonts w:ascii="Segoe UI Emoji" w:hAnsi="Segoe UI Emoji" w:cs="Segoe UI Emoji"/>
+        </w:rPr>
+        <w:t xml:space="preserve">                           Equipe SDR</w:t>
+      </w:r>
+    </w:p>
+    <w:p>
+      <w:pPr>
+        <w:rPr>
+          <w:rFonts w:ascii="Segoe UI Emoji" w:hAnsi="Segoe UI Emoji" w:cs="Segoe UI Emoji"/>
+        </w:rPr>
+      </w:pPr>
+      <w:r>
+        <w:rPr>
+          <w:rFonts w:ascii="Segoe UI Emoji" w:hAnsi="Segoe UI Emoji" w:cs="Segoe UI Emoji"/>
+        </w:rPr>
+        <w:tab/>
+        <w:t xml:space="preserve">    </w:t>
+      </w:r>
+      <w:r>
+        <w:rPr>
+          <w:rFonts w:ascii="Segoe UI Emoji" w:hAnsi="Segoe UI Emoji" w:cs="Segoe UI Emoji"/>
+        </w:rPr>
+        <w:t>🔻</w:t>
+      </w:r>
+      <w:r>
+        <w:rPr>
+          <w:rFonts w:ascii="Segoe UI Emoji" w:hAnsi="Segoe UI Emoji" w:cs="Segoe UI Emoji"/>
+        </w:rPr>
+        <w:t xml:space="preserve">                                         </w:t>
+      </w:r>
+      <w:r>
+        <w:rPr>
+          <w:rFonts w:ascii="Segoe UI Emoji" w:hAnsi="Segoe UI Emoji" w:cs="Segoe UI Emoji"/>
+        </w:rPr>
+        <w:t>🔻</w:t>
+      </w:r>
+    </w:p>
+    <w:p>
+      <w:pPr>
+        <w:rPr>
+          <w:rFonts w:ascii="Segoe UI Emoji" w:hAnsi="Segoe UI Emoji" w:cs="Segoe UI Emoji"/>
+        </w:rPr>
+      </w:pPr>
+      <w:r>
+        <w:rPr>
+          <w:rFonts w:ascii="Segoe UI Emoji" w:hAnsi="Segoe UI Emoji" w:cs="Segoe UI Emoji"/>
+        </w:rPr>
+        <w:t xml:space="preserve">       Equipe</w:t>
+      </w:r>
+      <w:r>
+        <w:rPr>
+          <w:rFonts w:ascii="Segoe UI Emoji" w:hAnsi="Segoe UI Emoji" w:cs="Segoe UI Emoji"/>
+        </w:rPr>
+        <w:t xml:space="preserve"> análise</w:t>
+      </w:r>
+      <w:r>
+        <w:rPr>
+          <w:rFonts w:ascii="Segoe UI Emoji" w:hAnsi="Segoe UI Emoji" w:cs="Segoe UI Emoji"/>
+        </w:rPr>
+        <w:t xml:space="preserve">                        Detalhamento por dia</w:t>
+      </w:r>
+    </w:p>
+    <w:p>
+      <w:pPr>
+        <w:rPr>
+          <w:rFonts w:ascii="Segoe UI Emoji" w:hAnsi="Segoe UI Emoji" w:cs="Segoe UI Emoji"/>
+        </w:rPr>
+      </w:pPr>
+      <w:r>
+        <w:rPr>
+          <w:rFonts w:ascii="Segoe UI Emoji" w:hAnsi="Segoe UI Emoji" w:cs="Segoe UI Emoji"/>
+        </w:rPr>
+        <w:t xml:space="preserve">                </w:t>
+      </w:r>
+      <w:r>
+        <w:rPr>
+          <w:rFonts w:ascii="Segoe UI Emoji" w:hAnsi="Segoe UI Emoji" w:cs="Segoe UI Emoji"/>
+        </w:rPr>
+        <w:t>🔻</w:t>
+      </w:r>
+      <w:r>
+        <w:rPr>
+          <w:rFonts w:ascii="Segoe UI Emoji" w:hAnsi="Segoe UI Emoji" w:cs="Segoe UI Emoji"/>
+        </w:rPr>
+        <w:t xml:space="preserve">                                          </w:t>
+      </w:r>
+      <w:r>
+        <w:rPr>
+          <w:rFonts w:ascii="Segoe UI Emoji" w:hAnsi="Segoe UI Emoji" w:cs="Segoe UI Emoji"/>
+        </w:rPr>
+        <w:t>🔻</w:t>
+      </w:r>
+    </w:p>
+    <w:p>
+      <w:pPr>
+        <w:rPr>
+          <w:rFonts w:ascii="Segoe UI Emoji" w:hAnsi="Segoe UI Emoji" w:cs="Segoe UI Emoji"/>
+        </w:rPr>
+      </w:pPr>
+      <w:r>
+        <w:rPr>
+          <w:rFonts w:ascii="Segoe UI Emoji" w:hAnsi="Segoe UI Emoji" w:cs="Segoe UI Emoji"/>
+        </w:rPr>
+        <w:t xml:space="preserve">        Funil de vendas </w:t>
+      </w:r>
+      <w:r>
+        <w:rPr>
+          <w:rFonts w:ascii="Segoe UI Emoji" w:hAnsi="Segoe UI Emoji" w:cs="Segoe UI Emoji"/>
+        </w:rPr>
+        <w:t xml:space="preserve">                    </w:t>
+      </w:r>
+      <w:r>
+        <w:rPr>
+          <w:rFonts w:ascii="Segoe UI Emoji" w:hAnsi="Segoe UI Emoji" w:cs="Segoe UI Emoji"/>
+        </w:rPr>
+        <w:t>Situação de discagem</w:t>
+      </w:r>
+    </w:p>
+    <w:p>
+      <w:pPr>
+        <w:rPr>
+          <w:rFonts w:ascii="Segoe UI Emoji" w:hAnsi="Segoe UI Emoji" w:cs="Segoe UI Emoji"/>
+        </w:rPr>
+      </w:pPr>
+      <w:r>
+        <w:rPr>
+          <w:rFonts w:ascii="Segoe UI Emoji" w:hAnsi="Segoe UI Emoji" w:cs="Segoe UI Emoji"/>
+        </w:rPr>
+        <w:t>✅</w:t>
+      </w:r>
+      <w:r>
+        <w:rPr>
+          <w:rFonts w:ascii="Segoe UI Emoji" w:hAnsi="Segoe UI Emoji" w:cs="Segoe UI Emoji"/>
+        </w:rPr>
+        <w:t xml:space="preserve"> Otimização do tempo de carregamento ao alterar menus</w:t>
+      </w:r>
+    </w:p>
+    <w:p>
+      <w:pPr>
+        <w:ind w:left="1416" w:firstLine="708"/>
+        <w:rPr>
+          <w:rFonts w:ascii="Segoe UI Emoji" w:hAnsi="Segoe UI Emoji" w:cs="Segoe UI Emoji"/>
+        </w:rPr>
+      </w:pPr>
+      <w:r>
+        <w:rPr>
+          <w:b/>
+          <w:bCs/>
+        </w:rPr>
+        <w:lastRenderedPageBreak/>
+        <w:t xml:space="preserve">Pauta </w:t>
+      </w:r>
+      <w:r>
+        <w:rPr>
+          <w:b/>
+          <w:bCs/>
+        </w:rPr>
+        <w:t xml:space="preserve">desenvolvimento </w:t>
+      </w:r>
+      <w:r>
+        <w:rPr>
+          <w:b/>
+          <w:bCs/>
+        </w:rPr>
+        <w:t>– 0</w:t>
+      </w:r>
+      <w:r>
+        <w:rPr>
+          <w:b/>
+          <w:bCs/>
+        </w:rPr>
+        <w:t>8</w:t>
+      </w:r>
+      <w:r>
+        <w:rPr>
+          <w:b/>
+          <w:bCs/>
+        </w:rPr>
+        <w:t>/05</w:t>
+      </w:r>
+    </w:p>
+    <w:p>
+      <w:pPr>
+        <w:rPr>
+          <w:b/>
+          <w:bCs/>
+        </w:rPr>
+      </w:pPr>
+    </w:p>
+    <w:p>
+      <w:pPr>
+        <w:rPr>
+          <w:rFonts w:ascii="Segoe UI Emoji" w:hAnsi="Segoe UI Emoji" w:cs="Segoe UI Emoji"/>
+        </w:rPr>
+      </w:pPr>
+      <w:r>
+        <w:rPr>
+          <w:rFonts w:ascii="Segoe UI Emoji" w:hAnsi="Segoe UI Emoji" w:cs="Segoe UI Emoji"/>
+        </w:rPr>
+        <w:t>✅</w:t>
+      </w:r>
+      <w:r>
+        <w:rPr>
+          <w:rFonts w:ascii="Segoe UI Emoji" w:hAnsi="Segoe UI Emoji" w:cs="Segoe UI Emoji"/>
+        </w:rPr>
+        <w:t>Na aba de “Funil de vendas”, retirado o título e subtítulo, realocando assim filtros da aba, origem, status e temperatura um pouco mais para cima, permitindo melhor visualização.</w:t>
+      </w:r>
+    </w:p>
+    <w:p>
+      <w:pPr>
+        <w:rPr>
+          <w:rFonts w:ascii="Segoe UI Emoji" w:hAnsi="Segoe UI Emoji" w:cs="Segoe UI Emoji"/>
+        </w:rPr>
+      </w:pPr>
+      <w:r>
+        <w:rPr>
+          <w:rFonts w:ascii="Segoe UI Emoji" w:hAnsi="Segoe UI Emoji" w:cs="Segoe UI Emoji"/>
+        </w:rPr>
+        <w:t>✅</w:t>
+      </w:r>
+      <w:r>
+        <w:rPr>
+          <w:rFonts w:ascii="Segoe UI Emoji" w:hAnsi="Segoe UI Emoji" w:cs="Segoe UI Emoji"/>
+        </w:rPr>
+        <w:t xml:space="preserve">Alteração </w:t>
+      </w:r>
+      <w:r>
+        <w:rPr>
+          <w:rFonts w:ascii="Segoe UI Emoji" w:hAnsi="Segoe UI Emoji" w:cs="Segoe UI Emoji"/>
+        </w:rPr>
+        <w:t xml:space="preserve">referente a data de atualização e filtro da API. Mantive os 80 ou 90 dias da API apenas para o “funil de vendas”, uma vez que os leads entre </w:t>
+      </w:r>
+      <w:proofErr w:type="spellStart"/>
+      <w:r>
+        <w:rPr>
+          <w:rFonts w:ascii="Segoe UI Emoji" w:hAnsi="Segoe UI Emoji" w:cs="Segoe UI Emoji"/>
+        </w:rPr>
+        <w:t>Rayanna</w:t>
+      </w:r>
+      <w:proofErr w:type="spellEnd"/>
+      <w:r>
+        <w:rPr>
+          <w:rFonts w:ascii="Segoe UI Emoji" w:hAnsi="Segoe UI Emoji" w:cs="Segoe UI Emoji"/>
+        </w:rPr>
+        <w:t xml:space="preserve"> e Giovanna tem histórico longo.</w:t>
+      </w:r>
+      <w:r>
+        <w:rPr>
+          <w:rFonts w:ascii="Segoe UI Emoji" w:hAnsi="Segoe UI Emoji" w:cs="Segoe UI Emoji"/>
+        </w:rPr>
+        <w:t xml:space="preserve"> Para as demais abas, período de 30 dias.</w:t>
+      </w:r>
+    </w:p>
+    <w:p>
+      <w:pPr>
+        <w:rPr>
+          <w:rFonts w:ascii="Segoe UI Emoji" w:hAnsi="Segoe UI Emoji" w:cs="Segoe UI Emoji"/>
+        </w:rPr>
+      </w:pPr>
+    </w:p>
+    <w:p>
+      <w:pPr>
+        <w:ind w:left="1416" w:firstLine="708"/>
+        <w:rPr>
+          <w:b/>
+          <w:bCs/>
+        </w:rPr>
+      </w:pPr>
+      <w:r>
+        <w:rPr>
+          <w:b/>
+          <w:bCs/>
+        </w:rPr>
+        <w:t xml:space="preserve">Pauta </w:t>
+      </w:r>
+      <w:r>
+        <w:rPr>
+          <w:b/>
+          <w:bCs/>
+        </w:rPr>
+        <w:t xml:space="preserve">desenvolvimento </w:t>
+      </w:r>
+      <w:r>
+        <w:rPr>
+          <w:b/>
+          <w:bCs/>
+        </w:rPr>
+        <w:t xml:space="preserve">– </w:t>
+      </w:r>
+      <w:r>
+        <w:rPr>
+          <w:b/>
+          <w:bCs/>
+        </w:rPr>
+        <w:t>11</w:t>
+      </w:r>
+      <w:r>
+        <w:rPr>
+          <w:b/>
+          <w:bCs/>
+        </w:rPr>
+        <w:t>/05</w:t>
+      </w:r>
+    </w:p>
+    <w:p>
+      <w:pPr>
+        <w:rPr>
+          <w:rFonts w:ascii="Segoe UI Emoji" w:hAnsi="Segoe UI Emoji" w:cs="Segoe UI Emoji"/>
+        </w:rPr>
+      </w:pPr>
+    </w:p>
+    <w:p>
+      <w:pPr>
+        <w:rPr>
+          <w:rFonts w:ascii="Segoe UI Emoji" w:hAnsi="Segoe UI Emoji" w:cs="Segoe UI Emoji"/>
+        </w:rPr>
+      </w:pPr>
+      <w:r>
+        <w:rPr>
+          <w:rFonts w:ascii="Segoe UI Emoji" w:hAnsi="Segoe UI Emoji" w:cs="Segoe UI Emoji"/>
+        </w:rPr>
+        <w:t>✅</w:t>
+      </w:r>
+      <w:r>
+        <w:rPr>
+          <w:rFonts w:ascii="Segoe UI Emoji" w:hAnsi="Segoe UI Emoji" w:cs="Segoe UI Emoji"/>
+        </w:rPr>
+        <w:t>Buscar inserir as seguintes mudanças:</w:t>
+      </w:r>
+    </w:p>
+    <w:p>
+      <w:pPr>
+        <w:pStyle w:val="PargrafodaLista"/>
+        <w:numPr>
+          <w:ilvl w:val="0"/>
+          <w:numId w:val="1"/>
+        </w:numPr>
+        <w:rPr>
+          <w:rFonts w:ascii="Segoe UI Emoji" w:hAnsi="Segoe UI Emoji" w:cs="Segoe UI Emoji"/>
+        </w:rPr>
+      </w:pPr>
+      <w:r>
+        <w:rPr>
+          <w:rFonts w:ascii="Segoe UI Emoji" w:hAnsi="Segoe UI Emoji" w:cs="Segoe UI Emoji"/>
+        </w:rPr>
+        <w:t xml:space="preserve">Quadro de histórico – todas as informações cadastradas no </w:t>
+      </w:r>
+      <w:proofErr w:type="spellStart"/>
+      <w:r>
+        <w:rPr>
+          <w:rFonts w:ascii="Segoe UI Emoji" w:hAnsi="Segoe UI Emoji" w:cs="Segoe UI Emoji"/>
+        </w:rPr>
+        <w:t>Followize</w:t>
+      </w:r>
+      <w:proofErr w:type="spellEnd"/>
+    </w:p>
+    <w:p>
+      <w:pPr>
+        <w:pStyle w:val="PargrafodaLista"/>
+        <w:numPr>
+          <w:ilvl w:val="0"/>
+          <w:numId w:val="1"/>
+        </w:numPr>
+        <w:rPr>
+          <w:rFonts w:ascii="Segoe UI Emoji" w:hAnsi="Segoe UI Emoji" w:cs="Segoe UI Emoji"/>
+        </w:rPr>
+      </w:pPr>
+      <w:r>
+        <w:rPr>
+          <w:rFonts w:ascii="Segoe UI Emoji" w:hAnsi="Segoe UI Emoji" w:cs="Segoe UI Emoji"/>
+        </w:rPr>
+        <w:t xml:space="preserve">Quadro de canal </w:t>
+      </w:r>
+      <w:r>
+        <w:rPr>
+          <w:rFonts w:ascii="Segoe UI Emoji" w:hAnsi="Segoe UI Emoji" w:cs="Segoe UI Emoji"/>
+        </w:rPr>
+        <w:t>✅</w:t>
+      </w:r>
+    </w:p>
+    <w:p>
+      <w:pPr>
+        <w:pStyle w:val="PargrafodaLista"/>
+        <w:numPr>
+          <w:ilvl w:val="0"/>
+          <w:numId w:val="1"/>
+        </w:numPr>
+        <w:rPr>
+          <w:rFonts w:ascii="Segoe UI Emoji" w:hAnsi="Segoe UI Emoji" w:cs="Segoe UI Emoji"/>
+        </w:rPr>
+      </w:pPr>
+      <w:r>
+        <w:rPr>
+          <w:rFonts w:ascii="Segoe UI Emoji" w:hAnsi="Segoe UI Emoji" w:cs="Segoe UI Emoji"/>
+        </w:rPr>
+        <w:t xml:space="preserve">Avanço dos leads </w:t>
+      </w:r>
+    </w:p>
+    <w:p>
+      <w:pPr>
+        <w:pStyle w:val="PargrafodaLista"/>
+        <w:numPr>
+          <w:ilvl w:val="0"/>
+          <w:numId w:val="1"/>
+        </w:numPr>
+        <w:rPr>
+          <w:rFonts w:ascii="Segoe UI Emoji" w:hAnsi="Segoe UI Emoji" w:cs="Segoe UI Emoji"/>
+        </w:rPr>
+      </w:pPr>
+      <w:r>
+        <w:rPr>
+          <w:rFonts w:ascii="Segoe UI Emoji" w:hAnsi="Segoe UI Emoji" w:cs="Segoe UI Emoji"/>
+        </w:rPr>
+        <w:t>Sinalização de leads vencidos</w:t>
+      </w:r>
+      <w:r>
+        <w:rPr>
+          <w:rFonts w:ascii="Segoe UI Emoji" w:hAnsi="Segoe UI Emoji" w:cs="Segoe UI Emoji"/>
+        </w:rPr>
+        <w:t xml:space="preserve"> </w:t>
+      </w:r>
+      <w:r>
+        <w:rPr>
+          <w:rFonts w:ascii="Segoe UI Emoji" w:hAnsi="Segoe UI Emoji" w:cs="Segoe UI Emoji"/>
+        </w:rPr>
+        <w:t>✅</w:t>
+      </w:r>
+    </w:p>
+    <w:p>
+      <w:pPr>
+        <w:pStyle w:val="PargrafodaLista"/>
+        <w:numPr>
+          <w:ilvl w:val="0"/>
+          <w:numId w:val="1"/>
+        </w:numPr>
+        <w:rPr>
+          <w:rFonts w:ascii="Segoe UI Emoji" w:hAnsi="Segoe UI Emoji" w:cs="Segoe UI Emoji"/>
+        </w:rPr>
+      </w:pPr>
+      <w:r>
+        <w:rPr>
+          <w:rFonts w:ascii="Segoe UI Emoji" w:hAnsi="Segoe UI Emoji" w:cs="Segoe UI Emoji"/>
+        </w:rPr>
+        <w:t xml:space="preserve">Quadro de Base e implementação da aba CRM </w:t>
+      </w:r>
+      <w:r>
+        <w:rPr>
+          <w:rFonts w:ascii="Segoe UI Emoji" w:hAnsi="Segoe UI Emoji" w:cs="Segoe UI Emoji"/>
+        </w:rPr>
+        <w:t>✅</w:t>
+      </w:r>
+    </w:p>
+    <w:p>
+      <w:pPr>
+        <w:rPr>
+          <w:rFonts w:ascii="Segoe UI Emoji" w:hAnsi="Segoe UI Emoji" w:cs="Segoe UI Emoji"/>
+        </w:rPr>
+      </w:pPr>
+    </w:p>
+    <w:p>
+      <w:pPr>
+        <w:rPr>
+          <w:rFonts w:ascii="Segoe UI Emoji" w:hAnsi="Segoe UI Emoji" w:cs="Segoe UI Emoji"/>
+        </w:rPr>
+      </w:pPr>
+    </w:p>
+    <w:p>
+      <w:pPr>
+        <w:rPr>
+          <w:rFonts w:ascii="Segoe UI Emoji" w:hAnsi="Segoe UI Emoji" w:cs="Segoe UI Emoji"/>
+        </w:rPr>
+      </w:pPr>
+    </w:p>
+    <w:p>
+      <w:pPr>
+        <w:rPr>
+          <w:rFonts w:ascii="Segoe UI Emoji" w:hAnsi="Segoe UI Emoji" w:cs="Segoe UI Emoji"/>
+        </w:rPr>
+      </w:pPr>
+    </w:p>
+    <w:p>
+      <w:pPr>
+        <w:rPr>
+          <w:rFonts w:ascii="Segoe UI Emoji" w:hAnsi="Segoe UI Emoji" w:cs="Segoe UI Emoji"/>
+        </w:rPr>
+      </w:pPr>
+    </w:p>
+    <w:p>
+      <w:pPr>
+        <w:rPr>
+          <w:rFonts w:ascii="Segoe UI Emoji" w:hAnsi="Segoe UI Emoji" w:cs="Segoe UI Emoji"/>
+        </w:rPr>
+      </w:pPr>
+    </w:p>
+    <w:p>
+      <w:pPr>
+        <w:rPr>
+          <w:rFonts w:ascii="Segoe UI Emoji" w:hAnsi="Segoe UI Emoji" w:cs="Segoe UI Emoji"/>
+        </w:rPr>
+      </w:pPr>
+    </w:p>
+    <w:p>
+      <w:pPr>
+        <w:rPr>
+          <w:rFonts w:ascii="Segoe UI Emoji" w:hAnsi="Segoe UI Emoji" w:cs="Segoe UI Emoji"/>
+        </w:rPr>
+      </w:pPr>
+    </w:p>
+    <w:p>
+      <w:pPr>
+        <w:ind w:left="1416" w:firstLine="708"/>
+        <w:rPr>
+          <w:rFonts w:ascii="Segoe UI Emoji" w:hAnsi="Segoe UI Emoji" w:cs="Segoe UI Emoji"/>
+          <w:b/>
+          <w:bCs/>
+        </w:rPr>
+      </w:pPr>
+    </w:p>
+    <w:p>
+      <w:pPr>
+        <w:ind w:left="1416" w:firstLine="708"/>
+        <w:rPr>
+          <w:rFonts w:ascii="Segoe UI Emoji" w:hAnsi="Segoe UI Emoji" w:cs="Segoe UI Emoji"/>
+          <w:b/>
+          <w:bCs/>
+        </w:rPr>
+      </w:pPr>
+    </w:p>
+    <w:p>
+      <w:pPr>
+        <w:ind w:left="1416" w:firstLine="708"/>
+        <w:rPr>
+          <w:rFonts w:ascii="Segoe UI Emoji" w:hAnsi="Segoe UI Emoji" w:cs="Segoe UI Emoji"/>
+          <w:b/>
+          <w:bCs/>
+        </w:rPr>
+      </w:pPr>
+    </w:p>
+    <w:p>
+      <w:pPr>
+        <w:ind w:left="1416" w:firstLine="708"/>
+        <w:rPr>
+          <w:rFonts w:ascii="Segoe UI Emoji" w:hAnsi="Segoe UI Emoji" w:cs="Segoe UI Emoji"/>
+          <w:b/>
+          <w:bCs/>
+        </w:rPr>
+      </w:pPr>
+      <w:r>
+        <w:rPr>
+          <w:rFonts w:ascii="Segoe UI Emoji" w:hAnsi="Segoe UI Emoji" w:cs="Segoe UI Emoji"/>
+          <w:b/>
+          <w:bCs/>
+        </w:rPr>
+        <w:lastRenderedPageBreak/>
+        <w:t>Pauta desenvolvimento – 12/05</w:t>
+      </w:r>
+    </w:p>
+    <w:p>
+      <w:pPr>
+        <w:ind w:left="1416" w:firstLine="708"/>
+        <w:rPr>
+          <w:rFonts w:ascii="Segoe UI Emoji" w:hAnsi="Segoe UI Emoji" w:cs="Segoe UI Emoji"/>
+          <w:b/>
+          <w:bCs/>
+        </w:rPr>
+      </w:pPr>
+    </w:p>
+    <w:tbl>
+      <w:tblPr>
+        <w:tblW w:w="0" w:type="auto"/>
+        <w:tblInd w:w="739" w:type="dxa"/>
+        <w:tblBorders>
+          <w:top w:val="single" w:sz="6" w:space="0" w:color="2A2B2C"/>
+          <w:left w:val="single" w:sz="6" w:space="0" w:color="2A2B2C"/>
+          <w:bottom w:val="single" w:sz="6" w:space="0" w:color="2A2B2C"/>
+          <w:right w:val="single" w:sz="6" w:space="0" w:color="2A2B2C"/>
+        </w:tblBorders>
+        <w:shd w:val="clear" w:color="auto" w:fill="191A1B"/>
+        <w:tblCellMar>
+          <w:top w:w="15" w:type="dxa"/>
+          <w:left w:w="15" w:type="dxa"/>
+          <w:bottom w:w="15" w:type="dxa"/>
+          <w:right w:w="15" w:type="dxa"/>
+        </w:tblCellMar>
+        <w:tblLook w:val="04A0" w:firstRow="1" w:lastRow="0" w:firstColumn="1" w:lastColumn="0" w:noHBand="0" w:noVBand="1"/>
+      </w:tblPr>
+      <w:tblGrid>
+        <w:gridCol w:w="1700"/>
+        <w:gridCol w:w="1105"/>
+        <w:gridCol w:w="4210"/>
+      </w:tblGrid>
+      <w:tr>
+        <w:trPr>
+          <w:tblHeader/>
+        </w:trPr>
+        <w:tc>
+          <w:tcPr>
+            <w:tcW w:w="0" w:type="auto"/>
+            <w:tcBorders>
+              <w:top w:val="single" w:sz="6" w:space="0" w:color="2A2B2C"/>
+              <w:left w:val="single" w:sz="6" w:space="0" w:color="2A2B2C"/>
+              <w:bottom w:val="single" w:sz="6" w:space="0" w:color="2A2B2C"/>
+              <w:right w:val="single" w:sz="6" w:space="0" w:color="2A2B2C"/>
+            </w:tcBorders>
+            <w:shd w:val="clear" w:color="auto" w:fill="191A1B"/>
+            <w:tcMar>
+              <w:top w:w="30" w:type="dxa"/>
+              <w:left w:w="30" w:type="dxa"/>
+              <w:bottom w:w="30" w:type="dxa"/>
+              <w:right w:w="30" w:type="dxa"/>
+            </w:tcMar>
+            <w:vAlign w:val="center"/>
+            <w:hideMark/>
+          </w:tcPr>
+          <w:p>
+            <w:pPr>
+              <w:rPr>
+                <w:rFonts w:ascii="Segoe UI Emoji" w:hAnsi="Segoe UI Emoji" w:cs="Segoe UI Emoji"/>
+                <w:b/>
+                <w:bCs/>
+              </w:rPr>
+            </w:pPr>
+            <w:r>
+              <w:rPr>
+                <w:rFonts w:ascii="Segoe UI Emoji" w:hAnsi="Segoe UI Emoji" w:cs="Segoe UI Emoji"/>
+                <w:b/>
+                <w:bCs/>
+              </w:rPr>
+              <w:t>Botão</w:t>
+            </w:r>
+          </w:p>
+        </w:tc>
+        <w:tc>
+          <w:tcPr>
+            <w:tcW w:w="0" w:type="auto"/>
+            <w:tcBorders>
+              <w:top w:val="single" w:sz="6" w:space="0" w:color="2A2B2C"/>
+              <w:left w:val="single" w:sz="6" w:space="0" w:color="2A2B2C"/>
+              <w:bottom w:val="single" w:sz="6" w:space="0" w:color="2A2B2C"/>
+              <w:right w:val="single" w:sz="6" w:space="0" w:color="2A2B2C"/>
+            </w:tcBorders>
+            <w:shd w:val="clear" w:color="auto" w:fill="191A1B"/>
+            <w:tcMar>
+              <w:top w:w="30" w:type="dxa"/>
+              <w:left w:w="30" w:type="dxa"/>
+              <w:bottom w:w="30" w:type="dxa"/>
+              <w:right w:w="30" w:type="dxa"/>
+            </w:tcMar>
+            <w:vAlign w:val="center"/>
+            <w:hideMark/>
+          </w:tcPr>
+          <w:p>
+            <w:pPr>
+              <w:rPr>
+                <w:rFonts w:ascii="Segoe UI Emoji" w:hAnsi="Segoe UI Emoji" w:cs="Segoe UI Emoji"/>
+                <w:b/>
+                <w:bCs/>
+              </w:rPr>
+            </w:pPr>
+            <w:r>
+              <w:rPr>
+                <w:rFonts w:ascii="Segoe UI Emoji" w:hAnsi="Segoe UI Emoji" w:cs="Segoe UI Emoji"/>
+                <w:b/>
+                <w:bCs/>
+              </w:rPr>
+              <w:t>Vai à API?</w:t>
+            </w:r>
+          </w:p>
+        </w:tc>
+        <w:tc>
+          <w:tcPr>
+            <w:tcW w:w="0" w:type="auto"/>
+            <w:tcBorders>
+              <w:top w:val="single" w:sz="6" w:space="0" w:color="2A2B2C"/>
+              <w:left w:val="single" w:sz="6" w:space="0" w:color="2A2B2C"/>
+              <w:bottom w:val="single" w:sz="6" w:space="0" w:color="2A2B2C"/>
+              <w:right w:val="single" w:sz="6" w:space="0" w:color="2A2B2C"/>
+            </w:tcBorders>
+            <w:shd w:val="clear" w:color="auto" w:fill="191A1B"/>
+            <w:tcMar>
+              <w:top w:w="30" w:type="dxa"/>
+              <w:left w:w="30" w:type="dxa"/>
+              <w:bottom w:w="30" w:type="dxa"/>
+              <w:right w:w="30" w:type="dxa"/>
+            </w:tcMar>
+            <w:vAlign w:val="center"/>
+            <w:hideMark/>
+          </w:tcPr>
+          <w:p>
+            <w:pPr>
+              <w:rPr>
+                <w:rFonts w:ascii="Segoe UI Emoji" w:hAnsi="Segoe UI Emoji" w:cs="Segoe UI Emoji"/>
+                <w:b/>
+                <w:bCs/>
+              </w:rPr>
+            </w:pPr>
+            <w:r>
+              <w:rPr>
+                <w:rFonts w:ascii="Segoe UI Emoji" w:hAnsi="Segoe UI Emoji" w:cs="Segoe UI Emoji"/>
+                <w:b/>
+                <w:bCs/>
+              </w:rPr>
+              <w:t>O que busca</w:t>
+            </w:r>
+          </w:p>
+        </w:tc>
+      </w:tr>
+      <w:tr>
+        <w:tc>
+          <w:tcPr>
+            <w:tcW w:w="0" w:type="auto"/>
+            <w:tcBorders>
+              <w:top w:val="single" w:sz="6" w:space="0" w:color="2A2B2C"/>
+              <w:left w:val="single" w:sz="6" w:space="0" w:color="2A2B2C"/>
+              <w:bottom w:val="single" w:sz="6" w:space="0" w:color="2A2B2C"/>
+              <w:right w:val="single" w:sz="6" w:space="0" w:color="2A2B2C"/>
+            </w:tcBorders>
+            <w:shd w:val="clear" w:color="auto" w:fill="191A1B"/>
+            <w:tcMar>
+              <w:top w:w="30" w:type="dxa"/>
+              <w:left w:w="30" w:type="dxa"/>
+              <w:bottom w:w="30" w:type="dxa"/>
+              <w:right w:w="30" w:type="dxa"/>
+            </w:tcMar>
+            <w:vAlign w:val="center"/>
+            <w:hideMark/>
+          </w:tcPr>
+          <w:p>
+            <w:pPr>
+              <w:rPr>
+                <w:rFonts w:ascii="Segoe UI Emoji" w:hAnsi="Segoe UI Emoji" w:cs="Segoe UI Emoji"/>
+              </w:rPr>
+            </w:pPr>
+            <w:r>
+              <w:rPr>
+                <w:rFonts w:ascii="Segoe UI Emoji" w:hAnsi="Segoe UI Emoji" w:cs="Segoe UI Emoji"/>
+                <w:b/>
+                <w:bCs/>
+              </w:rPr>
+              <w:t>Atualizar</w:t>
+            </w:r>
+            <w:r>
+              <w:rPr>
+                <w:rFonts w:ascii="Segoe UI Emoji" w:hAnsi="Segoe UI Emoji" w:cs="Segoe UI Emoji"/>
+              </w:rPr>
+              <w:t> (topo)</w:t>
+            </w:r>
+          </w:p>
+        </w:tc>
+        <w:tc>
+          <w:tcPr>
+            <w:tcW w:w="0" w:type="auto"/>
+            <w:tcBorders>
+              <w:top w:val="single" w:sz="6" w:space="0" w:color="2A2B2C"/>
+              <w:left w:val="single" w:sz="6" w:space="0" w:color="2A2B2C"/>
+              <w:bottom w:val="single" w:sz="6" w:space="0" w:color="2A2B2C"/>
+              <w:right w:val="single" w:sz="6" w:space="0" w:color="2A2B2C"/>
+            </w:tcBorders>
+            <w:shd w:val="clear" w:color="auto" w:fill="191A1B"/>
+            <w:tcMar>
+              <w:top w:w="30" w:type="dxa"/>
+              <w:left w:w="30" w:type="dxa"/>
+              <w:bottom w:w="30" w:type="dxa"/>
+              <w:right w:w="30" w:type="dxa"/>
+            </w:tcMar>
+            <w:vAlign w:val="center"/>
+            <w:hideMark/>
+          </w:tcPr>
+          <w:p>
+            <w:pPr>
+              <w:rPr>
+                <w:rFonts w:ascii="Segoe UI Emoji" w:hAnsi="Segoe UI Emoji" w:cs="Segoe UI Emoji"/>
+              </w:rPr>
+            </w:pPr>
+            <w:r>
+              <w:rPr>
+                <w:rFonts w:ascii="Segoe UI Emoji" w:hAnsi="Segoe UI Emoji" w:cs="Segoe UI Emoji"/>
+              </w:rPr>
+              <w:t>✅ Sim</w:t>
+            </w:r>
+          </w:p>
+        </w:tc>
+        <w:tc>
+          <w:tcPr>
+            <w:tcW w:w="0" w:type="auto"/>
+            <w:tcBorders>
+              <w:top w:val="single" w:sz="6" w:space="0" w:color="2A2B2C"/>
+              <w:left w:val="single" w:sz="6" w:space="0" w:color="2A2B2C"/>
+              <w:bottom w:val="single" w:sz="6" w:space="0" w:color="2A2B2C"/>
+              <w:right w:val="single" w:sz="6" w:space="0" w:color="2A2B2C"/>
+            </w:tcBorders>
+            <w:shd w:val="clear" w:color="auto" w:fill="191A1B"/>
+            <w:tcMar>
+              <w:top w:w="30" w:type="dxa"/>
+              <w:left w:w="30" w:type="dxa"/>
+              <w:bottom w:w="30" w:type="dxa"/>
+              <w:right w:w="30" w:type="dxa"/>
+            </w:tcMar>
+            <w:vAlign w:val="center"/>
+            <w:hideMark/>
+          </w:tcPr>
+          <w:p>
+            <w:pPr>
+              <w:rPr>
+                <w:rFonts w:ascii="Segoe UI Emoji" w:hAnsi="Segoe UI Emoji" w:cs="Segoe UI Emoji"/>
+              </w:rPr>
+            </w:pPr>
+            <w:r>
+              <w:rPr>
+                <w:rFonts w:ascii="Segoe UI Emoji" w:hAnsi="Segoe UI Emoji" w:cs="Segoe UI Emoji"/>
+              </w:rPr>
+              <w:t>Tudo: 30 dias + críticos + hoje</w:t>
+            </w:r>
+          </w:p>
+        </w:tc>
+      </w:tr>
+      <w:tr>
+        <w:tc>
+          <w:tcPr>
+            <w:tcW w:w="0" w:type="auto"/>
+            <w:tcBorders>
+              <w:top w:val="single" w:sz="6" w:space="0" w:color="2A2B2C"/>
+              <w:left w:val="single" w:sz="6" w:space="0" w:color="2A2B2C"/>
+              <w:bottom w:val="single" w:sz="6" w:space="0" w:color="2A2B2C"/>
+              <w:right w:val="single" w:sz="6" w:space="0" w:color="2A2B2C"/>
+            </w:tcBorders>
+            <w:shd w:val="clear" w:color="auto" w:fill="191A1B"/>
+            <w:tcMar>
+              <w:top w:w="30" w:type="dxa"/>
+              <w:left w:w="30" w:type="dxa"/>
+              <w:bottom w:w="30" w:type="dxa"/>
+              <w:right w:w="30" w:type="dxa"/>
+            </w:tcMar>
+            <w:vAlign w:val="center"/>
+            <w:hideMark/>
+          </w:tcPr>
+          <w:p>
+            <w:pPr>
+              <w:rPr>
+                <w:rFonts w:ascii="Segoe UI Emoji" w:hAnsi="Segoe UI Emoji" w:cs="Segoe UI Emoji"/>
+              </w:rPr>
+            </w:pPr>
+            <w:r>
+              <w:rPr>
+                <w:rFonts w:ascii="Segoe UI Emoji" w:hAnsi="Segoe UI Emoji" w:cs="Segoe UI Emoji"/>
+                <w:b/>
+                <w:bCs/>
+              </w:rPr>
+              <w:t>Atualizar Hoje</w:t>
+            </w:r>
+          </w:p>
+        </w:tc>
+        <w:tc>
+          <w:tcPr>
+            <w:tcW w:w="0" w:type="auto"/>
+            <w:tcBorders>
+              <w:top w:val="single" w:sz="6" w:space="0" w:color="2A2B2C"/>
+              <w:left w:val="single" w:sz="6" w:space="0" w:color="2A2B2C"/>
+              <w:bottom w:val="single" w:sz="6" w:space="0" w:color="2A2B2C"/>
+              <w:right w:val="single" w:sz="6" w:space="0" w:color="2A2B2C"/>
+            </w:tcBorders>
+            <w:shd w:val="clear" w:color="auto" w:fill="191A1B"/>
+            <w:tcMar>
+              <w:top w:w="30" w:type="dxa"/>
+              <w:left w:w="30" w:type="dxa"/>
+              <w:bottom w:w="30" w:type="dxa"/>
+              <w:right w:w="30" w:type="dxa"/>
+            </w:tcMar>
+            <w:vAlign w:val="center"/>
+            <w:hideMark/>
+          </w:tcPr>
+          <w:p>
+            <w:pPr>
+              <w:rPr>
+                <w:rFonts w:ascii="Segoe UI Emoji" w:hAnsi="Segoe UI Emoji" w:cs="Segoe UI Emoji"/>
+              </w:rPr>
+            </w:pPr>
+            <w:r>
+              <w:rPr>
+                <w:rFonts w:ascii="Segoe UI Emoji" w:hAnsi="Segoe UI Emoji" w:cs="Segoe UI Emoji"/>
+              </w:rPr>
+              <w:t>✅ Sim</w:t>
+            </w:r>
+          </w:p>
+        </w:tc>
+        <w:tc>
+          <w:tcPr>
+            <w:tcW w:w="0" w:type="auto"/>
+            <w:tcBorders>
+              <w:top w:val="single" w:sz="6" w:space="0" w:color="2A2B2C"/>
+              <w:left w:val="single" w:sz="6" w:space="0" w:color="2A2B2C"/>
+              <w:bottom w:val="single" w:sz="6" w:space="0" w:color="2A2B2C"/>
+              <w:right w:val="single" w:sz="6" w:space="0" w:color="2A2B2C"/>
+            </w:tcBorders>
+            <w:shd w:val="clear" w:color="auto" w:fill="191A1B"/>
+            <w:tcMar>
+              <w:top w:w="30" w:type="dxa"/>
+              <w:left w:w="30" w:type="dxa"/>
+              <w:bottom w:w="30" w:type="dxa"/>
+              <w:right w:w="30" w:type="dxa"/>
+            </w:tcMar>
+            <w:vAlign w:val="center"/>
+            <w:hideMark/>
+          </w:tcPr>
+          <w:p>
+            <w:pPr>
+              <w:rPr>
+                <w:rFonts w:ascii="Segoe UI Emoji" w:hAnsi="Segoe UI Emoji" w:cs="Segoe UI Emoji"/>
+              </w:rPr>
+            </w:pPr>
+            <w:r>
+              <w:rPr>
+                <w:rFonts w:ascii="Segoe UI Emoji" w:hAnsi="Segoe UI Emoji" w:cs="Segoe UI Emoji"/>
+              </w:rPr>
+              <w:t>Só os leads do dia (últimas 48h)</w:t>
+            </w:r>
+          </w:p>
+        </w:tc>
+      </w:tr>
+      <w:tr>
+        <w:tc>
+          <w:tcPr>
+            <w:tcW w:w="0" w:type="auto"/>
+            <w:tcBorders>
+              <w:top w:val="single" w:sz="6" w:space="0" w:color="2A2B2C"/>
+              <w:left w:val="single" w:sz="6" w:space="0" w:color="2A2B2C"/>
+              <w:bottom w:val="single" w:sz="6" w:space="0" w:color="2A2B2C"/>
+              <w:right w:val="single" w:sz="6" w:space="0" w:color="2A2B2C"/>
+            </w:tcBorders>
+            <w:shd w:val="clear" w:color="auto" w:fill="191A1B"/>
+            <w:tcMar>
+              <w:top w:w="30" w:type="dxa"/>
+              <w:left w:w="30" w:type="dxa"/>
+              <w:bottom w:w="30" w:type="dxa"/>
+              <w:right w:w="30" w:type="dxa"/>
+            </w:tcMar>
+            <w:vAlign w:val="center"/>
+            <w:hideMark/>
+          </w:tcPr>
+          <w:p>
+            <w:pPr>
+              <w:rPr>
+                <w:rFonts w:ascii="Segoe UI Emoji" w:hAnsi="Segoe UI Emoji" w:cs="Segoe UI Emoji"/>
+              </w:rPr>
+            </w:pPr>
+            <w:r>
+              <w:rPr>
+                <w:rFonts w:ascii="Segoe UI Emoji" w:hAnsi="Segoe UI Emoji" w:cs="Segoe UI Emoji"/>
+                <w:b/>
+                <w:bCs/>
+              </w:rPr>
+              <w:t>Aplicar</w:t>
+            </w:r>
+          </w:p>
+        </w:tc>
+        <w:tc>
+          <w:tcPr>
+            <w:tcW w:w="0" w:type="auto"/>
+            <w:tcBorders>
+              <w:top w:val="single" w:sz="6" w:space="0" w:color="2A2B2C"/>
+              <w:left w:val="single" w:sz="6" w:space="0" w:color="2A2B2C"/>
+              <w:bottom w:val="single" w:sz="6" w:space="0" w:color="2A2B2C"/>
+              <w:right w:val="single" w:sz="6" w:space="0" w:color="2A2B2C"/>
+            </w:tcBorders>
+            <w:shd w:val="clear" w:color="auto" w:fill="191A1B"/>
+            <w:tcMar>
+              <w:top w:w="30" w:type="dxa"/>
+              <w:left w:w="30" w:type="dxa"/>
+              <w:bottom w:w="30" w:type="dxa"/>
+              <w:right w:w="30" w:type="dxa"/>
+            </w:tcMar>
+            <w:vAlign w:val="center"/>
+            <w:hideMark/>
+          </w:tcPr>
+          <w:p>
+            <w:pPr>
+              <w:rPr>
+                <w:rFonts w:ascii="Segoe UI Emoji" w:hAnsi="Segoe UI Emoji" w:cs="Segoe UI Emoji"/>
+              </w:rPr>
+            </w:pPr>
+            <w:r>
+              <w:rPr>
+                <w:rFonts w:ascii="Segoe UI Emoji" w:hAnsi="Segoe UI Emoji" w:cs="Segoe UI Emoji"/>
+              </w:rPr>
+              <w:t>❌ Não</w:t>
+            </w:r>
+          </w:p>
+        </w:tc>
+        <w:tc>
+          <w:tcPr>
+            <w:tcW w:w="0" w:type="auto"/>
+            <w:tcBorders>
+              <w:top w:val="single" w:sz="6" w:space="0" w:color="2A2B2C"/>
+              <w:left w:val="single" w:sz="6" w:space="0" w:color="2A2B2C"/>
+              <w:bottom w:val="single" w:sz="6" w:space="0" w:color="2A2B2C"/>
+              <w:right w:val="single" w:sz="6" w:space="0" w:color="2A2B2C"/>
+            </w:tcBorders>
+            <w:shd w:val="clear" w:color="auto" w:fill="191A1B"/>
+            <w:tcMar>
+              <w:top w:w="30" w:type="dxa"/>
+              <w:left w:w="30" w:type="dxa"/>
+              <w:bottom w:w="30" w:type="dxa"/>
+              <w:right w:w="30" w:type="dxa"/>
+            </w:tcMar>
+            <w:vAlign w:val="center"/>
+            <w:hideMark/>
+          </w:tcPr>
+          <w:p>
+            <w:pPr>
+              <w:rPr>
+                <w:rFonts w:ascii="Segoe UI Emoji" w:hAnsi="Segoe UI Emoji" w:cs="Segoe UI Emoji"/>
+              </w:rPr>
+            </w:pPr>
+            <w:r>
+              <w:rPr>
+                <w:rFonts w:ascii="Segoe UI Emoji" w:hAnsi="Segoe UI Emoji" w:cs="Segoe UI Emoji"/>
+              </w:rPr>
+              <w:t>Apenas filtra o que já está em memória</w:t>
+            </w:r>
+          </w:p>
+        </w:tc>
+      </w:tr>
+    </w:tbl>
+    <w:p>
+      <w:pPr>
+        <w:rPr>
+          <w:rFonts w:ascii="Segoe UI Emoji" w:hAnsi="Segoe UI Emoji" w:cs="Segoe UI Emoji"/>
+        </w:rPr>
+      </w:pPr>
+    </w:p>
+    <w:p>
+      <w:pPr>
+        <w:numPr>
+          <w:ilvl w:val="0"/>
+          <w:numId w:val="2"/>
+        </w:numPr>
+        <w:rPr>
+          <w:rFonts w:ascii="Segoe UI Emoji" w:hAnsi="Segoe UI Emoji" w:cs="Segoe UI Emoji"/>
+        </w:rPr>
+      </w:pPr>
+      <w:r>
+        <w:rPr>
+          <w:rFonts w:ascii="Segoe UI Emoji" w:hAnsi="Segoe UI Emoji" w:cs="Segoe UI Emoji"/>
+        </w:rPr>
+        <w:t>Quer ver </w:t>
+      </w:r>
+      <w:r>
+        <w:rPr>
+          <w:rFonts w:ascii="Segoe UI Emoji" w:hAnsi="Segoe UI Emoji" w:cs="Segoe UI Emoji"/>
+          <w:b/>
+          <w:bCs/>
+        </w:rPr>
+        <w:t>leads novos cadastrados hoje</w:t>
+      </w:r>
+      <w:r>
+        <w:rPr>
+          <w:rFonts w:ascii="Segoe UI Emoji" w:hAnsi="Segoe UI Emoji" w:cs="Segoe UI Emoji"/>
+        </w:rPr>
+        <w:t> → "Atualizar Hoje" (rápido, busca pouco dado)</w:t>
+      </w:r>
+    </w:p>
+    <w:p>
+      <w:pPr>
+        <w:numPr>
+          <w:ilvl w:val="0"/>
+          <w:numId w:val="2"/>
+        </w:numPr>
+        <w:rPr>
+          <w:rFonts w:ascii="Segoe UI Emoji" w:hAnsi="Segoe UI Emoji" w:cs="Segoe UI Emoji"/>
+        </w:rPr>
+      </w:pPr>
+      <w:r>
+        <w:rPr>
+          <w:rFonts w:ascii="Segoe UI Emoji" w:hAnsi="Segoe UI Emoji" w:cs="Segoe UI Emoji"/>
+        </w:rPr>
+        <w:t>Quer </w:t>
+      </w:r>
+      <w:r>
+        <w:rPr>
+          <w:rFonts w:ascii="Segoe UI Emoji" w:hAnsi="Segoe UI Emoji" w:cs="Segoe UI Emoji"/>
+          <w:b/>
+          <w:bCs/>
+        </w:rPr>
+        <w:t>atualizar tudo</w:t>
+      </w:r>
+      <w:r>
+        <w:rPr>
+          <w:rFonts w:ascii="Segoe UI Emoji" w:hAnsi="Segoe UI Emoji" w:cs="Segoe UI Emoji"/>
+        </w:rPr>
+        <w:t> (período, rankings, operadores) → "Atualizar" no topo</w:t>
+      </w:r>
+    </w:p>
+    <w:p>
+      <w:pPr>
+        <w:numPr>
+          <w:ilvl w:val="0"/>
+          <w:numId w:val="2"/>
+        </w:numPr>
+        <w:rPr>
+          <w:rFonts w:ascii="Segoe UI Emoji" w:hAnsi="Segoe UI Emoji" w:cs="Segoe UI Emoji"/>
+        </w:rPr>
+      </w:pPr>
+      <w:r>
+        <w:rPr>
+          <w:rFonts w:ascii="Segoe UI Emoji" w:hAnsi="Segoe UI Emoji" w:cs="Segoe UI Emoji"/>
+        </w:rPr>
+        <w:t>Quer só </w:t>
+      </w:r>
+      <w:r>
+        <w:rPr>
+          <w:rFonts w:ascii="Segoe UI Emoji" w:hAnsi="Segoe UI Emoji" w:cs="Segoe UI Emoji"/>
+          <w:b/>
+          <w:bCs/>
+        </w:rPr>
+        <w:t>mudar o filtro de operador/data</w:t>
+      </w:r>
+      <w:r>
+        <w:rPr>
+          <w:rFonts w:ascii="Segoe UI Emoji" w:hAnsi="Segoe UI Emoji" w:cs="Segoe UI Emoji"/>
+        </w:rPr>
+        <w:t> → "Aplicar" (instantâneo, sem API</w:t>
+      </w:r>
+      <w:r>
+        <w:rPr>
+          <w:rFonts w:ascii="Segoe UI Emoji" w:hAnsi="Segoe UI Emoji" w:cs="Segoe UI Emoji"/>
+        </w:rPr>
+        <w:t>)</w:t>
+      </w:r>
+    </w:p>
+    <w:p>
+      <w:pPr>
+        <w:rPr>
+          <w:rFonts w:ascii="Segoe UI Emoji" w:hAnsi="Segoe UI Emoji" w:cs="Segoe UI Emoji"/>
+        </w:rPr>
+      </w:pPr>
+    </w:p>
+    <w:p>
+      <w:pPr>
+        <w:ind w:left="720"/>
+        <w:rPr>
+          <w:rFonts w:ascii="Segoe UI Emoji" w:hAnsi="Segoe UI Emoji" w:cs="Segoe UI Emoji"/>
+        </w:rPr>
+      </w:pPr>
+    </w:p>
+    <w:p>
+      <w:pPr>
+        <w:ind w:left="720" w:firstLine="696"/>
+        <w:rPr>
+          <w:rFonts w:ascii="Segoe UI Emoji" w:hAnsi="Segoe UI Emoji" w:cs="Segoe UI Emoji"/>
+          <w:b/>
+          <w:bCs/>
+          <w:i/>
+          <w:iCs/>
+        </w:rPr>
+      </w:pPr>
+      <w:r>
+        <w:rPr>
+          <w:rFonts w:ascii="Segoe UI Emoji" w:hAnsi="Segoe UI Emoji" w:cs="Segoe UI Emoji"/>
+          <w:b/>
+          <w:bCs/>
+          <w:i/>
+          <w:iCs/>
+        </w:rPr>
+        <w:t>Alterações entre CRM e Detalhamento por dia:</w:t>
+      </w:r>
+    </w:p>
+    <w:p>
+      <w:pPr>
+        <w:ind w:left="360"/>
+        <w:rPr>
+          <w:rFonts w:ascii="Segoe UI Emoji" w:hAnsi="Segoe UI Emoji" w:cs="Segoe UI Emoji"/>
+        </w:rPr>
+      </w:pPr>
+    </w:p>
+    <w:p>
+      <w:pPr>
+        <w:pStyle w:val="PargrafodaLista"/>
+        <w:numPr>
+          <w:ilvl w:val="0"/>
+          <w:numId w:val="9"/>
+        </w:numPr>
+        <w:rPr>
+          <w:rFonts w:ascii="Segoe UI Emoji" w:hAnsi="Segoe UI Emoji" w:cs="Segoe UI Emoji"/>
+        </w:rPr>
+      </w:pPr>
+      <w:r>
+        <w:rPr>
+          <w:rFonts w:ascii="Segoe UI Emoji" w:hAnsi="Segoe UI Emoji" w:cs="Segoe UI Emoji"/>
+        </w:rPr>
+        <w:t xml:space="preserve">Acrescentado % de leads captado por base </w:t>
+      </w:r>
+      <w:r>
+        <w:rPr>
+          <w:rFonts w:ascii="Segoe UI Emoji" w:hAnsi="Segoe UI Emoji" w:cs="Segoe UI Emoji"/>
+        </w:rPr>
+        <w:t>✅</w:t>
+      </w:r>
+    </w:p>
+    <w:p>
+      <w:pPr>
+        <w:pStyle w:val="PargrafodaLista"/>
+        <w:numPr>
+          <w:ilvl w:val="0"/>
+          <w:numId w:val="9"/>
+        </w:numPr>
+        <w:rPr>
+          <w:rFonts w:ascii="Segoe UI Emoji" w:hAnsi="Segoe UI Emoji" w:cs="Segoe UI Emoji"/>
+        </w:rPr>
+      </w:pPr>
+      <w:r>
+        <w:rPr>
+          <w:rFonts w:ascii="Segoe UI Emoji" w:hAnsi="Segoe UI Emoji" w:cs="Segoe UI Emoji"/>
+        </w:rPr>
+        <w:t xml:space="preserve">Acrescentado box ao clicar no nome do operador em “Detalhamento por dia” </w:t>
+      </w:r>
+      <w:r>
+        <w:rPr>
+          <w:rFonts w:ascii="Segoe UI Emoji" w:hAnsi="Segoe UI Emoji" w:cs="Segoe UI Emoji"/>
+        </w:rPr>
+        <w:t>para conferir o semanal em captação e gráfico</w:t>
+      </w:r>
+    </w:p>
+    <w:p>
+      <w:pPr>
+        <w:rPr>
+          <w:rFonts w:ascii="Segoe UI Emoji" w:hAnsi="Segoe UI Emoji" w:cs="Segoe UI Emoji"/>
+        </w:rPr>
+      </w:pPr>
+    </w:p>
+    <w:p>
+      <w:pPr>
+        <w:ind w:left="2880"/>
+        <w:rPr>
+          <w:rFonts w:ascii="Segoe UI Emoji" w:hAnsi="Segoe UI Emoji" w:cs="Segoe UI Emoji"/>
+        </w:rPr>
+      </w:pPr>
+      <w:r>
+        <w:rPr>
+          <w:rFonts w:ascii="Segoe UI Emoji" w:hAnsi="Segoe UI Emoji" w:cs="Segoe UI Emoji"/>
+        </w:rPr>
+        <w:br w:type="page"/>
+      </w:r>
+    </w:p>
+    <w:p>
+      <w:pPr>
+        <w:rPr>
+          <w:rFonts w:ascii="Segoe UI Emoji" w:hAnsi="Segoe UI Emoji" w:cs="Segoe UI Emoji"/>
+        </w:rPr>
+      </w:pPr>
     </w:p>
     <w:sectPr>
       <w:pgSz w:w="11906" w:h="16838"/>
@@ -148,6 +1630,1064 @@
     </w:sectPr>
   </w:body>
 </w:document>
+</file>
+
+<file path=word/numbering.xml><?xml version="1.0" encoding="utf-8"?>
+<w:numbering xmlns:wpc="http://schemas.microsoft.com/office/word/2010/wordprocessingCanvas" xmlns:cx="http://schemas.microsoft.com/office/drawing/2014/chartex" xmlns:cx1="http://schemas.microsoft.com/office/drawing/2015/9/8/chartex" xmlns:cx2="http://schemas.microsoft.com/office/drawing/2015/10/21/chartex" xmlns:cx3="http://schemas.microsoft.com/office/drawing/2016/5/9/chartex" xmlns:cx4="http://schemas.microsoft.com/office/drawing/2016/5/10/chartex" xmlns:cx5="http://schemas.microsoft.com/office/drawing/2016/5/11/chartex" xmlns:cx6="http://schemas.microsoft.com/office/drawing/2016/5/12/chartex" xmlns:cx7="http://schemas.microsoft.com/office/drawing/2016/5/13/chartex" xmlns:cx8="http://schemas.microsoft.com/office/drawing/2016/5/14/chartex" xmlns:mc="http://schemas.openxmlformats.org/markup-compatibility/2006" xmlns:aink="http://schemas.microsoft.com/office/drawing/2016/ink" xmlns:am3d="http://schemas.microsoft.com/office/drawing/2017/model3d" xmlns:o="urn:schemas-microsoft-com:office:office" xmlns:oel="http://schemas.microsoft.com/office/2019/extlst" xmlns:r="http://schemas.openxmlformats.org/officeDocument/2006/relationships" xmlns:m="http://schemas.openxmlformats.org/officeDocument/2006/math" xmlns:v="urn:schemas-microsoft-com:vml" xmlns:wp14="http://schemas.microsoft.com/office/word/2010/wordprocessingDrawing" xmlns:wp="http://schemas.openxmlformats.org/drawingml/2006/wordprocessingDrawing" xmlns:w10="urn:schemas-microsoft-com:office:word" xmlns:w="http://schemas.openxmlformats.org/wordprocessingml/2006/main" xmlns:w14="http://schemas.microsoft.com/office/word/2010/wordml" xmlns:w15="http://schemas.microsoft.com/office/word/2012/wordml" xmlns:w16cex="http://schemas.microsoft.com/office/word/2018/wordml/cex" xmlns:w16cid="http://schemas.microsoft.com/office/word/2016/wordml/cid" xmlns:w16="http://schemas.microsoft.com/office/word/2018/wordml" xmlns:w16du="http://schemas.microsoft.com/office/word/2023/wordml/word16du" xmlns:w16sdtdh="http://schemas.microsoft.com/office/word/2020/wordml/sdtdatahash" xmlns:w16sdtfl="http://schemas.microsoft.com/office/word/2024/wordml/sdtformatlock" xmlns:w16se="http://schemas.microsoft.com/office/word/2015/wordml/symex" xmlns:wpg="http://schemas.microsoft.com/office/word/2010/wordprocessingGroup" xmlns:wpi="http://schemas.microsoft.com/office/word/2010/wordprocessingInk" xmlns:wne="http://schemas.microsoft.com/office/word/2006/wordml" xmlns:wps="http://schemas.microsoft.com/office/word/2010/wordprocessingShape" mc:Ignorable="w14 w15 w16se w16cid w16 w16cex w16sdtdh w16sdtfl w16du wp14">
+  <w:abstractNum w:abstractNumId="0" w15:restartNumberingAfterBreak="0">
+    <w:nsid w:val="09FB0619"/>
+    <w:multiLevelType w:val="hybridMultilevel"/>
+    <w:tmpl w:val="98BC08B0"/>
+    <w:lvl w:ilvl="0" w:tplc="04160001">
+      <w:start w:val="1"/>
+      <w:numFmt w:val="bullet"/>
+      <w:lvlText w:val=""/>
+      <w:lvlJc w:val="left"/>
+      <w:pPr>
+        <w:ind w:left="720" w:hanging="360"/>
+      </w:pPr>
+      <w:rPr>
+        <w:rFonts w:ascii="Symbol" w:hAnsi="Symbol" w:hint="default"/>
+      </w:rPr>
+    </w:lvl>
+    <w:lvl w:ilvl="1" w:tplc="04160003" w:tentative="1">
+      <w:start w:val="1"/>
+      <w:numFmt w:val="bullet"/>
+      <w:lvlText w:val="o"/>
+      <w:lvlJc w:val="left"/>
+      <w:pPr>
+        <w:ind w:left="1440" w:hanging="360"/>
+      </w:pPr>
+      <w:rPr>
+        <w:rFonts w:ascii="Courier New" w:hAnsi="Courier New" w:cs="Courier New" w:hint="default"/>
+      </w:rPr>
+    </w:lvl>
+    <w:lvl w:ilvl="2" w:tplc="04160005" w:tentative="1">
+      <w:start w:val="1"/>
+      <w:numFmt w:val="bullet"/>
+      <w:lvlText w:val=""/>
+      <w:lvlJc w:val="left"/>
+      <w:pPr>
+        <w:ind w:left="2160" w:hanging="360"/>
+      </w:pPr>
+      <w:rPr>
+        <w:rFonts w:ascii="Wingdings" w:hAnsi="Wingdings" w:hint="default"/>
+      </w:rPr>
+    </w:lvl>
+    <w:lvl w:ilvl="3" w:tplc="04160001" w:tentative="1">
+      <w:start w:val="1"/>
+      <w:numFmt w:val="bullet"/>
+      <w:lvlText w:val=""/>
+      <w:lvlJc w:val="left"/>
+      <w:pPr>
+        <w:ind w:left="2880" w:hanging="360"/>
+      </w:pPr>
+      <w:rPr>
+        <w:rFonts w:ascii="Symbol" w:hAnsi="Symbol" w:hint="default"/>
+      </w:rPr>
+    </w:lvl>
+    <w:lvl w:ilvl="4" w:tplc="04160003" w:tentative="1">
+      <w:start w:val="1"/>
+      <w:numFmt w:val="bullet"/>
+      <w:lvlText w:val="o"/>
+      <w:lvlJc w:val="left"/>
+      <w:pPr>
+        <w:ind w:left="3600" w:hanging="360"/>
+      </w:pPr>
+      <w:rPr>
+        <w:rFonts w:ascii="Courier New" w:hAnsi="Courier New" w:cs="Courier New" w:hint="default"/>
+      </w:rPr>
+    </w:lvl>
+    <w:lvl w:ilvl="5" w:tplc="04160005" w:tentative="1">
+      <w:start w:val="1"/>
+      <w:numFmt w:val="bullet"/>
+      <w:lvlText w:val=""/>
+      <w:lvlJc w:val="left"/>
+      <w:pPr>
+        <w:ind w:left="4320" w:hanging="360"/>
+      </w:pPr>
+      <w:rPr>
+        <w:rFonts w:ascii="Wingdings" w:hAnsi="Wingdings" w:hint="default"/>
+      </w:rPr>
+    </w:lvl>
+    <w:lvl w:ilvl="6" w:tplc="04160001" w:tentative="1">
+      <w:start w:val="1"/>
+      <w:numFmt w:val="bullet"/>
+      <w:lvlText w:val=""/>
+      <w:lvlJc w:val="left"/>
+      <w:pPr>
+        <w:ind w:left="5040" w:hanging="360"/>
+      </w:pPr>
+      <w:rPr>
+        <w:rFonts w:ascii="Symbol" w:hAnsi="Symbol" w:hint="default"/>
+      </w:rPr>
+    </w:lvl>
+    <w:lvl w:ilvl="7" w:tplc="04160003" w:tentative="1">
+      <w:start w:val="1"/>
+      <w:numFmt w:val="bullet"/>
+      <w:lvlText w:val="o"/>
+      <w:lvlJc w:val="left"/>
+      <w:pPr>
+        <w:ind w:left="5760" w:hanging="360"/>
+      </w:pPr>
+      <w:rPr>
+        <w:rFonts w:ascii="Courier New" w:hAnsi="Courier New" w:cs="Courier New" w:hint="default"/>
+      </w:rPr>
+    </w:lvl>
+    <w:lvl w:ilvl="8" w:tplc="04160005" w:tentative="1">
+      <w:start w:val="1"/>
+      <w:numFmt w:val="bullet"/>
+      <w:lvlText w:val=""/>
+      <w:lvlJc w:val="left"/>
+      <w:pPr>
+        <w:ind w:left="6480" w:hanging="360"/>
+      </w:pPr>
+      <w:rPr>
+        <w:rFonts w:ascii="Wingdings" w:hAnsi="Wingdings" w:hint="default"/>
+      </w:rPr>
+    </w:lvl>
+  </w:abstractNum>
+  <w:abstractNum w:abstractNumId="1" w15:restartNumberingAfterBreak="0">
+    <w:nsid w:val="272C0E6A"/>
+    <w:multiLevelType w:val="hybridMultilevel"/>
+    <w:tmpl w:val="6C10104A"/>
+    <w:lvl w:ilvl="0" w:tplc="04160001">
+      <w:start w:val="1"/>
+      <w:numFmt w:val="bullet"/>
+      <w:lvlText w:val=""/>
+      <w:lvlJc w:val="left"/>
+      <w:pPr>
+        <w:ind w:left="3600" w:hanging="360"/>
+      </w:pPr>
+      <w:rPr>
+        <w:rFonts w:ascii="Symbol" w:hAnsi="Symbol" w:hint="default"/>
+      </w:rPr>
+    </w:lvl>
+    <w:lvl w:ilvl="1" w:tplc="04160003" w:tentative="1">
+      <w:start w:val="1"/>
+      <w:numFmt w:val="bullet"/>
+      <w:lvlText w:val="o"/>
+      <w:lvlJc w:val="left"/>
+      <w:pPr>
+        <w:ind w:left="4320" w:hanging="360"/>
+      </w:pPr>
+      <w:rPr>
+        <w:rFonts w:ascii="Courier New" w:hAnsi="Courier New" w:cs="Courier New" w:hint="default"/>
+      </w:rPr>
+    </w:lvl>
+    <w:lvl w:ilvl="2" w:tplc="04160005" w:tentative="1">
+      <w:start w:val="1"/>
+      <w:numFmt w:val="bullet"/>
+      <w:lvlText w:val=""/>
+      <w:lvlJc w:val="left"/>
+      <w:pPr>
+        <w:ind w:left="5040" w:hanging="360"/>
+      </w:pPr>
+      <w:rPr>
+        <w:rFonts w:ascii="Wingdings" w:hAnsi="Wingdings" w:hint="default"/>
+      </w:rPr>
+    </w:lvl>
+    <w:lvl w:ilvl="3" w:tplc="04160001" w:tentative="1">
+      <w:start w:val="1"/>
+      <w:numFmt w:val="bullet"/>
+      <w:lvlText w:val=""/>
+      <w:lvlJc w:val="left"/>
+      <w:pPr>
+        <w:ind w:left="5760" w:hanging="360"/>
+      </w:pPr>
+      <w:rPr>
+        <w:rFonts w:ascii="Symbol" w:hAnsi="Symbol" w:hint="default"/>
+      </w:rPr>
+    </w:lvl>
+    <w:lvl w:ilvl="4" w:tplc="04160003" w:tentative="1">
+      <w:start w:val="1"/>
+      <w:numFmt w:val="bullet"/>
+      <w:lvlText w:val="o"/>
+      <w:lvlJc w:val="left"/>
+      <w:pPr>
+        <w:ind w:left="6480" w:hanging="360"/>
+      </w:pPr>
+      <w:rPr>
+        <w:rFonts w:ascii="Courier New" w:hAnsi="Courier New" w:cs="Courier New" w:hint="default"/>
+      </w:rPr>
+    </w:lvl>
+    <w:lvl w:ilvl="5" w:tplc="04160005" w:tentative="1">
+      <w:start w:val="1"/>
+      <w:numFmt w:val="bullet"/>
+      <w:lvlText w:val=""/>
+      <w:lvlJc w:val="left"/>
+      <w:pPr>
+        <w:ind w:left="7200" w:hanging="360"/>
+      </w:pPr>
+      <w:rPr>
+        <w:rFonts w:ascii="Wingdings" w:hAnsi="Wingdings" w:hint="default"/>
+      </w:rPr>
+    </w:lvl>
+    <w:lvl w:ilvl="6" w:tplc="04160001" w:tentative="1">
+      <w:start w:val="1"/>
+      <w:numFmt w:val="bullet"/>
+      <w:lvlText w:val=""/>
+      <w:lvlJc w:val="left"/>
+      <w:pPr>
+        <w:ind w:left="7920" w:hanging="360"/>
+      </w:pPr>
+      <w:rPr>
+        <w:rFonts w:ascii="Symbol" w:hAnsi="Symbol" w:hint="default"/>
+      </w:rPr>
+    </w:lvl>
+    <w:lvl w:ilvl="7" w:tplc="04160003" w:tentative="1">
+      <w:start w:val="1"/>
+      <w:numFmt w:val="bullet"/>
+      <w:lvlText w:val="o"/>
+      <w:lvlJc w:val="left"/>
+      <w:pPr>
+        <w:ind w:left="8640" w:hanging="360"/>
+      </w:pPr>
+      <w:rPr>
+        <w:rFonts w:ascii="Courier New" w:hAnsi="Courier New" w:cs="Courier New" w:hint="default"/>
+      </w:rPr>
+    </w:lvl>
+    <w:lvl w:ilvl="8" w:tplc="04160005" w:tentative="1">
+      <w:start w:val="1"/>
+      <w:numFmt w:val="bullet"/>
+      <w:lvlText w:val=""/>
+      <w:lvlJc w:val="left"/>
+      <w:pPr>
+        <w:ind w:left="9360" w:hanging="360"/>
+      </w:pPr>
+      <w:rPr>
+        <w:rFonts w:ascii="Wingdings" w:hAnsi="Wingdings" w:hint="default"/>
+      </w:rPr>
+    </w:lvl>
+  </w:abstractNum>
+  <w:abstractNum w:abstractNumId="2" w15:restartNumberingAfterBreak="0">
+    <w:nsid w:val="3DBF1ABA"/>
+    <w:multiLevelType w:val="hybridMultilevel"/>
+    <w:tmpl w:val="F544D0E0"/>
+    <w:lvl w:ilvl="0" w:tplc="04160001">
+      <w:start w:val="1"/>
+      <w:numFmt w:val="bullet"/>
+      <w:lvlText w:val=""/>
+      <w:lvlJc w:val="left"/>
+      <w:pPr>
+        <w:ind w:left="6480" w:hanging="360"/>
+      </w:pPr>
+      <w:rPr>
+        <w:rFonts w:ascii="Symbol" w:hAnsi="Symbol" w:hint="default"/>
+      </w:rPr>
+    </w:lvl>
+    <w:lvl w:ilvl="1" w:tplc="04160003" w:tentative="1">
+      <w:start w:val="1"/>
+      <w:numFmt w:val="bullet"/>
+      <w:lvlText w:val="o"/>
+      <w:lvlJc w:val="left"/>
+      <w:pPr>
+        <w:ind w:left="7200" w:hanging="360"/>
+      </w:pPr>
+      <w:rPr>
+        <w:rFonts w:ascii="Courier New" w:hAnsi="Courier New" w:cs="Courier New" w:hint="default"/>
+      </w:rPr>
+    </w:lvl>
+    <w:lvl w:ilvl="2" w:tplc="04160005" w:tentative="1">
+      <w:start w:val="1"/>
+      <w:numFmt w:val="bullet"/>
+      <w:lvlText w:val=""/>
+      <w:lvlJc w:val="left"/>
+      <w:pPr>
+        <w:ind w:left="7920" w:hanging="360"/>
+      </w:pPr>
+      <w:rPr>
+        <w:rFonts w:ascii="Wingdings" w:hAnsi="Wingdings" w:hint="default"/>
+      </w:rPr>
+    </w:lvl>
+    <w:lvl w:ilvl="3" w:tplc="04160001" w:tentative="1">
+      <w:start w:val="1"/>
+      <w:numFmt w:val="bullet"/>
+      <w:lvlText w:val=""/>
+      <w:lvlJc w:val="left"/>
+      <w:pPr>
+        <w:ind w:left="8640" w:hanging="360"/>
+      </w:pPr>
+      <w:rPr>
+        <w:rFonts w:ascii="Symbol" w:hAnsi="Symbol" w:hint="default"/>
+      </w:rPr>
+    </w:lvl>
+    <w:lvl w:ilvl="4" w:tplc="04160003" w:tentative="1">
+      <w:start w:val="1"/>
+      <w:numFmt w:val="bullet"/>
+      <w:lvlText w:val="o"/>
+      <w:lvlJc w:val="left"/>
+      <w:pPr>
+        <w:ind w:left="9360" w:hanging="360"/>
+      </w:pPr>
+      <w:rPr>
+        <w:rFonts w:ascii="Courier New" w:hAnsi="Courier New" w:cs="Courier New" w:hint="default"/>
+      </w:rPr>
+    </w:lvl>
+    <w:lvl w:ilvl="5" w:tplc="04160005" w:tentative="1">
+      <w:start w:val="1"/>
+      <w:numFmt w:val="bullet"/>
+      <w:lvlText w:val=""/>
+      <w:lvlJc w:val="left"/>
+      <w:pPr>
+        <w:ind w:left="10080" w:hanging="360"/>
+      </w:pPr>
+      <w:rPr>
+        <w:rFonts w:ascii="Wingdings" w:hAnsi="Wingdings" w:hint="default"/>
+      </w:rPr>
+    </w:lvl>
+    <w:lvl w:ilvl="6" w:tplc="04160001" w:tentative="1">
+      <w:start w:val="1"/>
+      <w:numFmt w:val="bullet"/>
+      <w:lvlText w:val=""/>
+      <w:lvlJc w:val="left"/>
+      <w:pPr>
+        <w:ind w:left="10800" w:hanging="360"/>
+      </w:pPr>
+      <w:rPr>
+        <w:rFonts w:ascii="Symbol" w:hAnsi="Symbol" w:hint="default"/>
+      </w:rPr>
+    </w:lvl>
+    <w:lvl w:ilvl="7" w:tplc="04160003" w:tentative="1">
+      <w:start w:val="1"/>
+      <w:numFmt w:val="bullet"/>
+      <w:lvlText w:val="o"/>
+      <w:lvlJc w:val="left"/>
+      <w:pPr>
+        <w:ind w:left="11520" w:hanging="360"/>
+      </w:pPr>
+      <w:rPr>
+        <w:rFonts w:ascii="Courier New" w:hAnsi="Courier New" w:cs="Courier New" w:hint="default"/>
+      </w:rPr>
+    </w:lvl>
+    <w:lvl w:ilvl="8" w:tplc="04160005" w:tentative="1">
+      <w:start w:val="1"/>
+      <w:numFmt w:val="bullet"/>
+      <w:lvlText w:val=""/>
+      <w:lvlJc w:val="left"/>
+      <w:pPr>
+        <w:ind w:left="12240" w:hanging="360"/>
+      </w:pPr>
+      <w:rPr>
+        <w:rFonts w:ascii="Wingdings" w:hAnsi="Wingdings" w:hint="default"/>
+      </w:rPr>
+    </w:lvl>
+  </w:abstractNum>
+  <w:abstractNum w:abstractNumId="3" w15:restartNumberingAfterBreak="0">
+    <w:nsid w:val="4B5707C9"/>
+    <w:multiLevelType w:val="hybridMultilevel"/>
+    <w:tmpl w:val="A64C2126"/>
+    <w:lvl w:ilvl="0" w:tplc="0416000F">
+      <w:start w:val="1"/>
+      <w:numFmt w:val="decimal"/>
+      <w:lvlText w:val="%1."/>
+      <w:lvlJc w:val="left"/>
+      <w:pPr>
+        <w:ind w:left="6480" w:hanging="360"/>
+      </w:pPr>
+    </w:lvl>
+    <w:lvl w:ilvl="1" w:tplc="04160019" w:tentative="1">
+      <w:start w:val="1"/>
+      <w:numFmt w:val="lowerLetter"/>
+      <w:lvlText w:val="%2."/>
+      <w:lvlJc w:val="left"/>
+      <w:pPr>
+        <w:ind w:left="7200" w:hanging="360"/>
+      </w:pPr>
+    </w:lvl>
+    <w:lvl w:ilvl="2" w:tplc="0416001B" w:tentative="1">
+      <w:start w:val="1"/>
+      <w:numFmt w:val="lowerRoman"/>
+      <w:lvlText w:val="%3."/>
+      <w:lvlJc w:val="right"/>
+      <w:pPr>
+        <w:ind w:left="7920" w:hanging="180"/>
+      </w:pPr>
+    </w:lvl>
+    <w:lvl w:ilvl="3" w:tplc="0416000F" w:tentative="1">
+      <w:start w:val="1"/>
+      <w:numFmt w:val="decimal"/>
+      <w:lvlText w:val="%4."/>
+      <w:lvlJc w:val="left"/>
+      <w:pPr>
+        <w:ind w:left="8640" w:hanging="360"/>
+      </w:pPr>
+    </w:lvl>
+    <w:lvl w:ilvl="4" w:tplc="04160019" w:tentative="1">
+      <w:start w:val="1"/>
+      <w:numFmt w:val="lowerLetter"/>
+      <w:lvlText w:val="%5."/>
+      <w:lvlJc w:val="left"/>
+      <w:pPr>
+        <w:ind w:left="9360" w:hanging="360"/>
+      </w:pPr>
+    </w:lvl>
+    <w:lvl w:ilvl="5" w:tplc="0416001B" w:tentative="1">
+      <w:start w:val="1"/>
+      <w:numFmt w:val="lowerRoman"/>
+      <w:lvlText w:val="%6."/>
+      <w:lvlJc w:val="right"/>
+      <w:pPr>
+        <w:ind w:left="10080" w:hanging="180"/>
+      </w:pPr>
+    </w:lvl>
+    <w:lvl w:ilvl="6" w:tplc="0416000F" w:tentative="1">
+      <w:start w:val="1"/>
+      <w:numFmt w:val="decimal"/>
+      <w:lvlText w:val="%7."/>
+      <w:lvlJc w:val="left"/>
+      <w:pPr>
+        <w:ind w:left="10800" w:hanging="360"/>
+      </w:pPr>
+    </w:lvl>
+    <w:lvl w:ilvl="7" w:tplc="04160019" w:tentative="1">
+      <w:start w:val="1"/>
+      <w:numFmt w:val="lowerLetter"/>
+      <w:lvlText w:val="%8."/>
+      <w:lvlJc w:val="left"/>
+      <w:pPr>
+        <w:ind w:left="11520" w:hanging="360"/>
+      </w:pPr>
+    </w:lvl>
+    <w:lvl w:ilvl="8" w:tplc="0416001B" w:tentative="1">
+      <w:start w:val="1"/>
+      <w:numFmt w:val="lowerRoman"/>
+      <w:lvlText w:val="%9."/>
+      <w:lvlJc w:val="right"/>
+      <w:pPr>
+        <w:ind w:left="12240" w:hanging="180"/>
+      </w:pPr>
+    </w:lvl>
+  </w:abstractNum>
+  <w:abstractNum w:abstractNumId="4" w15:restartNumberingAfterBreak="0">
+    <w:nsid w:val="5A7B769C"/>
+    <w:multiLevelType w:val="hybridMultilevel"/>
+    <w:tmpl w:val="4576260C"/>
+    <w:lvl w:ilvl="0" w:tplc="04160001">
+      <w:start w:val="1"/>
+      <w:numFmt w:val="bullet"/>
+      <w:lvlText w:val=""/>
+      <w:lvlJc w:val="left"/>
+      <w:pPr>
+        <w:ind w:left="1430" w:hanging="360"/>
+      </w:pPr>
+      <w:rPr>
+        <w:rFonts w:ascii="Symbol" w:hAnsi="Symbol" w:hint="default"/>
+      </w:rPr>
+    </w:lvl>
+    <w:lvl w:ilvl="1" w:tplc="04160003" w:tentative="1">
+      <w:start w:val="1"/>
+      <w:numFmt w:val="bullet"/>
+      <w:lvlText w:val="o"/>
+      <w:lvlJc w:val="left"/>
+      <w:pPr>
+        <w:ind w:left="2150" w:hanging="360"/>
+      </w:pPr>
+      <w:rPr>
+        <w:rFonts w:ascii="Courier New" w:hAnsi="Courier New" w:cs="Courier New" w:hint="default"/>
+      </w:rPr>
+    </w:lvl>
+    <w:lvl w:ilvl="2" w:tplc="04160005" w:tentative="1">
+      <w:start w:val="1"/>
+      <w:numFmt w:val="bullet"/>
+      <w:lvlText w:val=""/>
+      <w:lvlJc w:val="left"/>
+      <w:pPr>
+        <w:ind w:left="2870" w:hanging="360"/>
+      </w:pPr>
+      <w:rPr>
+        <w:rFonts w:ascii="Wingdings" w:hAnsi="Wingdings" w:hint="default"/>
+      </w:rPr>
+    </w:lvl>
+    <w:lvl w:ilvl="3" w:tplc="04160001" w:tentative="1">
+      <w:start w:val="1"/>
+      <w:numFmt w:val="bullet"/>
+      <w:lvlText w:val=""/>
+      <w:lvlJc w:val="left"/>
+      <w:pPr>
+        <w:ind w:left="3590" w:hanging="360"/>
+      </w:pPr>
+      <w:rPr>
+        <w:rFonts w:ascii="Symbol" w:hAnsi="Symbol" w:hint="default"/>
+      </w:rPr>
+    </w:lvl>
+    <w:lvl w:ilvl="4" w:tplc="04160003" w:tentative="1">
+      <w:start w:val="1"/>
+      <w:numFmt w:val="bullet"/>
+      <w:lvlText w:val="o"/>
+      <w:lvlJc w:val="left"/>
+      <w:pPr>
+        <w:ind w:left="4310" w:hanging="360"/>
+      </w:pPr>
+      <w:rPr>
+        <w:rFonts w:ascii="Courier New" w:hAnsi="Courier New" w:cs="Courier New" w:hint="default"/>
+      </w:rPr>
+    </w:lvl>
+    <w:lvl w:ilvl="5" w:tplc="04160005" w:tentative="1">
+      <w:start w:val="1"/>
+      <w:numFmt w:val="bullet"/>
+      <w:lvlText w:val=""/>
+      <w:lvlJc w:val="left"/>
+      <w:pPr>
+        <w:ind w:left="5030" w:hanging="360"/>
+      </w:pPr>
+      <w:rPr>
+        <w:rFonts w:ascii="Wingdings" w:hAnsi="Wingdings" w:hint="default"/>
+      </w:rPr>
+    </w:lvl>
+    <w:lvl w:ilvl="6" w:tplc="04160001" w:tentative="1">
+      <w:start w:val="1"/>
+      <w:numFmt w:val="bullet"/>
+      <w:lvlText w:val=""/>
+      <w:lvlJc w:val="left"/>
+      <w:pPr>
+        <w:ind w:left="5750" w:hanging="360"/>
+      </w:pPr>
+      <w:rPr>
+        <w:rFonts w:ascii="Symbol" w:hAnsi="Symbol" w:hint="default"/>
+      </w:rPr>
+    </w:lvl>
+    <w:lvl w:ilvl="7" w:tplc="04160003" w:tentative="1">
+      <w:start w:val="1"/>
+      <w:numFmt w:val="bullet"/>
+      <w:lvlText w:val="o"/>
+      <w:lvlJc w:val="left"/>
+      <w:pPr>
+        <w:ind w:left="6470" w:hanging="360"/>
+      </w:pPr>
+      <w:rPr>
+        <w:rFonts w:ascii="Courier New" w:hAnsi="Courier New" w:cs="Courier New" w:hint="default"/>
+      </w:rPr>
+    </w:lvl>
+    <w:lvl w:ilvl="8" w:tplc="04160005" w:tentative="1">
+      <w:start w:val="1"/>
+      <w:numFmt w:val="bullet"/>
+      <w:lvlText w:val=""/>
+      <w:lvlJc w:val="left"/>
+      <w:pPr>
+        <w:ind w:left="7190" w:hanging="360"/>
+      </w:pPr>
+      <w:rPr>
+        <w:rFonts w:ascii="Wingdings" w:hAnsi="Wingdings" w:hint="default"/>
+      </w:rPr>
+    </w:lvl>
+  </w:abstractNum>
+  <w:abstractNum w:abstractNumId="5" w15:restartNumberingAfterBreak="0">
+    <w:nsid w:val="5C0C737E"/>
+    <w:multiLevelType w:val="multilevel"/>
+    <w:tmpl w:val="D3DC257C"/>
+    <w:lvl w:ilvl="0">
+      <w:start w:val="1"/>
+      <w:numFmt w:val="bullet"/>
+      <w:lvlText w:val=""/>
+      <w:lvlJc w:val="left"/>
+      <w:pPr>
+        <w:tabs>
+          <w:tab w:val="num" w:pos="720"/>
+        </w:tabs>
+        <w:ind w:left="720" w:hanging="360"/>
+      </w:pPr>
+      <w:rPr>
+        <w:rFonts w:ascii="Symbol" w:hAnsi="Symbol" w:hint="default"/>
+        <w:sz w:val="20"/>
+      </w:rPr>
+    </w:lvl>
+    <w:lvl w:ilvl="1" w:tentative="1">
+      <w:start w:val="1"/>
+      <w:numFmt w:val="bullet"/>
+      <w:lvlText w:val="o"/>
+      <w:lvlJc w:val="left"/>
+      <w:pPr>
+        <w:tabs>
+          <w:tab w:val="num" w:pos="1440"/>
+        </w:tabs>
+        <w:ind w:left="1440" w:hanging="360"/>
+      </w:pPr>
+      <w:rPr>
+        <w:rFonts w:ascii="Courier New" w:hAnsi="Courier New" w:hint="default"/>
+        <w:sz w:val="20"/>
+      </w:rPr>
+    </w:lvl>
+    <w:lvl w:ilvl="2" w:tentative="1">
+      <w:start w:val="1"/>
+      <w:numFmt w:val="bullet"/>
+      <w:lvlText w:val=""/>
+      <w:lvlJc w:val="left"/>
+      <w:pPr>
+        <w:tabs>
+          <w:tab w:val="num" w:pos="2160"/>
+        </w:tabs>
+        <w:ind w:left="2160" w:hanging="360"/>
+      </w:pPr>
+      <w:rPr>
+        <w:rFonts w:ascii="Wingdings" w:hAnsi="Wingdings" w:hint="default"/>
+        <w:sz w:val="20"/>
+      </w:rPr>
+    </w:lvl>
+    <w:lvl w:ilvl="3" w:tentative="1">
+      <w:start w:val="1"/>
+      <w:numFmt w:val="bullet"/>
+      <w:lvlText w:val=""/>
+      <w:lvlJc w:val="left"/>
+      <w:pPr>
+        <w:tabs>
+          <w:tab w:val="num" w:pos="2880"/>
+        </w:tabs>
+        <w:ind w:left="2880" w:hanging="360"/>
+      </w:pPr>
+      <w:rPr>
+        <w:rFonts w:ascii="Wingdings" w:hAnsi="Wingdings" w:hint="default"/>
+        <w:sz w:val="20"/>
+      </w:rPr>
+    </w:lvl>
+    <w:lvl w:ilvl="4" w:tentative="1">
+      <w:start w:val="1"/>
+      <w:numFmt w:val="bullet"/>
+      <w:lvlText w:val=""/>
+      <w:lvlJc w:val="left"/>
+      <w:pPr>
+        <w:tabs>
+          <w:tab w:val="num" w:pos="3600"/>
+        </w:tabs>
+        <w:ind w:left="3600" w:hanging="360"/>
+      </w:pPr>
+      <w:rPr>
+        <w:rFonts w:ascii="Wingdings" w:hAnsi="Wingdings" w:hint="default"/>
+        <w:sz w:val="20"/>
+      </w:rPr>
+    </w:lvl>
+    <w:lvl w:ilvl="5" w:tentative="1">
+      <w:start w:val="1"/>
+      <w:numFmt w:val="bullet"/>
+      <w:lvlText w:val=""/>
+      <w:lvlJc w:val="left"/>
+      <w:pPr>
+        <w:tabs>
+          <w:tab w:val="num" w:pos="4320"/>
+        </w:tabs>
+        <w:ind w:left="4320" w:hanging="360"/>
+      </w:pPr>
+      <w:rPr>
+        <w:rFonts w:ascii="Wingdings" w:hAnsi="Wingdings" w:hint="default"/>
+        <w:sz w:val="20"/>
+      </w:rPr>
+    </w:lvl>
+    <w:lvl w:ilvl="6" w:tentative="1">
+      <w:start w:val="1"/>
+      <w:numFmt w:val="bullet"/>
+      <w:lvlText w:val=""/>
+      <w:lvlJc w:val="left"/>
+      <w:pPr>
+        <w:tabs>
+          <w:tab w:val="num" w:pos="5040"/>
+        </w:tabs>
+        <w:ind w:left="5040" w:hanging="360"/>
+      </w:pPr>
+      <w:rPr>
+        <w:rFonts w:ascii="Wingdings" w:hAnsi="Wingdings" w:hint="default"/>
+        <w:sz w:val="20"/>
+      </w:rPr>
+    </w:lvl>
+    <w:lvl w:ilvl="7" w:tentative="1">
+      <w:start w:val="1"/>
+      <w:numFmt w:val="bullet"/>
+      <w:lvlText w:val=""/>
+      <w:lvlJc w:val="left"/>
+      <w:pPr>
+        <w:tabs>
+          <w:tab w:val="num" w:pos="5760"/>
+        </w:tabs>
+        <w:ind w:left="5760" w:hanging="360"/>
+      </w:pPr>
+      <w:rPr>
+        <w:rFonts w:ascii="Wingdings" w:hAnsi="Wingdings" w:hint="default"/>
+        <w:sz w:val="20"/>
+      </w:rPr>
+    </w:lvl>
+    <w:lvl w:ilvl="8" w:tentative="1">
+      <w:start w:val="1"/>
+      <w:numFmt w:val="bullet"/>
+      <w:lvlText w:val=""/>
+      <w:lvlJc w:val="left"/>
+      <w:pPr>
+        <w:tabs>
+          <w:tab w:val="num" w:pos="6480"/>
+        </w:tabs>
+        <w:ind w:left="6480" w:hanging="360"/>
+      </w:pPr>
+      <w:rPr>
+        <w:rFonts w:ascii="Wingdings" w:hAnsi="Wingdings" w:hint="default"/>
+        <w:sz w:val="20"/>
+      </w:rPr>
+    </w:lvl>
+  </w:abstractNum>
+  <w:abstractNum w:abstractNumId="6" w15:restartNumberingAfterBreak="0">
+    <w:nsid w:val="5DFA1C62"/>
+    <w:multiLevelType w:val="hybridMultilevel"/>
+    <w:tmpl w:val="14345D90"/>
+    <w:lvl w:ilvl="0" w:tplc="04160001">
+      <w:start w:val="1"/>
+      <w:numFmt w:val="bullet"/>
+      <w:lvlText w:val=""/>
+      <w:lvlJc w:val="left"/>
+      <w:pPr>
+        <w:ind w:left="3600" w:hanging="360"/>
+      </w:pPr>
+      <w:rPr>
+        <w:rFonts w:ascii="Symbol" w:hAnsi="Symbol" w:hint="default"/>
+      </w:rPr>
+    </w:lvl>
+    <w:lvl w:ilvl="1" w:tplc="04160003" w:tentative="1">
+      <w:start w:val="1"/>
+      <w:numFmt w:val="bullet"/>
+      <w:lvlText w:val="o"/>
+      <w:lvlJc w:val="left"/>
+      <w:pPr>
+        <w:ind w:left="4320" w:hanging="360"/>
+      </w:pPr>
+      <w:rPr>
+        <w:rFonts w:ascii="Courier New" w:hAnsi="Courier New" w:cs="Courier New" w:hint="default"/>
+      </w:rPr>
+    </w:lvl>
+    <w:lvl w:ilvl="2" w:tplc="04160005" w:tentative="1">
+      <w:start w:val="1"/>
+      <w:numFmt w:val="bullet"/>
+      <w:lvlText w:val=""/>
+      <w:lvlJc w:val="left"/>
+      <w:pPr>
+        <w:ind w:left="5040" w:hanging="360"/>
+      </w:pPr>
+      <w:rPr>
+        <w:rFonts w:ascii="Wingdings" w:hAnsi="Wingdings" w:hint="default"/>
+      </w:rPr>
+    </w:lvl>
+    <w:lvl w:ilvl="3" w:tplc="04160001" w:tentative="1">
+      <w:start w:val="1"/>
+      <w:numFmt w:val="bullet"/>
+      <w:lvlText w:val=""/>
+      <w:lvlJc w:val="left"/>
+      <w:pPr>
+        <w:ind w:left="5760" w:hanging="360"/>
+      </w:pPr>
+      <w:rPr>
+        <w:rFonts w:ascii="Symbol" w:hAnsi="Symbol" w:hint="default"/>
+      </w:rPr>
+    </w:lvl>
+    <w:lvl w:ilvl="4" w:tplc="04160003" w:tentative="1">
+      <w:start w:val="1"/>
+      <w:numFmt w:val="bullet"/>
+      <w:lvlText w:val="o"/>
+      <w:lvlJc w:val="left"/>
+      <w:pPr>
+        <w:ind w:left="6480" w:hanging="360"/>
+      </w:pPr>
+      <w:rPr>
+        <w:rFonts w:ascii="Courier New" w:hAnsi="Courier New" w:cs="Courier New" w:hint="default"/>
+      </w:rPr>
+    </w:lvl>
+    <w:lvl w:ilvl="5" w:tplc="04160005" w:tentative="1">
+      <w:start w:val="1"/>
+      <w:numFmt w:val="bullet"/>
+      <w:lvlText w:val=""/>
+      <w:lvlJc w:val="left"/>
+      <w:pPr>
+        <w:ind w:left="7200" w:hanging="360"/>
+      </w:pPr>
+      <w:rPr>
+        <w:rFonts w:ascii="Wingdings" w:hAnsi="Wingdings" w:hint="default"/>
+      </w:rPr>
+    </w:lvl>
+    <w:lvl w:ilvl="6" w:tplc="04160001" w:tentative="1">
+      <w:start w:val="1"/>
+      <w:numFmt w:val="bullet"/>
+      <w:lvlText w:val=""/>
+      <w:lvlJc w:val="left"/>
+      <w:pPr>
+        <w:ind w:left="7920" w:hanging="360"/>
+      </w:pPr>
+      <w:rPr>
+        <w:rFonts w:ascii="Symbol" w:hAnsi="Symbol" w:hint="default"/>
+      </w:rPr>
+    </w:lvl>
+    <w:lvl w:ilvl="7" w:tplc="04160003" w:tentative="1">
+      <w:start w:val="1"/>
+      <w:numFmt w:val="bullet"/>
+      <w:lvlText w:val="o"/>
+      <w:lvlJc w:val="left"/>
+      <w:pPr>
+        <w:ind w:left="8640" w:hanging="360"/>
+      </w:pPr>
+      <w:rPr>
+        <w:rFonts w:ascii="Courier New" w:hAnsi="Courier New" w:cs="Courier New" w:hint="default"/>
+      </w:rPr>
+    </w:lvl>
+    <w:lvl w:ilvl="8" w:tplc="04160005" w:tentative="1">
+      <w:start w:val="1"/>
+      <w:numFmt w:val="bullet"/>
+      <w:lvlText w:val=""/>
+      <w:lvlJc w:val="left"/>
+      <w:pPr>
+        <w:ind w:left="9360" w:hanging="360"/>
+      </w:pPr>
+      <w:rPr>
+        <w:rFonts w:ascii="Wingdings" w:hAnsi="Wingdings" w:hint="default"/>
+      </w:rPr>
+    </w:lvl>
+  </w:abstractNum>
+  <w:abstractNum w:abstractNumId="7" w15:restartNumberingAfterBreak="0">
+    <w:nsid w:val="632256CD"/>
+    <w:multiLevelType w:val="hybridMultilevel"/>
+    <w:tmpl w:val="A11E6AB2"/>
+    <w:lvl w:ilvl="0" w:tplc="04160001">
+      <w:start w:val="1"/>
+      <w:numFmt w:val="bullet"/>
+      <w:lvlText w:val=""/>
+      <w:lvlJc w:val="left"/>
+      <w:pPr>
+        <w:ind w:left="1430" w:hanging="360"/>
+      </w:pPr>
+      <w:rPr>
+        <w:rFonts w:ascii="Symbol" w:hAnsi="Symbol" w:hint="default"/>
+      </w:rPr>
+    </w:lvl>
+    <w:lvl w:ilvl="1" w:tplc="04160003" w:tentative="1">
+      <w:start w:val="1"/>
+      <w:numFmt w:val="bullet"/>
+      <w:lvlText w:val="o"/>
+      <w:lvlJc w:val="left"/>
+      <w:pPr>
+        <w:ind w:left="2150" w:hanging="360"/>
+      </w:pPr>
+      <w:rPr>
+        <w:rFonts w:ascii="Courier New" w:hAnsi="Courier New" w:cs="Courier New" w:hint="default"/>
+      </w:rPr>
+    </w:lvl>
+    <w:lvl w:ilvl="2" w:tplc="04160005" w:tentative="1">
+      <w:start w:val="1"/>
+      <w:numFmt w:val="bullet"/>
+      <w:lvlText w:val=""/>
+      <w:lvlJc w:val="left"/>
+      <w:pPr>
+        <w:ind w:left="2870" w:hanging="360"/>
+      </w:pPr>
+      <w:rPr>
+        <w:rFonts w:ascii="Wingdings" w:hAnsi="Wingdings" w:hint="default"/>
+      </w:rPr>
+    </w:lvl>
+    <w:lvl w:ilvl="3" w:tplc="04160001" w:tentative="1">
+      <w:start w:val="1"/>
+      <w:numFmt w:val="bullet"/>
+      <w:lvlText w:val=""/>
+      <w:lvlJc w:val="left"/>
+      <w:pPr>
+        <w:ind w:left="3590" w:hanging="360"/>
+      </w:pPr>
+      <w:rPr>
+        <w:rFonts w:ascii="Symbol" w:hAnsi="Symbol" w:hint="default"/>
+      </w:rPr>
+    </w:lvl>
+    <w:lvl w:ilvl="4" w:tplc="04160003" w:tentative="1">
+      <w:start w:val="1"/>
+      <w:numFmt w:val="bullet"/>
+      <w:lvlText w:val="o"/>
+      <w:lvlJc w:val="left"/>
+      <w:pPr>
+        <w:ind w:left="4310" w:hanging="360"/>
+      </w:pPr>
+      <w:rPr>
+        <w:rFonts w:ascii="Courier New" w:hAnsi="Courier New" w:cs="Courier New" w:hint="default"/>
+      </w:rPr>
+    </w:lvl>
+    <w:lvl w:ilvl="5" w:tplc="04160005" w:tentative="1">
+      <w:start w:val="1"/>
+      <w:numFmt w:val="bullet"/>
+      <w:lvlText w:val=""/>
+      <w:lvlJc w:val="left"/>
+      <w:pPr>
+        <w:ind w:left="5030" w:hanging="360"/>
+      </w:pPr>
+      <w:rPr>
+        <w:rFonts w:ascii="Wingdings" w:hAnsi="Wingdings" w:hint="default"/>
+      </w:rPr>
+    </w:lvl>
+    <w:lvl w:ilvl="6" w:tplc="04160001" w:tentative="1">
+      <w:start w:val="1"/>
+      <w:numFmt w:val="bullet"/>
+      <w:lvlText w:val=""/>
+      <w:lvlJc w:val="left"/>
+      <w:pPr>
+        <w:ind w:left="5750" w:hanging="360"/>
+      </w:pPr>
+      <w:rPr>
+        <w:rFonts w:ascii="Symbol" w:hAnsi="Symbol" w:hint="default"/>
+      </w:rPr>
+    </w:lvl>
+    <w:lvl w:ilvl="7" w:tplc="04160003" w:tentative="1">
+      <w:start w:val="1"/>
+      <w:numFmt w:val="bullet"/>
+      <w:lvlText w:val="o"/>
+      <w:lvlJc w:val="left"/>
+      <w:pPr>
+        <w:ind w:left="6470" w:hanging="360"/>
+      </w:pPr>
+      <w:rPr>
+        <w:rFonts w:ascii="Courier New" w:hAnsi="Courier New" w:cs="Courier New" w:hint="default"/>
+      </w:rPr>
+    </w:lvl>
+    <w:lvl w:ilvl="8" w:tplc="04160005" w:tentative="1">
+      <w:start w:val="1"/>
+      <w:numFmt w:val="bullet"/>
+      <w:lvlText w:val=""/>
+      <w:lvlJc w:val="left"/>
+      <w:pPr>
+        <w:ind w:left="7190" w:hanging="360"/>
+      </w:pPr>
+      <w:rPr>
+        <w:rFonts w:ascii="Wingdings" w:hAnsi="Wingdings" w:hint="default"/>
+      </w:rPr>
+    </w:lvl>
+  </w:abstractNum>
+  <w:abstractNum w:abstractNumId="8" w15:restartNumberingAfterBreak="0">
+    <w:nsid w:val="67FF678E"/>
+    <w:multiLevelType w:val="hybridMultilevel"/>
+    <w:tmpl w:val="E7FC5CAC"/>
+    <w:lvl w:ilvl="0" w:tplc="04160001">
+      <w:start w:val="1"/>
+      <w:numFmt w:val="bullet"/>
+      <w:lvlText w:val=""/>
+      <w:lvlJc w:val="left"/>
+      <w:pPr>
+        <w:ind w:left="1080" w:hanging="360"/>
+      </w:pPr>
+      <w:rPr>
+        <w:rFonts w:ascii="Symbol" w:hAnsi="Symbol" w:hint="default"/>
+      </w:rPr>
+    </w:lvl>
+    <w:lvl w:ilvl="1" w:tplc="04160003" w:tentative="1">
+      <w:start w:val="1"/>
+      <w:numFmt w:val="bullet"/>
+      <w:lvlText w:val="o"/>
+      <w:lvlJc w:val="left"/>
+      <w:pPr>
+        <w:ind w:left="1800" w:hanging="360"/>
+      </w:pPr>
+      <w:rPr>
+        <w:rFonts w:ascii="Courier New" w:hAnsi="Courier New" w:cs="Courier New" w:hint="default"/>
+      </w:rPr>
+    </w:lvl>
+    <w:lvl w:ilvl="2" w:tplc="04160005" w:tentative="1">
+      <w:start w:val="1"/>
+      <w:numFmt w:val="bullet"/>
+      <w:lvlText w:val=""/>
+      <w:lvlJc w:val="left"/>
+      <w:pPr>
+        <w:ind w:left="2520" w:hanging="360"/>
+      </w:pPr>
+      <w:rPr>
+        <w:rFonts w:ascii="Wingdings" w:hAnsi="Wingdings" w:hint="default"/>
+      </w:rPr>
+    </w:lvl>
+    <w:lvl w:ilvl="3" w:tplc="04160001" w:tentative="1">
+      <w:start w:val="1"/>
+      <w:numFmt w:val="bullet"/>
+      <w:lvlText w:val=""/>
+      <w:lvlJc w:val="left"/>
+      <w:pPr>
+        <w:ind w:left="3240" w:hanging="360"/>
+      </w:pPr>
+      <w:rPr>
+        <w:rFonts w:ascii="Symbol" w:hAnsi="Symbol" w:hint="default"/>
+      </w:rPr>
+    </w:lvl>
+    <w:lvl w:ilvl="4" w:tplc="04160003" w:tentative="1">
+      <w:start w:val="1"/>
+      <w:numFmt w:val="bullet"/>
+      <w:lvlText w:val="o"/>
+      <w:lvlJc w:val="left"/>
+      <w:pPr>
+        <w:ind w:left="3960" w:hanging="360"/>
+      </w:pPr>
+      <w:rPr>
+        <w:rFonts w:ascii="Courier New" w:hAnsi="Courier New" w:cs="Courier New" w:hint="default"/>
+      </w:rPr>
+    </w:lvl>
+    <w:lvl w:ilvl="5" w:tplc="04160005" w:tentative="1">
+      <w:start w:val="1"/>
+      <w:numFmt w:val="bullet"/>
+      <w:lvlText w:val=""/>
+      <w:lvlJc w:val="left"/>
+      <w:pPr>
+        <w:ind w:left="4680" w:hanging="360"/>
+      </w:pPr>
+      <w:rPr>
+        <w:rFonts w:ascii="Wingdings" w:hAnsi="Wingdings" w:hint="default"/>
+      </w:rPr>
+    </w:lvl>
+    <w:lvl w:ilvl="6" w:tplc="04160001" w:tentative="1">
+      <w:start w:val="1"/>
+      <w:numFmt w:val="bullet"/>
+      <w:lvlText w:val=""/>
+      <w:lvlJc w:val="left"/>
+      <w:pPr>
+        <w:ind w:left="5400" w:hanging="360"/>
+      </w:pPr>
+      <w:rPr>
+        <w:rFonts w:ascii="Symbol" w:hAnsi="Symbol" w:hint="default"/>
+      </w:rPr>
+    </w:lvl>
+    <w:lvl w:ilvl="7" w:tplc="04160003" w:tentative="1">
+      <w:start w:val="1"/>
+      <w:numFmt w:val="bullet"/>
+      <w:lvlText w:val="o"/>
+      <w:lvlJc w:val="left"/>
+      <w:pPr>
+        <w:ind w:left="6120" w:hanging="360"/>
+      </w:pPr>
+      <w:rPr>
+        <w:rFonts w:ascii="Courier New" w:hAnsi="Courier New" w:cs="Courier New" w:hint="default"/>
+      </w:rPr>
+    </w:lvl>
+    <w:lvl w:ilvl="8" w:tplc="04160005" w:tentative="1">
+      <w:start w:val="1"/>
+      <w:numFmt w:val="bullet"/>
+      <w:lvlText w:val=""/>
+      <w:lvlJc w:val="left"/>
+      <w:pPr>
+        <w:ind w:left="6840" w:hanging="360"/>
+      </w:pPr>
+      <w:rPr>
+        <w:rFonts w:ascii="Wingdings" w:hAnsi="Wingdings" w:hint="default"/>
+      </w:rPr>
+    </w:lvl>
+  </w:abstractNum>
+  <w:num w:numId="1" w16cid:durableId="1845120210">
+    <w:abstractNumId w:val="7"/>
+  </w:num>
+  <w:num w:numId="2" w16cid:durableId="1208224393">
+    <w:abstractNumId w:val="5"/>
+  </w:num>
+  <w:num w:numId="3" w16cid:durableId="1522545533">
+    <w:abstractNumId w:val="0"/>
+  </w:num>
+  <w:num w:numId="4" w16cid:durableId="1300649518">
+    <w:abstractNumId w:val="6"/>
+  </w:num>
+  <w:num w:numId="5" w16cid:durableId="1394237260">
+    <w:abstractNumId w:val="2"/>
+  </w:num>
+  <w:num w:numId="6" w16cid:durableId="1944221231">
+    <w:abstractNumId w:val="3"/>
+  </w:num>
+  <w:num w:numId="7" w16cid:durableId="1984657101">
+    <w:abstractNumId w:val="4"/>
+  </w:num>
+  <w:num w:numId="8" w16cid:durableId="1326395759">
+    <w:abstractNumId w:val="1"/>
+  </w:num>
+  <w:num w:numId="9" w16cid:durableId="818304017">
+    <w:abstractNumId w:val="8"/>
+  </w:num>
+</w:numbering>
 </file>
 
 <file path=word/styles.xml><?xml version="1.0" encoding="utf-8"?>
@@ -550,6 +3090,7 @@
   <w:style w:type="paragraph" w:default="1" w:styleId="Normal">
     <w:name w:val="Normal"/>
     <w:qFormat/>
+    <w:rsid w:val="004925AC"/>
   </w:style>
   <w:style w:type="paragraph" w:styleId="Ttulo1">
     <w:name w:val="heading 1"/>

</xml_diff>

<commit_message>
Dia a dia da pauta do projeto
</commit_message>
<xml_diff>
--- a/Pauta Claude.docx
+++ b/Pauta Claude.docx
@@ -44,15 +44,7 @@
         <w:t xml:space="preserve"> </w:t>
       </w:r>
       <w:r>
-        <w:t xml:space="preserve">Adicionado filtro de “Atualização”, onde teremos a possibilidade de organizar os leads pela ordem de atualização no </w:t>
-      </w:r>
-      <w:proofErr w:type="spellStart"/>
-      <w:r>
-        <w:t>Followize</w:t>
-      </w:r>
-      <w:proofErr w:type="spellEnd"/>
-      <w:r>
-        <w:t>, permitindo assim analisar os leads que estão mais tempo parado e os que foram atualizados.</w:t>
+        <w:t>Adicionado filtro de “Atualização”, onde teremos a possibilidade de organizar os leads pela ordem de atualização no Followize, permitindo assim analisar os leads que estão mais tempo parado e os que foram atualizados.</w:t>
       </w:r>
     </w:p>
     <w:p>
@@ -125,44 +117,8 @@
         <w:rPr>
           <w:rFonts w:ascii="Segoe UI Emoji" w:hAnsi="Segoe UI Emoji" w:cs="Segoe UI Emoji"/>
         </w:rPr>
-        <w:t xml:space="preserve"> Será importante analisar com Simone a atualização real do </w:t>
-      </w:r>
-      <w:proofErr w:type="spellStart"/>
-      <w:r>
-        <w:rPr>
-          <w:rFonts w:ascii="Segoe UI Emoji" w:hAnsi="Segoe UI Emoji" w:cs="Segoe UI Emoji"/>
-        </w:rPr>
-        <w:t>Followize</w:t>
-      </w:r>
-      <w:proofErr w:type="spellEnd"/>
-      <w:r>
-        <w:rPr>
-          <w:rFonts w:ascii="Segoe UI Emoji" w:hAnsi="Segoe UI Emoji" w:cs="Segoe UI Emoji"/>
-        </w:rPr>
-        <w:t xml:space="preserve"> das meninas, especialmente no tocante as vendas que são sinalizadas via Google </w:t>
-      </w:r>
-      <w:proofErr w:type="spellStart"/>
-      <w:r>
-        <w:rPr>
-          <w:rFonts w:ascii="Segoe UI Emoji" w:hAnsi="Segoe UI Emoji" w:cs="Segoe UI Emoji"/>
-        </w:rPr>
-        <w:t>Sheets</w:t>
-      </w:r>
-      <w:proofErr w:type="spellEnd"/>
-      <w:r>
-        <w:rPr>
-          <w:rFonts w:ascii="Segoe UI Emoji" w:hAnsi="Segoe UI Emoji" w:cs="Segoe UI Emoji"/>
-        </w:rPr>
-        <w:t xml:space="preserve"> no Grupo O2 </w:t>
-      </w:r>
-      <w:proofErr w:type="spellStart"/>
-      <w:r>
-        <w:rPr>
-          <w:rFonts w:ascii="Segoe UI Emoji" w:hAnsi="Segoe UI Emoji" w:cs="Segoe UI Emoji"/>
-        </w:rPr>
-        <w:t>Solution</w:t>
-      </w:r>
-      <w:proofErr w:type="spellEnd"/>
+        <w:t xml:space="preserve"> Será importante analisar com Simone a atualização real do Followize das meninas, especialmente no tocante as vendas que são sinalizadas via Google Sheets no Grupo O2 Solution</w:t>
+      </w:r>
       <w:r>
         <w:rPr>
           <w:rFonts w:ascii="Segoe UI Emoji" w:hAnsi="Segoe UI Emoji" w:cs="Segoe UI Emoji"/>
@@ -335,21 +291,7 @@
         <w:rPr>
           <w:rFonts w:ascii="Segoe UI Emoji" w:hAnsi="Segoe UI Emoji" w:cs="Segoe UI Emoji"/>
         </w:rPr>
-        <w:t xml:space="preserve"> Seria possível adicionarmos um menu lateral com submenus? </w:t>
-      </w:r>
-      <w:proofErr w:type="spellStart"/>
-      <w:r>
-        <w:rPr>
-          <w:rFonts w:ascii="Segoe UI Emoji" w:hAnsi="Segoe UI Emoji" w:cs="Segoe UI Emoji"/>
-        </w:rPr>
-        <w:t>Ex</w:t>
-      </w:r>
-      <w:proofErr w:type="spellEnd"/>
-      <w:r>
-        <w:rPr>
-          <w:rFonts w:ascii="Segoe UI Emoji" w:hAnsi="Segoe UI Emoji" w:cs="Segoe UI Emoji"/>
-        </w:rPr>
-        <w:t>:</w:t>
+        <w:t xml:space="preserve"> Seria possível adicionarmos um menu lateral com submenus? Ex:</w:t>
       </w:r>
     </w:p>
     <w:p>
@@ -602,21 +544,7 @@
         <w:rPr>
           <w:rFonts w:ascii="Segoe UI Emoji" w:hAnsi="Segoe UI Emoji" w:cs="Segoe UI Emoji"/>
         </w:rPr>
-        <w:t xml:space="preserve">referente a data de atualização e filtro da API. Mantive os 80 ou 90 dias da API apenas para o “funil de vendas”, uma vez que os leads entre </w:t>
-      </w:r>
-      <w:proofErr w:type="spellStart"/>
-      <w:r>
-        <w:rPr>
-          <w:rFonts w:ascii="Segoe UI Emoji" w:hAnsi="Segoe UI Emoji" w:cs="Segoe UI Emoji"/>
-        </w:rPr>
-        <w:t>Rayanna</w:t>
-      </w:r>
-      <w:proofErr w:type="spellEnd"/>
-      <w:r>
-        <w:rPr>
-          <w:rFonts w:ascii="Segoe UI Emoji" w:hAnsi="Segoe UI Emoji" w:cs="Segoe UI Emoji"/>
-        </w:rPr>
-        <w:t xml:space="preserve"> e Giovanna tem histórico longo.</w:t>
+        <w:t>referente a data de atualização e filtro da API. Mantive os 80 ou 90 dias da API apenas para o “funil de vendas”, uma vez que os leads entre Rayanna e Giovanna tem histórico longo.</w:t>
       </w:r>
       <w:r>
         <w:rPr>
@@ -717,16 +645,8 @@
         <w:rPr>
           <w:rFonts w:ascii="Segoe UI Emoji" w:hAnsi="Segoe UI Emoji" w:cs="Segoe UI Emoji"/>
         </w:rPr>
-        <w:t xml:space="preserve">Quadro de histórico – todas as informações cadastradas no </w:t>
-      </w:r>
-      <w:proofErr w:type="spellStart"/>
-      <w:r>
-        <w:rPr>
-          <w:rFonts w:ascii="Segoe UI Emoji" w:hAnsi="Segoe UI Emoji" w:cs="Segoe UI Emoji"/>
-        </w:rPr>
-        <w:t>Followize</w:t>
-      </w:r>
-      <w:proofErr w:type="spellEnd"/>
+        <w:t>Quadro de histórico – todas as informações cadastradas no Followize</w:t>
+      </w:r>
     </w:p>
     <w:p>
       <w:pPr>
@@ -924,6 +844,7 @@
           <w:rFonts w:ascii="Segoe UI Emoji" w:hAnsi="Segoe UI Emoji" w:cs="Segoe UI Emoji"/>
           <w:b/>
           <w:bCs/>
+          <w:highlight w:val="yellow"/>
         </w:rPr>
         <w:lastRenderedPageBreak/>
         <w:t>Pauta desenvolvimento – 12/05</w:t>
@@ -1617,6 +1538,1299 @@
     </w:p>
     <w:p>
       <w:pPr>
+        <w:ind w:left="2124"/>
+        <w:rPr>
+          <w:rFonts w:ascii="Segoe UI Emoji" w:hAnsi="Segoe UI Emoji" w:cs="Segoe UI Emoji"/>
+          <w:b/>
+          <w:bCs/>
+        </w:rPr>
+      </w:pPr>
+      <w:r>
+        <w:rPr>
+          <w:rFonts w:ascii="Segoe UI Emoji" w:hAnsi="Segoe UI Emoji" w:cs="Segoe UI Emoji"/>
+          <w:b/>
+          <w:bCs/>
+        </w:rPr>
+        <w:lastRenderedPageBreak/>
+        <w:t>Pauta desenvolvimento – 13/05</w:t>
+      </w:r>
+    </w:p>
+    <w:p>
+      <w:pPr>
+        <w:ind w:left="2124"/>
+        <w:rPr>
+          <w:rFonts w:ascii="Segoe UI Emoji" w:hAnsi="Segoe UI Emoji" w:cs="Segoe UI Emoji"/>
+          <w:b/>
+          <w:bCs/>
+        </w:rPr>
+      </w:pPr>
+    </w:p>
+    <w:p>
+      <w:pPr>
+        <w:numPr>
+          <w:ilvl w:val="0"/>
+          <w:numId w:val="10"/>
+        </w:numPr>
+        <w:rPr>
+          <w:rFonts w:ascii="Segoe UI Emoji" w:hAnsi="Segoe UI Emoji" w:cs="Segoe UI Emoji"/>
+        </w:rPr>
+      </w:pPr>
+      <w:r>
+        <w:rPr>
+          <w:rFonts w:ascii="Segoe UI Emoji" w:hAnsi="Segoe UI Emoji" w:cs="Segoe UI Emoji"/>
+          <w:b/>
+          <w:bCs/>
+        </w:rPr>
+        <w:t>Nova função modal_leads_status</w:t>
+      </w:r>
+      <w:r>
+        <w:rPr>
+          <w:rFonts w:ascii="Segoe UI Emoji" w:hAnsi="Segoe UI Emoji" w:cs="Segoe UI Emoji"/>
+        </w:rPr>
+        <w:t xml:space="preserve"> (decorada com @st.dialog) — abre um modal nativo do Streamlit com:</w:t>
+      </w:r>
+    </w:p>
+    <w:p>
+      <w:pPr>
+        <w:numPr>
+          <w:ilvl w:val="1"/>
+          <w:numId w:val="10"/>
+        </w:numPr>
+        <w:rPr>
+          <w:rFonts w:ascii="Segoe UI Emoji" w:hAnsi="Segoe UI Emoji" w:cs="Segoe UI Emoji"/>
+        </w:rPr>
+      </w:pPr>
+      <w:r>
+        <w:rPr>
+          <w:rFonts w:ascii="Segoe UI Emoji" w:hAnsi="Segoe UI Emoji" w:cs="Segoe UI Emoji"/>
+        </w:rPr>
+        <w:t>Título do status na cor correspondente + contagem de leads</w:t>
+      </w:r>
+    </w:p>
+    <w:p>
+      <w:pPr>
+        <w:numPr>
+          <w:ilvl w:val="1"/>
+          <w:numId w:val="10"/>
+        </w:numPr>
+        <w:rPr>
+          <w:rFonts w:ascii="Segoe UI Emoji" w:hAnsi="Segoe UI Emoji" w:cs="Segoe UI Emoji"/>
+        </w:rPr>
+      </w:pPr>
+      <w:r>
+        <w:rPr>
+          <w:rFonts w:ascii="Segoe UI Emoji" w:hAnsi="Segoe UI Emoji" w:cs="Segoe UI Emoji"/>
+        </w:rPr>
+        <w:t>Valor total em carteira (se houver propostas)</w:t>
+      </w:r>
+    </w:p>
+    <w:p>
+      <w:pPr>
+        <w:numPr>
+          <w:ilvl w:val="1"/>
+          <w:numId w:val="10"/>
+        </w:numPr>
+        <w:rPr>
+          <w:rFonts w:ascii="Segoe UI Emoji" w:hAnsi="Segoe UI Emoji" w:cs="Segoe UI Emoji"/>
+        </w:rPr>
+      </w:pPr>
+      <w:r>
+        <w:rPr>
+          <w:rFonts w:ascii="Segoe UI Emoji" w:hAnsi="Segoe UI Emoji" w:cs="Segoe UI Emoji"/>
+        </w:rPr>
+        <w:t>Tabela completa com: </w:t>
+      </w:r>
+      <w:r>
+        <w:rPr>
+          <w:rFonts w:ascii="Segoe UI Emoji" w:hAnsi="Segoe UI Emoji" w:cs="Segoe UI Emoji"/>
+          <w:b/>
+          <w:bCs/>
+        </w:rPr>
+        <w:t xml:space="preserve">Nome, Status, Operador, Atendente, Valor (R$), </w:t>
+      </w:r>
+      <w:r>
+        <w:rPr>
+          <w:rFonts w:ascii="Segoe UI Emoji" w:hAnsi="Segoe UI Emoji" w:cs="Segoe UI Emoji"/>
+          <w:b/>
+          <w:bCs/>
+        </w:rPr>
+        <w:t>cadastrado</w:t>
+      </w:r>
+      <w:r>
+        <w:rPr>
+          <w:rFonts w:ascii="Segoe UI Emoji" w:hAnsi="Segoe UI Emoji" w:cs="Segoe UI Emoji"/>
+          <w:b/>
+          <w:bCs/>
+        </w:rPr>
+        <w:t xml:space="preserve"> em</w:t>
+      </w:r>
+      <w:r>
+        <w:rPr>
+          <w:rFonts w:ascii="Segoe UI Emoji" w:hAnsi="Segoe UI Emoji" w:cs="Segoe UI Emoji"/>
+        </w:rPr>
+        <w:t> — ordenada pela data mais recente</w:t>
+      </w:r>
+    </w:p>
+    <w:p>
+      <w:pPr>
+        <w:numPr>
+          <w:ilvl w:val="0"/>
+          <w:numId w:val="10"/>
+        </w:numPr>
+        <w:rPr>
+          <w:rFonts w:ascii="Segoe UI Emoji" w:hAnsi="Segoe UI Emoji" w:cs="Segoe UI Emoji"/>
+        </w:rPr>
+      </w:pPr>
+      <w:r>
+        <w:rPr>
+          <w:rFonts w:ascii="Segoe UI Emoji" w:hAnsi="Segoe UI Emoji" w:cs="Segoe UI Emoji"/>
+          <w:b/>
+          <w:bCs/>
+        </w:rPr>
+        <w:t>Botão "🔍 Ver leads"</w:t>
+      </w:r>
+      <w:r>
+        <w:rPr>
+          <w:rFonts w:ascii="Segoe UI Emoji" w:hAnsi="Segoe UI Emoji" w:cs="Segoe UI Emoji"/>
+        </w:rPr>
+        <w:t xml:space="preserve"> adicionado abaixo de </w:t>
+      </w:r>
+      <w:r>
+        <w:rPr>
+          <w:rFonts w:ascii="Segoe UI Emoji" w:hAnsi="Segoe UI Emoji" w:cs="Segoe UI Emoji"/>
+          <w:b/>
+          <w:bCs/>
+        </w:rPr>
+        <w:t>todos os 8 cards</w:t>
+      </w:r>
+      <w:r>
+        <w:rPr>
+          <w:rFonts w:ascii="Segoe UI Emoji" w:hAnsi="Segoe UI Emoji" w:cs="Segoe UI Emoji"/>
+        </w:rPr>
+        <w:t xml:space="preserve"> da "Visão Geral do Período":</w:t>
+      </w:r>
+    </w:p>
+    <w:p>
+      <w:pPr>
+        <w:numPr>
+          <w:ilvl w:val="1"/>
+          <w:numId w:val="10"/>
+        </w:numPr>
+        <w:rPr>
+          <w:rFonts w:ascii="Segoe UI Emoji" w:hAnsi="Segoe UI Emoji" w:cs="Segoe UI Emoji"/>
+        </w:rPr>
+      </w:pPr>
+      <w:r>
+        <w:rPr>
+          <w:rFonts w:ascii="Segoe UI Emoji" w:hAnsi="Segoe UI Emoji" w:cs="Segoe UI Emoji"/>
+        </w:rPr>
+        <w:t>Total de Leads → exibe todos os leads do período</w:t>
+      </w:r>
+    </w:p>
+    <w:p>
+      <w:pPr>
+        <w:numPr>
+          <w:ilvl w:val="1"/>
+          <w:numId w:val="10"/>
+        </w:numPr>
+        <w:rPr>
+          <w:rFonts w:ascii="Segoe UI Emoji" w:hAnsi="Segoe UI Emoji" w:cs="Segoe UI Emoji"/>
+        </w:rPr>
+      </w:pPr>
+      <w:r>
+        <w:rPr>
+          <w:rFonts w:ascii="Segoe UI Emoji" w:hAnsi="Segoe UI Emoji" w:cs="Segoe UI Emoji"/>
+        </w:rPr>
+        <w:t>Taxa de Conversão → exibe os leads com Venda Realizada</w:t>
+      </w:r>
+    </w:p>
+    <w:p>
+      <w:pPr>
+        <w:numPr>
+          <w:ilvl w:val="1"/>
+          <w:numId w:val="10"/>
+        </w:numPr>
+        <w:rPr>
+          <w:rFonts w:ascii="Segoe UI Emoji" w:hAnsi="Segoe UI Emoji" w:cs="Segoe UI Emoji"/>
+        </w:rPr>
+      </w:pPr>
+      <w:r>
+        <w:rPr>
+          <w:rFonts w:ascii="Segoe UI Emoji" w:hAnsi="Segoe UI Emoji" w:cs="Segoe UI Emoji"/>
+        </w:rPr>
+        <w:t>Venda Realizada, Aguardando Pagamento, Proposta Enviada, Agendado, Primeiro Contato, Venda não Realizada → cada um filtra pelo seu respectivo status</w:t>
+      </w:r>
+    </w:p>
+    <w:p>
+      <w:pPr>
+        <w:ind w:left="720"/>
+        <w:rPr>
+          <w:rFonts w:ascii="Segoe UI Emoji" w:hAnsi="Segoe UI Emoji" w:cs="Segoe UI Emoji"/>
+        </w:rPr>
+      </w:pPr>
+      <w:r>
+        <w:rPr>
+          <w:rFonts w:ascii="Segoe UI Emoji" w:hAnsi="Segoe UI Emoji" w:cs="Segoe UI Emoji"/>
+        </w:rPr>
+        <w:t>*</w:t>
+      </w:r>
+      <w:r>
+        <w:rPr>
+          <w:rFonts w:ascii="Segoe UI Emoji" w:hAnsi="Segoe UI Emoji" w:cs="Segoe UI Emoji"/>
+          <w:b/>
+          <w:bCs/>
+          <w:highlight w:val="yellow"/>
+        </w:rPr>
+        <w:t>Tratativa acima feita para termos melhor leitura do cenário por cada status.</w:t>
+      </w:r>
+    </w:p>
+    <w:p>
+      <w:pPr>
+        <w:pStyle w:val="PargrafodaLista"/>
+        <w:numPr>
+          <w:ilvl w:val="0"/>
+          <w:numId w:val="12"/>
+        </w:numPr>
+        <w:rPr>
+          <w:rFonts w:ascii="Segoe UI Emoji" w:hAnsi="Segoe UI Emoji" w:cs="Segoe UI Emoji"/>
+        </w:rPr>
+      </w:pPr>
+      <w:r>
+        <w:rPr>
+          <w:rFonts w:ascii="Segoe UI Emoji" w:hAnsi="Segoe UI Emoji" w:cs="Segoe UI Emoji"/>
+        </w:rPr>
+        <w:t>Transformar o app em link compartilhado com os demais</w:t>
+      </w:r>
+    </w:p>
+    <w:p>
+      <w:pPr>
+        <w:pStyle w:val="PargrafodaLista"/>
+        <w:numPr>
+          <w:ilvl w:val="0"/>
+          <w:numId w:val="12"/>
+        </w:numPr>
+        <w:rPr>
+          <w:rFonts w:ascii="Segoe UI Emoji" w:hAnsi="Segoe UI Emoji" w:cs="Segoe UI Emoji"/>
+        </w:rPr>
+      </w:pPr>
+      <w:r>
+        <w:rPr>
+          <w:rFonts w:ascii="Segoe UI Emoji" w:hAnsi="Segoe UI Emoji" w:cs="Segoe UI Emoji"/>
+        </w:rPr>
+        <w:t>Inserir login e senha, porém, cada operador só poderá ver o seu próprio desempenho e resultado, permitindo apenas alterar filtros.</w:t>
+      </w:r>
+    </w:p>
+    <w:p>
+      <w:pPr>
+        <w:pStyle w:val="PargrafodaLista"/>
+        <w:numPr>
+          <w:ilvl w:val="0"/>
+          <w:numId w:val="12"/>
+        </w:numPr>
+        <w:rPr>
+          <w:rFonts w:ascii="Segoe UI Emoji" w:hAnsi="Segoe UI Emoji" w:cs="Segoe UI Emoji"/>
+        </w:rPr>
+      </w:pPr>
+      <w:r>
+        <w:rPr>
+          <w:rFonts w:ascii="Segoe UI Emoji" w:hAnsi="Segoe UI Emoji" w:cs="Segoe UI Emoji"/>
+        </w:rPr>
+        <w:t>Alteração campo “e-mail” no Formulário Leads e subir via GitHub</w:t>
+      </w:r>
+      <w:r>
+        <w:rPr>
+          <w:rFonts w:ascii="Segoe UI Emoji" w:hAnsi="Segoe UI Emoji" w:cs="Segoe UI Emoji"/>
+        </w:rPr>
+        <w:t xml:space="preserve"> </w:t>
+      </w:r>
+      <w:r>
+        <w:rPr>
+          <w:rFonts w:ascii="Segoe UI Emoji" w:hAnsi="Segoe UI Emoji" w:cs="Segoe UI Emoji"/>
+        </w:rPr>
+        <w:t>✅</w:t>
+      </w:r>
+    </w:p>
+    <w:p>
+      <w:pPr>
+        <w:pStyle w:val="PargrafodaLista"/>
+        <w:numPr>
+          <w:ilvl w:val="0"/>
+          <w:numId w:val="12"/>
+        </w:numPr>
+        <w:rPr>
+          <w:rFonts w:ascii="Segoe UI Emoji" w:hAnsi="Segoe UI Emoji" w:cs="Segoe UI Emoji"/>
+        </w:rPr>
+      </w:pPr>
+      <w:r>
+        <w:rPr>
+          <w:rFonts w:ascii="Segoe UI Emoji" w:hAnsi="Segoe UI Emoji" w:cs="Segoe UI Emoji"/>
+        </w:rPr>
+        <w:t>Inclusão de soma geral na aba de “CRM – Histórico de bases”</w:t>
+      </w:r>
+      <w:r>
+        <w:rPr>
+          <w:rFonts w:ascii="Segoe UI Emoji" w:hAnsi="Segoe UI Emoji" w:cs="Segoe UI Emoji"/>
+        </w:rPr>
+        <w:t xml:space="preserve"> </w:t>
+      </w:r>
+      <w:r>
+        <w:rPr>
+          <w:rFonts w:ascii="Segoe UI Emoji" w:hAnsi="Segoe UI Emoji" w:cs="Segoe UI Emoji"/>
+        </w:rPr>
+        <w:t>✅</w:t>
+      </w:r>
+    </w:p>
+    <w:p>
+      <w:pPr>
+        <w:pStyle w:val="PargrafodaLista"/>
+        <w:numPr>
+          <w:ilvl w:val="0"/>
+          <w:numId w:val="12"/>
+        </w:numPr>
+        <w:rPr>
+          <w:rFonts w:ascii="Segoe UI Emoji" w:hAnsi="Segoe UI Emoji" w:cs="Segoe UI Emoji"/>
+        </w:rPr>
+      </w:pPr>
+      <w:r>
+        <w:rPr>
+          <w:rFonts w:ascii="Segoe UI Emoji" w:hAnsi="Segoe UI Emoji" w:cs="Segoe UI Emoji"/>
+        </w:rPr>
+        <w:t xml:space="preserve">Urgente: </w:t>
+      </w:r>
+      <w:r>
+        <w:rPr>
+          <w:rFonts w:ascii="Segoe UI Emoji" w:hAnsi="Segoe UI Emoji" w:cs="Segoe UI Emoji"/>
+        </w:rPr>
+        <w:t xml:space="preserve">aba “CRM” -&gt; </w:t>
+      </w:r>
+      <w:r>
+        <w:rPr>
+          <w:rFonts w:ascii="Segoe UI Emoji" w:hAnsi="Segoe UI Emoji" w:cs="Segoe UI Emoji"/>
+        </w:rPr>
+        <w:t xml:space="preserve">“histórico de bases” precisa ter um botão de direcionar ou box para abrir ao clicar no nome da base e saber quem captou, quando, </w:t>
+      </w:r>
+      <w:r>
+        <w:rPr>
+          <w:rFonts w:ascii="Segoe UI Emoji" w:hAnsi="Segoe UI Emoji" w:cs="Segoe UI Emoji"/>
+        </w:rPr>
+        <w:t>valor etc.</w:t>
+      </w:r>
+      <w:r>
+        <w:rPr>
+          <w:rFonts w:ascii="Segoe UI Emoji" w:hAnsi="Segoe UI Emoji" w:cs="Segoe UI Emoji"/>
+        </w:rPr>
+        <w:t xml:space="preserve"> </w:t>
+      </w:r>
+      <w:r>
+        <w:rPr>
+          <w:rFonts w:ascii="Segoe UI Emoji" w:hAnsi="Segoe UI Emoji" w:cs="Segoe UI Emoji"/>
+        </w:rPr>
+        <w:t>✅</w:t>
+      </w:r>
+    </w:p>
+    <w:p>
+      <w:pPr>
+        <w:pStyle w:val="PargrafodaLista"/>
+        <w:numPr>
+          <w:ilvl w:val="0"/>
+          <w:numId w:val="12"/>
+        </w:numPr>
+        <w:rPr>
+          <w:rFonts w:ascii="Segoe UI Emoji" w:hAnsi="Segoe UI Emoji" w:cs="Segoe UI Emoji"/>
+        </w:rPr>
+      </w:pPr>
+      <w:r>
+        <w:rPr>
+          <w:rFonts w:ascii="Segoe UI Emoji" w:hAnsi="Segoe UI Emoji" w:cs="Segoe UI Emoji"/>
+        </w:rPr>
+        <w:t xml:space="preserve">Alterar </w:t>
+      </w:r>
+      <w:r>
+        <w:rPr>
+          <w:rFonts w:ascii="Segoe UI Emoji" w:hAnsi="Segoe UI Emoji" w:cs="Segoe UI Emoji"/>
+        </w:rPr>
+        <w:t>visão mensal</w:t>
+      </w:r>
+      <w:r>
+        <w:rPr>
+          <w:rFonts w:ascii="Segoe UI Emoji" w:hAnsi="Segoe UI Emoji" w:cs="Segoe UI Emoji"/>
+        </w:rPr>
+        <w:t xml:space="preserve"> para captar apenas leads referente ao time SDR</w:t>
+      </w:r>
+      <w:r>
+        <w:rPr>
+          <w:rFonts w:ascii="Segoe UI Emoji" w:hAnsi="Segoe UI Emoji" w:cs="Segoe UI Emoji"/>
+        </w:rPr>
+        <w:t xml:space="preserve"> </w:t>
+      </w:r>
+      <w:r>
+        <w:rPr>
+          <w:rFonts w:ascii="Segoe UI Emoji" w:hAnsi="Segoe UI Emoji" w:cs="Segoe UI Emoji"/>
+        </w:rPr>
+        <w:t>✅</w:t>
+      </w:r>
+    </w:p>
+    <w:p>
+      <w:pPr>
+        <w:pStyle w:val="PargrafodaLista"/>
+        <w:numPr>
+          <w:ilvl w:val="0"/>
+          <w:numId w:val="12"/>
+        </w:numPr>
+        <w:rPr>
+          <w:rFonts w:ascii="Segoe UI Emoji" w:hAnsi="Segoe UI Emoji" w:cs="Segoe UI Emoji"/>
+        </w:rPr>
+      </w:pPr>
+      <w:r>
+        <w:rPr>
+          <w:rFonts w:ascii="Segoe UI Emoji" w:hAnsi="Segoe UI Emoji" w:cs="Segoe UI Emoji"/>
+        </w:rPr>
+        <w:t>Alterar o acompanhamento da Gio e da Ray para “origem – geral”</w:t>
+      </w:r>
+      <w:r>
+        <w:rPr>
+          <w:rFonts w:ascii="Segoe UI Emoji" w:hAnsi="Segoe UI Emoji" w:cs="Segoe UI Emoji"/>
+        </w:rPr>
+        <w:t xml:space="preserve"> </w:t>
+      </w:r>
+      <w:r>
+        <w:rPr>
+          <w:rFonts w:ascii="Segoe UI Emoji" w:hAnsi="Segoe UI Emoji" w:cs="Segoe UI Emoji"/>
+        </w:rPr>
+        <w:t>✅</w:t>
+      </w:r>
+    </w:p>
+    <w:p>
+      <w:pPr>
+        <w:pStyle w:val="PargrafodaLista"/>
+        <w:numPr>
+          <w:ilvl w:val="0"/>
+          <w:numId w:val="12"/>
+        </w:numPr>
+        <w:rPr>
+          <w:rFonts w:ascii="Segoe UI Emoji" w:hAnsi="Segoe UI Emoji" w:cs="Segoe UI Emoji"/>
+        </w:rPr>
+      </w:pPr>
+      <w:r>
+        <w:rPr>
+          <w:rFonts w:ascii="Segoe UI Emoji" w:hAnsi="Segoe UI Emoji" w:cs="Segoe UI Emoji"/>
+          <w:highlight w:val="yellow"/>
+        </w:rPr>
+        <w:t>Criar uma aba do financeiro ou dentro do próprio CRM onde possamos entender que o lead captado seja mais ou menos rentável por meio da cotação e equiparar isso entre SDRs</w:t>
+      </w:r>
+      <w:r>
+        <w:rPr>
+          <w:rFonts w:ascii="Segoe UI Emoji" w:hAnsi="Segoe UI Emoji" w:cs="Segoe UI Emoji"/>
+          <w:highlight w:val="yellow"/>
+        </w:rPr>
+        <w:t xml:space="preserve"> (certa urgência).</w:t>
+      </w:r>
+      <w:r>
+        <w:rPr>
+          <w:rFonts w:ascii="Segoe UI Emoji" w:hAnsi="Segoe UI Emoji" w:cs="Segoe UI Emoji"/>
+        </w:rPr>
+        <w:t xml:space="preserve"> </w:t>
+      </w:r>
+      <w:r>
+        <w:rPr>
+          <w:rFonts w:ascii="Segoe UI Emoji" w:hAnsi="Segoe UI Emoji" w:cs="Segoe UI Emoji"/>
+        </w:rPr>
+        <w:t>⌛</w:t>
+      </w:r>
+    </w:p>
+    <w:p>
+      <w:pPr>
+        <w:pStyle w:val="PargrafodaLista"/>
+        <w:numPr>
+          <w:ilvl w:val="0"/>
+          <w:numId w:val="12"/>
+        </w:numPr>
+        <w:rPr>
+          <w:rFonts w:ascii="Segoe UI Emoji" w:hAnsi="Segoe UI Emoji" w:cs="Segoe UI Emoji"/>
+        </w:rPr>
+      </w:pPr>
+      <w:r>
+        <w:rPr>
+          <w:rFonts w:ascii="Segoe UI Emoji" w:hAnsi="Segoe UI Emoji" w:cs="Segoe UI Emoji"/>
+        </w:rPr>
+        <w:t>Retirar “vendas totais” do “CRM -&gt; Histórico de bases”; no lugar dele, puxar</w:t>
+      </w:r>
+      <w:r>
+        <w:rPr>
+          <w:rFonts w:ascii="Segoe UI Emoji" w:hAnsi="Segoe UI Emoji" w:cs="Segoe UI Emoji"/>
+        </w:rPr>
+        <w:t xml:space="preserve"> </w:t>
+      </w:r>
+      <w:r>
+        <w:rPr>
+          <w:rFonts w:ascii="Segoe UI Emoji" w:hAnsi="Segoe UI Emoji" w:cs="Segoe UI Emoji"/>
+        </w:rPr>
+        <w:t>“carteira total” e ao lado, inserir “ticket médio”.</w:t>
+      </w:r>
+      <w:r>
+        <w:rPr>
+          <w:rFonts w:ascii="Segoe UI Emoji" w:hAnsi="Segoe UI Emoji" w:cs="Segoe UI Emoji"/>
+        </w:rPr>
+        <w:t xml:space="preserve"> </w:t>
+      </w:r>
+      <w:r>
+        <w:rPr>
+          <w:rFonts w:ascii="Segoe UI Emoji" w:hAnsi="Segoe UI Emoji" w:cs="Segoe UI Emoji"/>
+        </w:rPr>
+        <w:t>✅</w:t>
+      </w:r>
+    </w:p>
+    <w:p>
+      <w:pPr>
+        <w:pStyle w:val="PargrafodaLista"/>
+        <w:numPr>
+          <w:ilvl w:val="0"/>
+          <w:numId w:val="12"/>
+        </w:numPr>
+        <w:rPr>
+          <w:rFonts w:ascii="Segoe UI Emoji" w:hAnsi="Segoe UI Emoji" w:cs="Segoe UI Emoji"/>
+        </w:rPr>
+      </w:pPr>
+      <w:r>
+        <w:rPr>
+          <w:rFonts w:ascii="Segoe UI Emoji" w:hAnsi="Segoe UI Emoji" w:cs="Segoe UI Emoji"/>
+        </w:rPr>
+        <w:lastRenderedPageBreak/>
+        <w:t xml:space="preserve">Interessante criar um botão chamado “Menu” em CRM e dentro dele ter </w:t>
+      </w:r>
+      <w:r>
+        <w:rPr>
+          <w:rFonts w:ascii="Segoe UI Emoji" w:hAnsi="Segoe UI Emoji" w:cs="Segoe UI Emoji"/>
+        </w:rPr>
+        <w:t>“por data”, “ranking de conversão”, “histórico de bases” e “gerenciar nomes”.</w:t>
+      </w:r>
+    </w:p>
+    <w:p>
+      <w:pPr>
+        <w:rPr>
+          <w:rFonts w:ascii="Segoe UI Emoji" w:hAnsi="Segoe UI Emoji" w:cs="Segoe UI Emoji"/>
+        </w:rPr>
+      </w:pPr>
+    </w:p>
+    <w:p>
+      <w:pPr>
+        <w:rPr>
+          <w:rFonts w:ascii="Segoe UI Emoji" w:hAnsi="Segoe UI Emoji" w:cs="Segoe UI Emoji"/>
+          <w:b/>
+          <w:bCs/>
+        </w:rPr>
+      </w:pPr>
+      <w:r>
+        <w:rPr>
+          <w:rFonts w:ascii="Segoe UI Emoji" w:hAnsi="Segoe UI Emoji" w:cs="Segoe UI Emoji"/>
+          <w:b/>
+          <w:bCs/>
+        </w:rPr>
+        <w:t>Alteração importante:</w:t>
+      </w:r>
+    </w:p>
+    <w:tbl>
+      <w:tblPr>
+        <w:tblW w:w="0" w:type="auto"/>
+        <w:tblBorders>
+          <w:top w:val="single" w:sz="4" w:space="0" w:color="2A2B2C"/>
+          <w:left w:val="single" w:sz="4" w:space="0" w:color="2A2B2C"/>
+          <w:bottom w:val="single" w:sz="4" w:space="0" w:color="2A2B2C"/>
+          <w:right w:val="single" w:sz="4" w:space="0" w:color="2A2B2C"/>
+        </w:tblBorders>
+        <w:shd w:val="clear" w:color="auto" w:fill="191A1B"/>
+        <w:tblCellMar>
+          <w:top w:w="15" w:type="dxa"/>
+          <w:left w:w="15" w:type="dxa"/>
+          <w:bottom w:w="15" w:type="dxa"/>
+          <w:right w:w="15" w:type="dxa"/>
+        </w:tblCellMar>
+        <w:tblLook w:val="04A0" w:firstRow="1" w:lastRow="0" w:firstColumn="1" w:lastColumn="0" w:noHBand="0" w:noVBand="1"/>
+      </w:tblPr>
+      <w:tblGrid>
+        <w:gridCol w:w="2787"/>
+        <w:gridCol w:w="1411"/>
+        <w:gridCol w:w="4296"/>
+      </w:tblGrid>
+      <w:tr>
+        <w:trPr>
+          <w:tblHeader/>
+        </w:trPr>
+        <w:tc>
+          <w:tcPr>
+            <w:tcW w:w="0" w:type="auto"/>
+            <w:tcBorders>
+              <w:top w:val="single" w:sz="4" w:space="0" w:color="2A2B2C"/>
+              <w:left w:val="single" w:sz="4" w:space="0" w:color="2A2B2C"/>
+              <w:bottom w:val="single" w:sz="4" w:space="0" w:color="2A2B2C"/>
+              <w:right w:val="single" w:sz="4" w:space="0" w:color="2A2B2C"/>
+            </w:tcBorders>
+            <w:shd w:val="clear" w:color="auto" w:fill="191A1B"/>
+            <w:tcMar>
+              <w:top w:w="30" w:type="dxa"/>
+              <w:left w:w="30" w:type="dxa"/>
+              <w:bottom w:w="30" w:type="dxa"/>
+              <w:right w:w="30" w:type="dxa"/>
+            </w:tcMar>
+            <w:vAlign w:val="center"/>
+            <w:hideMark/>
+          </w:tcPr>
+          <w:p>
+            <w:pPr>
+              <w:ind w:left="360"/>
+              <w:rPr>
+                <w:rFonts w:ascii="Segoe UI Emoji" w:hAnsi="Segoe UI Emoji" w:cs="Segoe UI Emoji"/>
+                <w:b/>
+                <w:bCs/>
+              </w:rPr>
+            </w:pPr>
+            <w:r>
+              <w:rPr>
+                <w:rFonts w:ascii="Segoe UI Emoji" w:hAnsi="Segoe UI Emoji" w:cs="Segoe UI Emoji"/>
+                <w:b/>
+                <w:bCs/>
+              </w:rPr>
+              <w:t>Card</w:t>
+            </w:r>
+          </w:p>
+        </w:tc>
+        <w:tc>
+          <w:tcPr>
+            <w:tcW w:w="0" w:type="auto"/>
+            <w:tcBorders>
+              <w:top w:val="single" w:sz="4" w:space="0" w:color="2A2B2C"/>
+              <w:left w:val="single" w:sz="4" w:space="0" w:color="2A2B2C"/>
+              <w:bottom w:val="single" w:sz="4" w:space="0" w:color="2A2B2C"/>
+              <w:right w:val="single" w:sz="4" w:space="0" w:color="2A2B2C"/>
+            </w:tcBorders>
+            <w:shd w:val="clear" w:color="auto" w:fill="191A1B"/>
+            <w:tcMar>
+              <w:top w:w="30" w:type="dxa"/>
+              <w:left w:w="30" w:type="dxa"/>
+              <w:bottom w:w="30" w:type="dxa"/>
+              <w:right w:w="30" w:type="dxa"/>
+            </w:tcMar>
+            <w:vAlign w:val="center"/>
+            <w:hideMark/>
+          </w:tcPr>
+          <w:p>
+            <w:pPr>
+              <w:ind w:left="360"/>
+              <w:rPr>
+                <w:rFonts w:ascii="Segoe UI Emoji" w:hAnsi="Segoe UI Emoji" w:cs="Segoe UI Emoji"/>
+                <w:b/>
+                <w:bCs/>
+              </w:rPr>
+            </w:pPr>
+            <w:r>
+              <w:rPr>
+                <w:rFonts w:ascii="Segoe UI Emoji" w:hAnsi="Segoe UI Emoji" w:cs="Segoe UI Emoji"/>
+                <w:b/>
+                <w:bCs/>
+              </w:rPr>
+              <w:t>Cor</w:t>
+            </w:r>
+          </w:p>
+        </w:tc>
+        <w:tc>
+          <w:tcPr>
+            <w:tcW w:w="0" w:type="auto"/>
+            <w:tcBorders>
+              <w:top w:val="single" w:sz="4" w:space="0" w:color="2A2B2C"/>
+              <w:left w:val="single" w:sz="4" w:space="0" w:color="2A2B2C"/>
+              <w:bottom w:val="single" w:sz="4" w:space="0" w:color="2A2B2C"/>
+              <w:right w:val="single" w:sz="4" w:space="0" w:color="2A2B2C"/>
+            </w:tcBorders>
+            <w:shd w:val="clear" w:color="auto" w:fill="191A1B"/>
+            <w:tcMar>
+              <w:top w:w="30" w:type="dxa"/>
+              <w:left w:w="30" w:type="dxa"/>
+              <w:bottom w:w="30" w:type="dxa"/>
+              <w:right w:w="30" w:type="dxa"/>
+            </w:tcMar>
+            <w:vAlign w:val="center"/>
+            <w:hideMark/>
+          </w:tcPr>
+          <w:p>
+            <w:pPr>
+              <w:ind w:left="360"/>
+              <w:rPr>
+                <w:rFonts w:ascii="Segoe UI Emoji" w:hAnsi="Segoe UI Emoji" w:cs="Segoe UI Emoji"/>
+                <w:b/>
+                <w:bCs/>
+              </w:rPr>
+            </w:pPr>
+            <w:r>
+              <w:rPr>
+                <w:rFonts w:ascii="Segoe UI Emoji" w:hAnsi="Segoe UI Emoji" w:cs="Segoe UI Emoji"/>
+                <w:b/>
+                <w:bCs/>
+              </w:rPr>
+              <w:t>Filtro</w:t>
+            </w:r>
+          </w:p>
+        </w:tc>
+      </w:tr>
+      <w:tr>
+        <w:tc>
+          <w:tcPr>
+            <w:tcW w:w="0" w:type="auto"/>
+            <w:tcBorders>
+              <w:top w:val="single" w:sz="4" w:space="0" w:color="2A2B2C"/>
+              <w:left w:val="single" w:sz="4" w:space="0" w:color="2A2B2C"/>
+              <w:bottom w:val="single" w:sz="4" w:space="0" w:color="2A2B2C"/>
+              <w:right w:val="single" w:sz="4" w:space="0" w:color="2A2B2C"/>
+            </w:tcBorders>
+            <w:shd w:val="clear" w:color="auto" w:fill="191A1B"/>
+            <w:tcMar>
+              <w:top w:w="30" w:type="dxa"/>
+              <w:left w:w="30" w:type="dxa"/>
+              <w:bottom w:w="30" w:type="dxa"/>
+              <w:right w:w="30" w:type="dxa"/>
+            </w:tcMar>
+            <w:vAlign w:val="center"/>
+            <w:hideMark/>
+          </w:tcPr>
+          <w:p>
+            <w:pPr>
+              <w:ind w:left="360"/>
+              <w:rPr>
+                <w:rFonts w:ascii="Segoe UI Emoji" w:hAnsi="Segoe UI Emoji" w:cs="Segoe UI Emoji"/>
+              </w:rPr>
+            </w:pPr>
+            <w:r>
+              <w:rPr>
+                <w:rFonts w:ascii="Segoe UI Emoji" w:hAnsi="Segoe UI Emoji" w:cs="Segoe UI Emoji"/>
+              </w:rPr>
+              <w:t>👥 Total de Leads</w:t>
+            </w:r>
+          </w:p>
+        </w:tc>
+        <w:tc>
+          <w:tcPr>
+            <w:tcW w:w="0" w:type="auto"/>
+            <w:tcBorders>
+              <w:top w:val="single" w:sz="4" w:space="0" w:color="2A2B2C"/>
+              <w:left w:val="single" w:sz="4" w:space="0" w:color="2A2B2C"/>
+              <w:bottom w:val="single" w:sz="4" w:space="0" w:color="2A2B2C"/>
+              <w:right w:val="single" w:sz="4" w:space="0" w:color="2A2B2C"/>
+            </w:tcBorders>
+            <w:shd w:val="clear" w:color="auto" w:fill="191A1B"/>
+            <w:tcMar>
+              <w:top w:w="30" w:type="dxa"/>
+              <w:left w:w="30" w:type="dxa"/>
+              <w:bottom w:w="30" w:type="dxa"/>
+              <w:right w:w="30" w:type="dxa"/>
+            </w:tcMar>
+            <w:vAlign w:val="center"/>
+            <w:hideMark/>
+          </w:tcPr>
+          <w:p>
+            <w:pPr>
+              <w:ind w:left="360"/>
+              <w:rPr>
+                <w:rFonts w:ascii="Segoe UI Emoji" w:hAnsi="Segoe UI Emoji" w:cs="Segoe UI Emoji"/>
+              </w:rPr>
+            </w:pPr>
+            <w:r>
+              <w:rPr>
+                <w:rFonts w:ascii="Segoe UI Emoji" w:hAnsi="Segoe UI Emoji" w:cs="Segoe UI Emoji"/>
+              </w:rPr>
+              <w:t>azul</w:t>
+            </w:r>
+          </w:p>
+        </w:tc>
+        <w:tc>
+          <w:tcPr>
+            <w:tcW w:w="0" w:type="auto"/>
+            <w:tcBorders>
+              <w:top w:val="single" w:sz="4" w:space="0" w:color="2A2B2C"/>
+              <w:left w:val="single" w:sz="4" w:space="0" w:color="2A2B2C"/>
+              <w:bottom w:val="single" w:sz="4" w:space="0" w:color="2A2B2C"/>
+              <w:right w:val="single" w:sz="4" w:space="0" w:color="2A2B2C"/>
+            </w:tcBorders>
+            <w:shd w:val="clear" w:color="auto" w:fill="191A1B"/>
+            <w:tcMar>
+              <w:top w:w="30" w:type="dxa"/>
+              <w:left w:w="30" w:type="dxa"/>
+              <w:bottom w:w="30" w:type="dxa"/>
+              <w:right w:w="30" w:type="dxa"/>
+            </w:tcMar>
+            <w:vAlign w:val="center"/>
+            <w:hideMark/>
+          </w:tcPr>
+          <w:p>
+            <w:pPr>
+              <w:ind w:left="360"/>
+              <w:rPr>
+                <w:rFonts w:ascii="Segoe UI Emoji" w:hAnsi="Segoe UI Emoji" w:cs="Segoe UI Emoji"/>
+              </w:rPr>
+            </w:pPr>
+            <w:r>
+              <w:rPr>
+                <w:rFonts w:ascii="Segoe UI Emoji" w:hAnsi="Segoe UI Emoji" w:cs="Segoe UI Emoji"/>
+              </w:rPr>
+              <w:t>todos do período</w:t>
+            </w:r>
+          </w:p>
+        </w:tc>
+      </w:tr>
+      <w:tr>
+        <w:tc>
+          <w:tcPr>
+            <w:tcW w:w="0" w:type="auto"/>
+            <w:tcBorders>
+              <w:top w:val="single" w:sz="4" w:space="0" w:color="2A2B2C"/>
+              <w:left w:val="single" w:sz="4" w:space="0" w:color="2A2B2C"/>
+              <w:bottom w:val="single" w:sz="4" w:space="0" w:color="2A2B2C"/>
+              <w:right w:val="single" w:sz="4" w:space="0" w:color="2A2B2C"/>
+            </w:tcBorders>
+            <w:shd w:val="clear" w:color="auto" w:fill="191A1B"/>
+            <w:tcMar>
+              <w:top w:w="30" w:type="dxa"/>
+              <w:left w:w="30" w:type="dxa"/>
+              <w:bottom w:w="30" w:type="dxa"/>
+              <w:right w:w="30" w:type="dxa"/>
+            </w:tcMar>
+            <w:vAlign w:val="center"/>
+            <w:hideMark/>
+          </w:tcPr>
+          <w:p>
+            <w:pPr>
+              <w:ind w:left="360"/>
+              <w:rPr>
+                <w:rFonts w:ascii="Segoe UI Emoji" w:hAnsi="Segoe UI Emoji" w:cs="Segoe UI Emoji"/>
+              </w:rPr>
+            </w:pPr>
+            <w:r>
+              <w:rPr>
+                <w:rFonts w:ascii="Segoe UI Emoji" w:hAnsi="Segoe UI Emoji" w:cs="Segoe UI Emoji"/>
+              </w:rPr>
+              <w:t>💰 Pote da Ganância</w:t>
+            </w:r>
+          </w:p>
+        </w:tc>
+        <w:tc>
+          <w:tcPr>
+            <w:tcW w:w="0" w:type="auto"/>
+            <w:tcBorders>
+              <w:top w:val="single" w:sz="4" w:space="0" w:color="2A2B2C"/>
+              <w:left w:val="single" w:sz="4" w:space="0" w:color="2A2B2C"/>
+              <w:bottom w:val="single" w:sz="4" w:space="0" w:color="2A2B2C"/>
+              <w:right w:val="single" w:sz="4" w:space="0" w:color="2A2B2C"/>
+            </w:tcBorders>
+            <w:shd w:val="clear" w:color="auto" w:fill="191A1B"/>
+            <w:tcMar>
+              <w:top w:w="30" w:type="dxa"/>
+              <w:left w:w="30" w:type="dxa"/>
+              <w:bottom w:w="30" w:type="dxa"/>
+              <w:right w:w="30" w:type="dxa"/>
+            </w:tcMar>
+            <w:vAlign w:val="center"/>
+            <w:hideMark/>
+          </w:tcPr>
+          <w:p>
+            <w:pPr>
+              <w:ind w:left="360"/>
+              <w:rPr>
+                <w:rFonts w:ascii="Segoe UI Emoji" w:hAnsi="Segoe UI Emoji" w:cs="Segoe UI Emoji"/>
+              </w:rPr>
+            </w:pPr>
+            <w:r>
+              <w:rPr>
+                <w:rFonts w:ascii="Segoe UI Emoji" w:hAnsi="Segoe UI Emoji" w:cs="Segoe UI Emoji"/>
+              </w:rPr>
+              <w:t>roxo</w:t>
+            </w:r>
+          </w:p>
+        </w:tc>
+        <w:tc>
+          <w:tcPr>
+            <w:tcW w:w="0" w:type="auto"/>
+            <w:tcBorders>
+              <w:top w:val="single" w:sz="4" w:space="0" w:color="2A2B2C"/>
+              <w:left w:val="single" w:sz="4" w:space="0" w:color="2A2B2C"/>
+              <w:bottom w:val="single" w:sz="4" w:space="0" w:color="2A2B2C"/>
+              <w:right w:val="single" w:sz="4" w:space="0" w:color="2A2B2C"/>
+            </w:tcBorders>
+            <w:shd w:val="clear" w:color="auto" w:fill="191A1B"/>
+            <w:tcMar>
+              <w:top w:w="30" w:type="dxa"/>
+              <w:left w:w="30" w:type="dxa"/>
+              <w:bottom w:w="30" w:type="dxa"/>
+              <w:right w:w="30" w:type="dxa"/>
+            </w:tcMar>
+            <w:vAlign w:val="center"/>
+            <w:hideMark/>
+          </w:tcPr>
+          <w:p>
+            <w:pPr>
+              <w:ind w:left="360"/>
+              <w:rPr>
+                <w:rFonts w:ascii="Segoe UI Emoji" w:hAnsi="Segoe UI Emoji" w:cs="Segoe UI Emoji"/>
+              </w:rPr>
+            </w:pPr>
+            <w:r>
+              <w:rPr>
+                <w:rFonts w:ascii="Segoe UI Emoji" w:hAnsi="Segoe UI Emoji" w:cs="Segoe UI Emoji"/>
+              </w:rPr>
+              <w:t>sem percepção quente + sem encerrados</w:t>
+            </w:r>
+          </w:p>
+        </w:tc>
+      </w:tr>
+      <w:tr>
+        <w:tc>
+          <w:tcPr>
+            <w:tcW w:w="0" w:type="auto"/>
+            <w:tcBorders>
+              <w:top w:val="single" w:sz="4" w:space="0" w:color="2A2B2C"/>
+              <w:left w:val="single" w:sz="4" w:space="0" w:color="2A2B2C"/>
+              <w:bottom w:val="single" w:sz="4" w:space="0" w:color="2A2B2C"/>
+              <w:right w:val="single" w:sz="4" w:space="0" w:color="2A2B2C"/>
+            </w:tcBorders>
+            <w:shd w:val="clear" w:color="auto" w:fill="191A1B"/>
+            <w:tcMar>
+              <w:top w:w="30" w:type="dxa"/>
+              <w:left w:w="30" w:type="dxa"/>
+              <w:bottom w:w="30" w:type="dxa"/>
+              <w:right w:w="30" w:type="dxa"/>
+            </w:tcMar>
+            <w:vAlign w:val="center"/>
+            <w:hideMark/>
+          </w:tcPr>
+          <w:p>
+            <w:pPr>
+              <w:ind w:left="360"/>
+              <w:rPr>
+                <w:rFonts w:ascii="Segoe UI Emoji" w:hAnsi="Segoe UI Emoji" w:cs="Segoe UI Emoji"/>
+              </w:rPr>
+            </w:pPr>
+            <w:r>
+              <w:rPr>
+                <w:rFonts w:ascii="Segoe UI Emoji" w:hAnsi="Segoe UI Emoji" w:cs="Segoe UI Emoji"/>
+              </w:rPr>
+              <w:t>🔥 Propostas em Esteira</w:t>
+            </w:r>
+          </w:p>
+        </w:tc>
+        <w:tc>
+          <w:tcPr>
+            <w:tcW w:w="0" w:type="auto"/>
+            <w:tcBorders>
+              <w:top w:val="single" w:sz="4" w:space="0" w:color="2A2B2C"/>
+              <w:left w:val="single" w:sz="4" w:space="0" w:color="2A2B2C"/>
+              <w:bottom w:val="single" w:sz="4" w:space="0" w:color="2A2B2C"/>
+              <w:right w:val="single" w:sz="4" w:space="0" w:color="2A2B2C"/>
+            </w:tcBorders>
+            <w:shd w:val="clear" w:color="auto" w:fill="191A1B"/>
+            <w:tcMar>
+              <w:top w:w="30" w:type="dxa"/>
+              <w:left w:w="30" w:type="dxa"/>
+              <w:bottom w:w="30" w:type="dxa"/>
+              <w:right w:w="30" w:type="dxa"/>
+            </w:tcMar>
+            <w:vAlign w:val="center"/>
+            <w:hideMark/>
+          </w:tcPr>
+          <w:p>
+            <w:pPr>
+              <w:ind w:left="360"/>
+              <w:rPr>
+                <w:rFonts w:ascii="Segoe UI Emoji" w:hAnsi="Segoe UI Emoji" w:cs="Segoe UI Emoji"/>
+              </w:rPr>
+            </w:pPr>
+            <w:r>
+              <w:rPr>
+                <w:rFonts w:ascii="Segoe UI Emoji" w:hAnsi="Segoe UI Emoji" w:cs="Segoe UI Emoji"/>
+              </w:rPr>
+              <w:t>vermelho</w:t>
+            </w:r>
+          </w:p>
+        </w:tc>
+        <w:tc>
+          <w:tcPr>
+            <w:tcW w:w="0" w:type="auto"/>
+            <w:tcBorders>
+              <w:top w:val="single" w:sz="4" w:space="0" w:color="2A2B2C"/>
+              <w:left w:val="single" w:sz="4" w:space="0" w:color="2A2B2C"/>
+              <w:bottom w:val="single" w:sz="4" w:space="0" w:color="2A2B2C"/>
+              <w:right w:val="single" w:sz="4" w:space="0" w:color="2A2B2C"/>
+            </w:tcBorders>
+            <w:shd w:val="clear" w:color="auto" w:fill="191A1B"/>
+            <w:tcMar>
+              <w:top w:w="30" w:type="dxa"/>
+              <w:left w:w="30" w:type="dxa"/>
+              <w:bottom w:w="30" w:type="dxa"/>
+              <w:right w:w="30" w:type="dxa"/>
+            </w:tcMar>
+            <w:vAlign w:val="center"/>
+            <w:hideMark/>
+          </w:tcPr>
+          <w:p>
+            <w:pPr>
+              <w:ind w:left="360"/>
+              <w:rPr>
+                <w:rFonts w:ascii="Segoe UI Emoji" w:hAnsi="Segoe UI Emoji" w:cs="Segoe UI Emoji"/>
+              </w:rPr>
+            </w:pPr>
+            <w:r>
+              <w:rPr>
+                <w:rFonts w:ascii="Segoe UI Emoji" w:hAnsi="Segoe UI Emoji" w:cs="Segoe UI Emoji"/>
+              </w:rPr>
+              <w:t>percepção quente + sem encerrados</w:t>
+            </w:r>
+          </w:p>
+        </w:tc>
+      </w:tr>
+      <w:tr>
+        <w:tc>
+          <w:tcPr>
+            <w:tcW w:w="0" w:type="auto"/>
+            <w:tcBorders>
+              <w:top w:val="single" w:sz="4" w:space="0" w:color="2A2B2C"/>
+              <w:left w:val="single" w:sz="4" w:space="0" w:color="2A2B2C"/>
+              <w:bottom w:val="single" w:sz="4" w:space="0" w:color="2A2B2C"/>
+              <w:right w:val="single" w:sz="4" w:space="0" w:color="2A2B2C"/>
+            </w:tcBorders>
+            <w:shd w:val="clear" w:color="auto" w:fill="191A1B"/>
+            <w:tcMar>
+              <w:top w:w="30" w:type="dxa"/>
+              <w:left w:w="30" w:type="dxa"/>
+              <w:bottom w:w="30" w:type="dxa"/>
+              <w:right w:w="30" w:type="dxa"/>
+            </w:tcMar>
+            <w:vAlign w:val="center"/>
+            <w:hideMark/>
+          </w:tcPr>
+          <w:p>
+            <w:pPr>
+              <w:ind w:left="360"/>
+              <w:rPr>
+                <w:rFonts w:ascii="Segoe UI Emoji" w:hAnsi="Segoe UI Emoji" w:cs="Segoe UI Emoji"/>
+              </w:rPr>
+            </w:pPr>
+            <w:r>
+              <w:rPr>
+                <w:rFonts w:ascii="Segoe UI Emoji" w:hAnsi="Segoe UI Emoji" w:cs="Segoe UI Emoji"/>
+              </w:rPr>
+              <w:t>✅ Vendas Realizadas</w:t>
+            </w:r>
+          </w:p>
+        </w:tc>
+        <w:tc>
+          <w:tcPr>
+            <w:tcW w:w="0" w:type="auto"/>
+            <w:tcBorders>
+              <w:top w:val="single" w:sz="4" w:space="0" w:color="2A2B2C"/>
+              <w:left w:val="single" w:sz="4" w:space="0" w:color="2A2B2C"/>
+              <w:bottom w:val="single" w:sz="4" w:space="0" w:color="2A2B2C"/>
+              <w:right w:val="single" w:sz="4" w:space="0" w:color="2A2B2C"/>
+            </w:tcBorders>
+            <w:shd w:val="clear" w:color="auto" w:fill="191A1B"/>
+            <w:tcMar>
+              <w:top w:w="30" w:type="dxa"/>
+              <w:left w:w="30" w:type="dxa"/>
+              <w:bottom w:w="30" w:type="dxa"/>
+              <w:right w:w="30" w:type="dxa"/>
+            </w:tcMar>
+            <w:vAlign w:val="center"/>
+            <w:hideMark/>
+          </w:tcPr>
+          <w:p>
+            <w:pPr>
+              <w:ind w:left="360"/>
+              <w:rPr>
+                <w:rFonts w:ascii="Segoe UI Emoji" w:hAnsi="Segoe UI Emoji" w:cs="Segoe UI Emoji"/>
+              </w:rPr>
+            </w:pPr>
+            <w:r>
+              <w:rPr>
+                <w:rFonts w:ascii="Segoe UI Emoji" w:hAnsi="Segoe UI Emoji" w:cs="Segoe UI Emoji"/>
+              </w:rPr>
+              <w:t>verde</w:t>
+            </w:r>
+          </w:p>
+        </w:tc>
+        <w:tc>
+          <w:tcPr>
+            <w:tcW w:w="0" w:type="auto"/>
+            <w:tcBorders>
+              <w:top w:val="single" w:sz="4" w:space="0" w:color="2A2B2C"/>
+              <w:left w:val="single" w:sz="4" w:space="0" w:color="2A2B2C"/>
+              <w:bottom w:val="single" w:sz="4" w:space="0" w:color="2A2B2C"/>
+              <w:right w:val="single" w:sz="4" w:space="0" w:color="2A2B2C"/>
+            </w:tcBorders>
+            <w:shd w:val="clear" w:color="auto" w:fill="191A1B"/>
+            <w:tcMar>
+              <w:top w:w="30" w:type="dxa"/>
+              <w:left w:w="30" w:type="dxa"/>
+              <w:bottom w:w="30" w:type="dxa"/>
+              <w:right w:w="30" w:type="dxa"/>
+            </w:tcMar>
+            <w:vAlign w:val="center"/>
+            <w:hideMark/>
+          </w:tcPr>
+          <w:p>
+            <w:pPr>
+              <w:ind w:left="360"/>
+              <w:rPr>
+                <w:rFonts w:ascii="Segoe UI Emoji" w:hAnsi="Segoe UI Emoji" w:cs="Segoe UI Emoji"/>
+              </w:rPr>
+            </w:pPr>
+            <w:r>
+              <w:rPr>
+                <w:rFonts w:ascii="Segoe UI Emoji" w:hAnsi="Segoe UI Emoji" w:cs="Segoe UI Emoji"/>
+              </w:rPr>
+              <w:t>status = Venda Realizada</w:t>
+            </w:r>
+          </w:p>
+        </w:tc>
+      </w:tr>
+    </w:tbl>
+    <w:p>
+      <w:pPr>
+        <w:ind w:left="360"/>
+        <w:rPr>
+          <w:rFonts w:ascii="Segoe UI Emoji" w:hAnsi="Segoe UI Emoji" w:cs="Segoe UI Emoji"/>
+        </w:rPr>
+      </w:pPr>
+      <w:r>
+        <w:rPr>
+          <w:rFonts w:ascii="Segoe UI Emoji" w:hAnsi="Segoe UI Emoji" w:cs="Segoe UI Emoji"/>
+        </w:rPr>
+        <w:t xml:space="preserve">O "Pote da Ganância" mostra os leads que ainda estão em </w:t>
+      </w:r>
+      <w:r>
+        <w:rPr>
+          <w:rFonts w:ascii="Segoe UI Emoji" w:hAnsi="Segoe UI Emoji" w:cs="Segoe UI Emoji"/>
+        </w:rPr>
+        <w:t>aberto,</w:t>
+      </w:r>
+      <w:r>
+        <w:rPr>
+          <w:rFonts w:ascii="Segoe UI Emoji" w:hAnsi="Segoe UI Emoji" w:cs="Segoe UI Emoji"/>
+        </w:rPr>
+        <w:t xml:space="preserve"> mas ainda não chegaram à percepção quente — Morno, Frio, </w:t>
+      </w:r>
+      <w:r>
+        <w:rPr>
+          <w:rFonts w:ascii="Segoe UI Emoji" w:hAnsi="Segoe UI Emoji" w:cs="Segoe UI Emoji"/>
+        </w:rPr>
+        <w:t>sem</w:t>
+      </w:r>
+      <w:r>
+        <w:rPr>
+          <w:rFonts w:ascii="Segoe UI Emoji" w:hAnsi="Segoe UI Emoji" w:cs="Segoe UI Emoji"/>
+        </w:rPr>
+        <w:t xml:space="preserve"> percepção — que são exatamente os que têm potencial de trabalhar para subir de temperatura.</w:t>
+      </w:r>
+      <w:r>
+        <w:rPr>
+          <w:rFonts w:ascii="Segoe UI Emoji" w:hAnsi="Segoe UI Emoji" w:cs="Segoe UI Emoji"/>
+        </w:rPr>
+        <w:t xml:space="preserve"> </w:t>
+      </w:r>
+      <w:r>
+        <w:rPr>
+          <w:rFonts w:ascii="Segoe UI Emoji" w:hAnsi="Segoe UI Emoji" w:cs="Segoe UI Emoji"/>
+        </w:rPr>
+        <w:t>✅</w:t>
+      </w:r>
+    </w:p>
+    <w:p>
+      <w:pPr>
+        <w:pStyle w:val="PargrafodaLista"/>
+        <w:numPr>
+          <w:ilvl w:val="0"/>
+          <w:numId w:val="14"/>
+        </w:numPr>
+        <w:rPr>
+          <w:rFonts w:ascii="Segoe UI Emoji" w:hAnsi="Segoe UI Emoji" w:cs="Segoe UI Emoji"/>
+        </w:rPr>
+      </w:pPr>
+      <w:r>
+        <w:rPr>
+          <w:rFonts w:ascii="Segoe UI Emoji" w:hAnsi="Segoe UI Emoji" w:cs="Segoe UI Emoji"/>
+        </w:rPr>
+        <w:t xml:space="preserve">Ao atingir o objetivo previsto em “hoje”, ter uma animação na tela: balões, um foguete </w:t>
+      </w:r>
+      <w:r>
+        <w:rPr>
+          <w:rFonts w:ascii="Segoe UI Emoji" w:hAnsi="Segoe UI Emoji" w:cs="Segoe UI Emoji"/>
+        </w:rPr>
+        <w:t>subindo etc.</w:t>
+      </w:r>
+      <w:r>
+        <w:rPr>
+          <w:rFonts w:ascii="Segoe UI Emoji" w:hAnsi="Segoe UI Emoji" w:cs="Segoe UI Emoji"/>
+        </w:rPr>
+        <w:t xml:space="preserve"> Verificar possibilidade.</w:t>
+      </w:r>
+      <w:r>
+        <w:rPr>
+          <w:rFonts w:ascii="Segoe UI Emoji" w:hAnsi="Segoe UI Emoji" w:cs="Segoe UI Emoji"/>
+        </w:rPr>
+        <w:t xml:space="preserve"> </w:t>
+      </w:r>
+      <w:r>
+        <w:rPr>
+          <w:rFonts w:ascii="Segoe UI Emoji" w:hAnsi="Segoe UI Emoji" w:cs="Segoe UI Emoji"/>
+        </w:rPr>
+        <w:t>⌛</w:t>
+      </w:r>
+    </w:p>
+    <w:p>
+      <w:pPr>
+        <w:pStyle w:val="PargrafodaLista"/>
+        <w:numPr>
+          <w:ilvl w:val="0"/>
+          <w:numId w:val="14"/>
+        </w:numPr>
+        <w:rPr>
+          <w:rFonts w:ascii="Segoe UI Emoji" w:hAnsi="Segoe UI Emoji" w:cs="Segoe UI Emoji"/>
+        </w:rPr>
+      </w:pPr>
+      <w:r>
+        <w:rPr>
+          <w:rFonts w:ascii="Segoe UI Emoji" w:hAnsi="Segoe UI Emoji" w:cs="Segoe UI Emoji"/>
+        </w:rPr>
+        <w:t xml:space="preserve">Será necessário um filtro </w:t>
+      </w:r>
+      <w:r>
+        <w:rPr>
+          <w:rFonts w:ascii="Segoe UI Emoji" w:hAnsi="Segoe UI Emoji" w:cs="Segoe UI Emoji"/>
+        </w:rPr>
+        <w:t>específico</w:t>
+      </w:r>
+      <w:r>
+        <w:rPr>
+          <w:rFonts w:ascii="Segoe UI Emoji" w:hAnsi="Segoe UI Emoji" w:cs="Segoe UI Emoji"/>
+        </w:rPr>
+        <w:t xml:space="preserve"> e data para verificar as vendas realizadas</w:t>
+      </w:r>
+      <w:r>
+        <w:rPr>
+          <w:rFonts w:ascii="Segoe UI Emoji" w:hAnsi="Segoe UI Emoji" w:cs="Segoe UI Emoji"/>
+        </w:rPr>
+        <w:t>, devido alinhamento do time.</w:t>
+      </w:r>
+      <w:r>
+        <w:rPr>
+          <w:rFonts w:ascii="Segoe UI Emoji" w:hAnsi="Segoe UI Emoji" w:cs="Segoe UI Emoji"/>
+        </w:rPr>
+        <w:t xml:space="preserve"> </w:t>
+      </w:r>
+      <w:r>
+        <w:rPr>
+          <w:rFonts w:ascii="Segoe UI Emoji" w:hAnsi="Segoe UI Emoji" w:cs="Segoe UI Emoji"/>
+        </w:rPr>
+        <w:t>⌛</w:t>
+      </w:r>
+    </w:p>
+    <w:p>
+      <w:pPr>
+        <w:ind w:left="360"/>
         <w:rPr>
           <w:rFonts w:ascii="Segoe UI Emoji" w:hAnsi="Segoe UI Emoji" w:cs="Segoe UI Emoji"/>
         </w:rPr>
@@ -1861,6 +3075,119 @@
     </w:lvl>
   </w:abstractNum>
   <w:abstractNum w:abstractNumId="2" w15:restartNumberingAfterBreak="0">
+    <w:nsid w:val="2A3025D4"/>
+    <w:multiLevelType w:val="hybridMultilevel"/>
+    <w:tmpl w:val="C74E7AAA"/>
+    <w:lvl w:ilvl="0" w:tplc="04160001">
+      <w:start w:val="1"/>
+      <w:numFmt w:val="bullet"/>
+      <w:lvlText w:val=""/>
+      <w:lvlJc w:val="left"/>
+      <w:pPr>
+        <w:ind w:left="1425" w:hanging="360"/>
+      </w:pPr>
+      <w:rPr>
+        <w:rFonts w:ascii="Symbol" w:hAnsi="Symbol" w:hint="default"/>
+      </w:rPr>
+    </w:lvl>
+    <w:lvl w:ilvl="1" w:tplc="04160003" w:tentative="1">
+      <w:start w:val="1"/>
+      <w:numFmt w:val="bullet"/>
+      <w:lvlText w:val="o"/>
+      <w:lvlJc w:val="left"/>
+      <w:pPr>
+        <w:ind w:left="2145" w:hanging="360"/>
+      </w:pPr>
+      <w:rPr>
+        <w:rFonts w:ascii="Courier New" w:hAnsi="Courier New" w:cs="Courier New" w:hint="default"/>
+      </w:rPr>
+    </w:lvl>
+    <w:lvl w:ilvl="2" w:tplc="04160005" w:tentative="1">
+      <w:start w:val="1"/>
+      <w:numFmt w:val="bullet"/>
+      <w:lvlText w:val=""/>
+      <w:lvlJc w:val="left"/>
+      <w:pPr>
+        <w:ind w:left="2865" w:hanging="360"/>
+      </w:pPr>
+      <w:rPr>
+        <w:rFonts w:ascii="Wingdings" w:hAnsi="Wingdings" w:hint="default"/>
+      </w:rPr>
+    </w:lvl>
+    <w:lvl w:ilvl="3" w:tplc="04160001" w:tentative="1">
+      <w:start w:val="1"/>
+      <w:numFmt w:val="bullet"/>
+      <w:lvlText w:val=""/>
+      <w:lvlJc w:val="left"/>
+      <w:pPr>
+        <w:ind w:left="3585" w:hanging="360"/>
+      </w:pPr>
+      <w:rPr>
+        <w:rFonts w:ascii="Symbol" w:hAnsi="Symbol" w:hint="default"/>
+      </w:rPr>
+    </w:lvl>
+    <w:lvl w:ilvl="4" w:tplc="04160003" w:tentative="1">
+      <w:start w:val="1"/>
+      <w:numFmt w:val="bullet"/>
+      <w:lvlText w:val="o"/>
+      <w:lvlJc w:val="left"/>
+      <w:pPr>
+        <w:ind w:left="4305" w:hanging="360"/>
+      </w:pPr>
+      <w:rPr>
+        <w:rFonts w:ascii="Courier New" w:hAnsi="Courier New" w:cs="Courier New" w:hint="default"/>
+      </w:rPr>
+    </w:lvl>
+    <w:lvl w:ilvl="5" w:tplc="04160005" w:tentative="1">
+      <w:start w:val="1"/>
+      <w:numFmt w:val="bullet"/>
+      <w:lvlText w:val=""/>
+      <w:lvlJc w:val="left"/>
+      <w:pPr>
+        <w:ind w:left="5025" w:hanging="360"/>
+      </w:pPr>
+      <w:rPr>
+        <w:rFonts w:ascii="Wingdings" w:hAnsi="Wingdings" w:hint="default"/>
+      </w:rPr>
+    </w:lvl>
+    <w:lvl w:ilvl="6" w:tplc="04160001" w:tentative="1">
+      <w:start w:val="1"/>
+      <w:numFmt w:val="bullet"/>
+      <w:lvlText w:val=""/>
+      <w:lvlJc w:val="left"/>
+      <w:pPr>
+        <w:ind w:left="5745" w:hanging="360"/>
+      </w:pPr>
+      <w:rPr>
+        <w:rFonts w:ascii="Symbol" w:hAnsi="Symbol" w:hint="default"/>
+      </w:rPr>
+    </w:lvl>
+    <w:lvl w:ilvl="7" w:tplc="04160003" w:tentative="1">
+      <w:start w:val="1"/>
+      <w:numFmt w:val="bullet"/>
+      <w:lvlText w:val="o"/>
+      <w:lvlJc w:val="left"/>
+      <w:pPr>
+        <w:ind w:left="6465" w:hanging="360"/>
+      </w:pPr>
+      <w:rPr>
+        <w:rFonts w:ascii="Courier New" w:hAnsi="Courier New" w:cs="Courier New" w:hint="default"/>
+      </w:rPr>
+    </w:lvl>
+    <w:lvl w:ilvl="8" w:tplc="04160005" w:tentative="1">
+      <w:start w:val="1"/>
+      <w:numFmt w:val="bullet"/>
+      <w:lvlText w:val=""/>
+      <w:lvlJc w:val="left"/>
+      <w:pPr>
+        <w:ind w:left="7185" w:hanging="360"/>
+      </w:pPr>
+      <w:rPr>
+        <w:rFonts w:ascii="Wingdings" w:hAnsi="Wingdings" w:hint="default"/>
+      </w:rPr>
+    </w:lvl>
+  </w:abstractNum>
+  <w:abstractNum w:abstractNumId="3" w15:restartNumberingAfterBreak="0">
     <w:nsid w:val="3DBF1ABA"/>
     <w:multiLevelType w:val="hybridMultilevel"/>
     <w:tmpl w:val="F544D0E0"/>
@@ -1973,7 +3300,120 @@
       </w:rPr>
     </w:lvl>
   </w:abstractNum>
-  <w:abstractNum w:abstractNumId="3" w15:restartNumberingAfterBreak="0">
+  <w:abstractNum w:abstractNumId="4" w15:restartNumberingAfterBreak="0">
+    <w:nsid w:val="424174E0"/>
+    <w:multiLevelType w:val="hybridMultilevel"/>
+    <w:tmpl w:val="01EC36D0"/>
+    <w:lvl w:ilvl="0" w:tplc="04160001">
+      <w:start w:val="1"/>
+      <w:numFmt w:val="bullet"/>
+      <w:lvlText w:val=""/>
+      <w:lvlJc w:val="left"/>
+      <w:pPr>
+        <w:ind w:left="1080" w:hanging="360"/>
+      </w:pPr>
+      <w:rPr>
+        <w:rFonts w:ascii="Symbol" w:hAnsi="Symbol" w:hint="default"/>
+      </w:rPr>
+    </w:lvl>
+    <w:lvl w:ilvl="1" w:tplc="04160003" w:tentative="1">
+      <w:start w:val="1"/>
+      <w:numFmt w:val="bullet"/>
+      <w:lvlText w:val="o"/>
+      <w:lvlJc w:val="left"/>
+      <w:pPr>
+        <w:ind w:left="1800" w:hanging="360"/>
+      </w:pPr>
+      <w:rPr>
+        <w:rFonts w:ascii="Courier New" w:hAnsi="Courier New" w:cs="Courier New" w:hint="default"/>
+      </w:rPr>
+    </w:lvl>
+    <w:lvl w:ilvl="2" w:tplc="04160005" w:tentative="1">
+      <w:start w:val="1"/>
+      <w:numFmt w:val="bullet"/>
+      <w:lvlText w:val=""/>
+      <w:lvlJc w:val="left"/>
+      <w:pPr>
+        <w:ind w:left="2520" w:hanging="360"/>
+      </w:pPr>
+      <w:rPr>
+        <w:rFonts w:ascii="Wingdings" w:hAnsi="Wingdings" w:hint="default"/>
+      </w:rPr>
+    </w:lvl>
+    <w:lvl w:ilvl="3" w:tplc="04160001" w:tentative="1">
+      <w:start w:val="1"/>
+      <w:numFmt w:val="bullet"/>
+      <w:lvlText w:val=""/>
+      <w:lvlJc w:val="left"/>
+      <w:pPr>
+        <w:ind w:left="3240" w:hanging="360"/>
+      </w:pPr>
+      <w:rPr>
+        <w:rFonts w:ascii="Symbol" w:hAnsi="Symbol" w:hint="default"/>
+      </w:rPr>
+    </w:lvl>
+    <w:lvl w:ilvl="4" w:tplc="04160003" w:tentative="1">
+      <w:start w:val="1"/>
+      <w:numFmt w:val="bullet"/>
+      <w:lvlText w:val="o"/>
+      <w:lvlJc w:val="left"/>
+      <w:pPr>
+        <w:ind w:left="3960" w:hanging="360"/>
+      </w:pPr>
+      <w:rPr>
+        <w:rFonts w:ascii="Courier New" w:hAnsi="Courier New" w:cs="Courier New" w:hint="default"/>
+      </w:rPr>
+    </w:lvl>
+    <w:lvl w:ilvl="5" w:tplc="04160005" w:tentative="1">
+      <w:start w:val="1"/>
+      <w:numFmt w:val="bullet"/>
+      <w:lvlText w:val=""/>
+      <w:lvlJc w:val="left"/>
+      <w:pPr>
+        <w:ind w:left="4680" w:hanging="360"/>
+      </w:pPr>
+      <w:rPr>
+        <w:rFonts w:ascii="Wingdings" w:hAnsi="Wingdings" w:hint="default"/>
+      </w:rPr>
+    </w:lvl>
+    <w:lvl w:ilvl="6" w:tplc="04160001" w:tentative="1">
+      <w:start w:val="1"/>
+      <w:numFmt w:val="bullet"/>
+      <w:lvlText w:val=""/>
+      <w:lvlJc w:val="left"/>
+      <w:pPr>
+        <w:ind w:left="5400" w:hanging="360"/>
+      </w:pPr>
+      <w:rPr>
+        <w:rFonts w:ascii="Symbol" w:hAnsi="Symbol" w:hint="default"/>
+      </w:rPr>
+    </w:lvl>
+    <w:lvl w:ilvl="7" w:tplc="04160003" w:tentative="1">
+      <w:start w:val="1"/>
+      <w:numFmt w:val="bullet"/>
+      <w:lvlText w:val="o"/>
+      <w:lvlJc w:val="left"/>
+      <w:pPr>
+        <w:ind w:left="6120" w:hanging="360"/>
+      </w:pPr>
+      <w:rPr>
+        <w:rFonts w:ascii="Courier New" w:hAnsi="Courier New" w:cs="Courier New" w:hint="default"/>
+      </w:rPr>
+    </w:lvl>
+    <w:lvl w:ilvl="8" w:tplc="04160005" w:tentative="1">
+      <w:start w:val="1"/>
+      <w:numFmt w:val="bullet"/>
+      <w:lvlText w:val=""/>
+      <w:lvlJc w:val="left"/>
+      <w:pPr>
+        <w:ind w:left="6840" w:hanging="360"/>
+      </w:pPr>
+      <w:rPr>
+        <w:rFonts w:ascii="Wingdings" w:hAnsi="Wingdings" w:hint="default"/>
+      </w:rPr>
+    </w:lvl>
+  </w:abstractNum>
+  <w:abstractNum w:abstractNumId="5" w15:restartNumberingAfterBreak="0">
     <w:nsid w:val="4B5707C9"/>
     <w:multiLevelType w:val="hybridMultilevel"/>
     <w:tmpl w:val="A64C2126"/>
@@ -2059,7 +3499,233 @@
       </w:pPr>
     </w:lvl>
   </w:abstractNum>
-  <w:abstractNum w:abstractNumId="4" w15:restartNumberingAfterBreak="0">
+  <w:abstractNum w:abstractNumId="6" w15:restartNumberingAfterBreak="0">
+    <w:nsid w:val="4EA83C7F"/>
+    <w:multiLevelType w:val="hybridMultilevel"/>
+    <w:tmpl w:val="26C81A40"/>
+    <w:lvl w:ilvl="0" w:tplc="04160001">
+      <w:start w:val="1"/>
+      <w:numFmt w:val="bullet"/>
+      <w:lvlText w:val=""/>
+      <w:lvlJc w:val="left"/>
+      <w:pPr>
+        <w:ind w:left="720" w:hanging="360"/>
+      </w:pPr>
+      <w:rPr>
+        <w:rFonts w:ascii="Symbol" w:hAnsi="Symbol" w:hint="default"/>
+      </w:rPr>
+    </w:lvl>
+    <w:lvl w:ilvl="1" w:tplc="04160003" w:tentative="1">
+      <w:start w:val="1"/>
+      <w:numFmt w:val="bullet"/>
+      <w:lvlText w:val="o"/>
+      <w:lvlJc w:val="left"/>
+      <w:pPr>
+        <w:ind w:left="1440" w:hanging="360"/>
+      </w:pPr>
+      <w:rPr>
+        <w:rFonts w:ascii="Courier New" w:hAnsi="Courier New" w:cs="Courier New" w:hint="default"/>
+      </w:rPr>
+    </w:lvl>
+    <w:lvl w:ilvl="2" w:tplc="04160005" w:tentative="1">
+      <w:start w:val="1"/>
+      <w:numFmt w:val="bullet"/>
+      <w:lvlText w:val=""/>
+      <w:lvlJc w:val="left"/>
+      <w:pPr>
+        <w:ind w:left="2160" w:hanging="360"/>
+      </w:pPr>
+      <w:rPr>
+        <w:rFonts w:ascii="Wingdings" w:hAnsi="Wingdings" w:hint="default"/>
+      </w:rPr>
+    </w:lvl>
+    <w:lvl w:ilvl="3" w:tplc="04160001" w:tentative="1">
+      <w:start w:val="1"/>
+      <w:numFmt w:val="bullet"/>
+      <w:lvlText w:val=""/>
+      <w:lvlJc w:val="left"/>
+      <w:pPr>
+        <w:ind w:left="2880" w:hanging="360"/>
+      </w:pPr>
+      <w:rPr>
+        <w:rFonts w:ascii="Symbol" w:hAnsi="Symbol" w:hint="default"/>
+      </w:rPr>
+    </w:lvl>
+    <w:lvl w:ilvl="4" w:tplc="04160003" w:tentative="1">
+      <w:start w:val="1"/>
+      <w:numFmt w:val="bullet"/>
+      <w:lvlText w:val="o"/>
+      <w:lvlJc w:val="left"/>
+      <w:pPr>
+        <w:ind w:left="3600" w:hanging="360"/>
+      </w:pPr>
+      <w:rPr>
+        <w:rFonts w:ascii="Courier New" w:hAnsi="Courier New" w:cs="Courier New" w:hint="default"/>
+      </w:rPr>
+    </w:lvl>
+    <w:lvl w:ilvl="5" w:tplc="04160005" w:tentative="1">
+      <w:start w:val="1"/>
+      <w:numFmt w:val="bullet"/>
+      <w:lvlText w:val=""/>
+      <w:lvlJc w:val="left"/>
+      <w:pPr>
+        <w:ind w:left="4320" w:hanging="360"/>
+      </w:pPr>
+      <w:rPr>
+        <w:rFonts w:ascii="Wingdings" w:hAnsi="Wingdings" w:hint="default"/>
+      </w:rPr>
+    </w:lvl>
+    <w:lvl w:ilvl="6" w:tplc="04160001" w:tentative="1">
+      <w:start w:val="1"/>
+      <w:numFmt w:val="bullet"/>
+      <w:lvlText w:val=""/>
+      <w:lvlJc w:val="left"/>
+      <w:pPr>
+        <w:ind w:left="5040" w:hanging="360"/>
+      </w:pPr>
+      <w:rPr>
+        <w:rFonts w:ascii="Symbol" w:hAnsi="Symbol" w:hint="default"/>
+      </w:rPr>
+    </w:lvl>
+    <w:lvl w:ilvl="7" w:tplc="04160003" w:tentative="1">
+      <w:start w:val="1"/>
+      <w:numFmt w:val="bullet"/>
+      <w:lvlText w:val="o"/>
+      <w:lvlJc w:val="left"/>
+      <w:pPr>
+        <w:ind w:left="5760" w:hanging="360"/>
+      </w:pPr>
+      <w:rPr>
+        <w:rFonts w:ascii="Courier New" w:hAnsi="Courier New" w:cs="Courier New" w:hint="default"/>
+      </w:rPr>
+    </w:lvl>
+    <w:lvl w:ilvl="8" w:tplc="04160005" w:tentative="1">
+      <w:start w:val="1"/>
+      <w:numFmt w:val="bullet"/>
+      <w:lvlText w:val=""/>
+      <w:lvlJc w:val="left"/>
+      <w:pPr>
+        <w:ind w:left="6480" w:hanging="360"/>
+      </w:pPr>
+      <w:rPr>
+        <w:rFonts w:ascii="Wingdings" w:hAnsi="Wingdings" w:hint="default"/>
+      </w:rPr>
+    </w:lvl>
+  </w:abstractNum>
+  <w:abstractNum w:abstractNumId="7" w15:restartNumberingAfterBreak="0">
+    <w:nsid w:val="589A62FB"/>
+    <w:multiLevelType w:val="hybridMultilevel"/>
+    <w:tmpl w:val="E4809B6E"/>
+    <w:lvl w:ilvl="0" w:tplc="04160001">
+      <w:start w:val="1"/>
+      <w:numFmt w:val="bullet"/>
+      <w:lvlText w:val=""/>
+      <w:lvlJc w:val="left"/>
+      <w:pPr>
+        <w:ind w:left="720" w:hanging="360"/>
+      </w:pPr>
+      <w:rPr>
+        <w:rFonts w:ascii="Symbol" w:hAnsi="Symbol" w:hint="default"/>
+      </w:rPr>
+    </w:lvl>
+    <w:lvl w:ilvl="1" w:tplc="04160003" w:tentative="1">
+      <w:start w:val="1"/>
+      <w:numFmt w:val="bullet"/>
+      <w:lvlText w:val="o"/>
+      <w:lvlJc w:val="left"/>
+      <w:pPr>
+        <w:ind w:left="1440" w:hanging="360"/>
+      </w:pPr>
+      <w:rPr>
+        <w:rFonts w:ascii="Courier New" w:hAnsi="Courier New" w:cs="Courier New" w:hint="default"/>
+      </w:rPr>
+    </w:lvl>
+    <w:lvl w:ilvl="2" w:tplc="04160005" w:tentative="1">
+      <w:start w:val="1"/>
+      <w:numFmt w:val="bullet"/>
+      <w:lvlText w:val=""/>
+      <w:lvlJc w:val="left"/>
+      <w:pPr>
+        <w:ind w:left="2160" w:hanging="360"/>
+      </w:pPr>
+      <w:rPr>
+        <w:rFonts w:ascii="Wingdings" w:hAnsi="Wingdings" w:hint="default"/>
+      </w:rPr>
+    </w:lvl>
+    <w:lvl w:ilvl="3" w:tplc="04160001" w:tentative="1">
+      <w:start w:val="1"/>
+      <w:numFmt w:val="bullet"/>
+      <w:lvlText w:val=""/>
+      <w:lvlJc w:val="left"/>
+      <w:pPr>
+        <w:ind w:left="2880" w:hanging="360"/>
+      </w:pPr>
+      <w:rPr>
+        <w:rFonts w:ascii="Symbol" w:hAnsi="Symbol" w:hint="default"/>
+      </w:rPr>
+    </w:lvl>
+    <w:lvl w:ilvl="4" w:tplc="04160003" w:tentative="1">
+      <w:start w:val="1"/>
+      <w:numFmt w:val="bullet"/>
+      <w:lvlText w:val="o"/>
+      <w:lvlJc w:val="left"/>
+      <w:pPr>
+        <w:ind w:left="3600" w:hanging="360"/>
+      </w:pPr>
+      <w:rPr>
+        <w:rFonts w:ascii="Courier New" w:hAnsi="Courier New" w:cs="Courier New" w:hint="default"/>
+      </w:rPr>
+    </w:lvl>
+    <w:lvl w:ilvl="5" w:tplc="04160005" w:tentative="1">
+      <w:start w:val="1"/>
+      <w:numFmt w:val="bullet"/>
+      <w:lvlText w:val=""/>
+      <w:lvlJc w:val="left"/>
+      <w:pPr>
+        <w:ind w:left="4320" w:hanging="360"/>
+      </w:pPr>
+      <w:rPr>
+        <w:rFonts w:ascii="Wingdings" w:hAnsi="Wingdings" w:hint="default"/>
+      </w:rPr>
+    </w:lvl>
+    <w:lvl w:ilvl="6" w:tplc="04160001" w:tentative="1">
+      <w:start w:val="1"/>
+      <w:numFmt w:val="bullet"/>
+      <w:lvlText w:val=""/>
+      <w:lvlJc w:val="left"/>
+      <w:pPr>
+        <w:ind w:left="5040" w:hanging="360"/>
+      </w:pPr>
+      <w:rPr>
+        <w:rFonts w:ascii="Symbol" w:hAnsi="Symbol" w:hint="default"/>
+      </w:rPr>
+    </w:lvl>
+    <w:lvl w:ilvl="7" w:tplc="04160003" w:tentative="1">
+      <w:start w:val="1"/>
+      <w:numFmt w:val="bullet"/>
+      <w:lvlText w:val="o"/>
+      <w:lvlJc w:val="left"/>
+      <w:pPr>
+        <w:ind w:left="5760" w:hanging="360"/>
+      </w:pPr>
+      <w:rPr>
+        <w:rFonts w:ascii="Courier New" w:hAnsi="Courier New" w:cs="Courier New" w:hint="default"/>
+      </w:rPr>
+    </w:lvl>
+    <w:lvl w:ilvl="8" w:tplc="04160005" w:tentative="1">
+      <w:start w:val="1"/>
+      <w:numFmt w:val="bullet"/>
+      <w:lvlText w:val=""/>
+      <w:lvlJc w:val="left"/>
+      <w:pPr>
+        <w:ind w:left="6480" w:hanging="360"/>
+      </w:pPr>
+      <w:rPr>
+        <w:rFonts w:ascii="Wingdings" w:hAnsi="Wingdings" w:hint="default"/>
+      </w:rPr>
+    </w:lvl>
+  </w:abstractNum>
+  <w:abstractNum w:abstractNumId="8" w15:restartNumberingAfterBreak="0">
     <w:nsid w:val="5A7B769C"/>
     <w:multiLevelType w:val="hybridMultilevel"/>
     <w:tmpl w:val="4576260C"/>
@@ -2172,7 +3838,7 @@
       </w:rPr>
     </w:lvl>
   </w:abstractNum>
-  <w:abstractNum w:abstractNumId="5" w15:restartNumberingAfterBreak="0">
+  <w:abstractNum w:abstractNumId="9" w15:restartNumberingAfterBreak="0">
     <w:nsid w:val="5C0C737E"/>
     <w:multiLevelType w:val="multilevel"/>
     <w:tmpl w:val="D3DC257C"/>
@@ -2321,7 +3987,7 @@
       </w:rPr>
     </w:lvl>
   </w:abstractNum>
-  <w:abstractNum w:abstractNumId="6" w15:restartNumberingAfterBreak="0">
+  <w:abstractNum w:abstractNumId="10" w15:restartNumberingAfterBreak="0">
     <w:nsid w:val="5DFA1C62"/>
     <w:multiLevelType w:val="hybridMultilevel"/>
     <w:tmpl w:val="14345D90"/>
@@ -2434,7 +4100,7 @@
       </w:rPr>
     </w:lvl>
   </w:abstractNum>
-  <w:abstractNum w:abstractNumId="7" w15:restartNumberingAfterBreak="0">
+  <w:abstractNum w:abstractNumId="11" w15:restartNumberingAfterBreak="0">
     <w:nsid w:val="632256CD"/>
     <w:multiLevelType w:val="hybridMultilevel"/>
     <w:tmpl w:val="A11E6AB2"/>
@@ -2547,7 +4213,7 @@
       </w:rPr>
     </w:lvl>
   </w:abstractNum>
-  <w:abstractNum w:abstractNumId="8" w15:restartNumberingAfterBreak="0">
+  <w:abstractNum w:abstractNumId="12" w15:restartNumberingAfterBreak="0">
     <w:nsid w:val="67FF678E"/>
     <w:multiLevelType w:val="hybridMultilevel"/>
     <w:tmpl w:val="E7FC5CAC"/>
@@ -2660,32 +4326,196 @@
       </w:rPr>
     </w:lvl>
   </w:abstractNum>
+  <w:abstractNum w:abstractNumId="13" w15:restartNumberingAfterBreak="0">
+    <w:nsid w:val="721973AF"/>
+    <w:multiLevelType w:val="multilevel"/>
+    <w:tmpl w:val="945C34E0"/>
+    <w:lvl w:ilvl="0">
+      <w:start w:val="1"/>
+      <w:numFmt w:val="bullet"/>
+      <w:lvlText w:val=""/>
+      <w:lvlJc w:val="left"/>
+      <w:pPr>
+        <w:tabs>
+          <w:tab w:val="num" w:pos="720"/>
+        </w:tabs>
+        <w:ind w:left="720" w:hanging="360"/>
+      </w:pPr>
+      <w:rPr>
+        <w:rFonts w:ascii="Symbol" w:hAnsi="Symbol" w:hint="default"/>
+        <w:sz w:val="20"/>
+      </w:rPr>
+    </w:lvl>
+    <w:lvl w:ilvl="1">
+      <w:start w:val="1"/>
+      <w:numFmt w:val="bullet"/>
+      <w:lvlText w:val="o"/>
+      <w:lvlJc w:val="left"/>
+      <w:pPr>
+        <w:tabs>
+          <w:tab w:val="num" w:pos="1440"/>
+        </w:tabs>
+        <w:ind w:left="1440" w:hanging="360"/>
+      </w:pPr>
+      <w:rPr>
+        <w:rFonts w:ascii="Courier New" w:hAnsi="Courier New" w:hint="default"/>
+        <w:sz w:val="20"/>
+      </w:rPr>
+    </w:lvl>
+    <w:lvl w:ilvl="2" w:tentative="1">
+      <w:start w:val="1"/>
+      <w:numFmt w:val="bullet"/>
+      <w:lvlText w:val=""/>
+      <w:lvlJc w:val="left"/>
+      <w:pPr>
+        <w:tabs>
+          <w:tab w:val="num" w:pos="2160"/>
+        </w:tabs>
+        <w:ind w:left="2160" w:hanging="360"/>
+      </w:pPr>
+      <w:rPr>
+        <w:rFonts w:ascii="Wingdings" w:hAnsi="Wingdings" w:hint="default"/>
+        <w:sz w:val="20"/>
+      </w:rPr>
+    </w:lvl>
+    <w:lvl w:ilvl="3" w:tentative="1">
+      <w:start w:val="1"/>
+      <w:numFmt w:val="bullet"/>
+      <w:lvlText w:val=""/>
+      <w:lvlJc w:val="left"/>
+      <w:pPr>
+        <w:tabs>
+          <w:tab w:val="num" w:pos="2880"/>
+        </w:tabs>
+        <w:ind w:left="2880" w:hanging="360"/>
+      </w:pPr>
+      <w:rPr>
+        <w:rFonts w:ascii="Wingdings" w:hAnsi="Wingdings" w:hint="default"/>
+        <w:sz w:val="20"/>
+      </w:rPr>
+    </w:lvl>
+    <w:lvl w:ilvl="4" w:tentative="1">
+      <w:start w:val="1"/>
+      <w:numFmt w:val="bullet"/>
+      <w:lvlText w:val=""/>
+      <w:lvlJc w:val="left"/>
+      <w:pPr>
+        <w:tabs>
+          <w:tab w:val="num" w:pos="3600"/>
+        </w:tabs>
+        <w:ind w:left="3600" w:hanging="360"/>
+      </w:pPr>
+      <w:rPr>
+        <w:rFonts w:ascii="Wingdings" w:hAnsi="Wingdings" w:hint="default"/>
+        <w:sz w:val="20"/>
+      </w:rPr>
+    </w:lvl>
+    <w:lvl w:ilvl="5" w:tentative="1">
+      <w:start w:val="1"/>
+      <w:numFmt w:val="bullet"/>
+      <w:lvlText w:val=""/>
+      <w:lvlJc w:val="left"/>
+      <w:pPr>
+        <w:tabs>
+          <w:tab w:val="num" w:pos="4320"/>
+        </w:tabs>
+        <w:ind w:left="4320" w:hanging="360"/>
+      </w:pPr>
+      <w:rPr>
+        <w:rFonts w:ascii="Wingdings" w:hAnsi="Wingdings" w:hint="default"/>
+        <w:sz w:val="20"/>
+      </w:rPr>
+    </w:lvl>
+    <w:lvl w:ilvl="6" w:tentative="1">
+      <w:start w:val="1"/>
+      <w:numFmt w:val="bullet"/>
+      <w:lvlText w:val=""/>
+      <w:lvlJc w:val="left"/>
+      <w:pPr>
+        <w:tabs>
+          <w:tab w:val="num" w:pos="5040"/>
+        </w:tabs>
+        <w:ind w:left="5040" w:hanging="360"/>
+      </w:pPr>
+      <w:rPr>
+        <w:rFonts w:ascii="Wingdings" w:hAnsi="Wingdings" w:hint="default"/>
+        <w:sz w:val="20"/>
+      </w:rPr>
+    </w:lvl>
+    <w:lvl w:ilvl="7" w:tentative="1">
+      <w:start w:val="1"/>
+      <w:numFmt w:val="bullet"/>
+      <w:lvlText w:val=""/>
+      <w:lvlJc w:val="left"/>
+      <w:pPr>
+        <w:tabs>
+          <w:tab w:val="num" w:pos="5760"/>
+        </w:tabs>
+        <w:ind w:left="5760" w:hanging="360"/>
+      </w:pPr>
+      <w:rPr>
+        <w:rFonts w:ascii="Wingdings" w:hAnsi="Wingdings" w:hint="default"/>
+        <w:sz w:val="20"/>
+      </w:rPr>
+    </w:lvl>
+    <w:lvl w:ilvl="8" w:tentative="1">
+      <w:start w:val="1"/>
+      <w:numFmt w:val="bullet"/>
+      <w:lvlText w:val=""/>
+      <w:lvlJc w:val="left"/>
+      <w:pPr>
+        <w:tabs>
+          <w:tab w:val="num" w:pos="6480"/>
+        </w:tabs>
+        <w:ind w:left="6480" w:hanging="360"/>
+      </w:pPr>
+      <w:rPr>
+        <w:rFonts w:ascii="Wingdings" w:hAnsi="Wingdings" w:hint="default"/>
+        <w:sz w:val="20"/>
+      </w:rPr>
+    </w:lvl>
+  </w:abstractNum>
   <w:num w:numId="1" w16cid:durableId="1845120210">
-    <w:abstractNumId w:val="7"/>
+    <w:abstractNumId w:val="11"/>
   </w:num>
   <w:num w:numId="2" w16cid:durableId="1208224393">
-    <w:abstractNumId w:val="5"/>
+    <w:abstractNumId w:val="9"/>
   </w:num>
   <w:num w:numId="3" w16cid:durableId="1522545533">
     <w:abstractNumId w:val="0"/>
   </w:num>
   <w:num w:numId="4" w16cid:durableId="1300649518">
-    <w:abstractNumId w:val="6"/>
+    <w:abstractNumId w:val="10"/>
   </w:num>
   <w:num w:numId="5" w16cid:durableId="1394237260">
-    <w:abstractNumId w:val="2"/>
+    <w:abstractNumId w:val="3"/>
   </w:num>
   <w:num w:numId="6" w16cid:durableId="1944221231">
-    <w:abstractNumId w:val="3"/>
+    <w:abstractNumId w:val="5"/>
   </w:num>
   <w:num w:numId="7" w16cid:durableId="1984657101">
-    <w:abstractNumId w:val="4"/>
+    <w:abstractNumId w:val="8"/>
   </w:num>
   <w:num w:numId="8" w16cid:durableId="1326395759">
     <w:abstractNumId w:val="1"/>
   </w:num>
   <w:num w:numId="9" w16cid:durableId="818304017">
-    <w:abstractNumId w:val="8"/>
+    <w:abstractNumId w:val="12"/>
+  </w:num>
+  <w:num w:numId="10" w16cid:durableId="1857383228">
+    <w:abstractNumId w:val="13"/>
+  </w:num>
+  <w:num w:numId="11" w16cid:durableId="1779400553">
+    <w:abstractNumId w:val="2"/>
+  </w:num>
+  <w:num w:numId="12" w16cid:durableId="794250166">
+    <w:abstractNumId w:val="7"/>
+  </w:num>
+  <w:num w:numId="13" w16cid:durableId="1275475085">
+    <w:abstractNumId w:val="4"/>
+  </w:num>
+  <w:num w:numId="14" w16cid:durableId="814641638">
+    <w:abstractNumId w:val="6"/>
   </w:num>
 </w:numbering>
 </file>

</xml_diff>

<commit_message>
Inclusão do dia 18/05
</commit_message>
<xml_diff>
--- a/Pauta Claude.docx
+++ b/Pauta Claude.docx
@@ -3210,6 +3210,226 @@
         </w:rPr>
       </w:pPr>
     </w:p>
+    <w:p>
+      <w:pPr>
+        <w:ind w:left="708"/>
+        <w:rPr>
+          <w:rFonts w:ascii="Segoe UI Emoji" w:hAnsi="Segoe UI Emoji" w:cs="Segoe UI Emoji"/>
+        </w:rPr>
+      </w:pPr>
+    </w:p>
+    <w:p>
+      <w:pPr>
+        <w:ind w:left="2484" w:firstLine="348"/>
+        <w:rPr>
+          <w:rFonts w:ascii="Segoe UI Emoji" w:hAnsi="Segoe UI Emoji" w:cs="Segoe UI Emoji"/>
+          <w:b/>
+          <w:bCs/>
+        </w:rPr>
+      </w:pPr>
+      <w:r>
+        <w:rPr>
+          <w:rFonts w:ascii="Segoe UI Emoji" w:hAnsi="Segoe UI Emoji" w:cs="Segoe UI Emoji"/>
+          <w:b/>
+          <w:bCs/>
+        </w:rPr>
+        <w:t>Pauta Claude – 18/05</w:t>
+      </w:r>
+    </w:p>
+    <w:p>
+      <w:pPr>
+        <w:pStyle w:val="PargrafodaLista"/>
+        <w:numPr>
+          <w:ilvl w:val="0"/>
+          <w:numId w:val="16"/>
+        </w:numPr>
+        <w:rPr>
+          <w:rFonts w:ascii="Segoe UI Emoji" w:hAnsi="Segoe UI Emoji" w:cs="Segoe UI Emoji"/>
+          <w:b/>
+          <w:bCs/>
+        </w:rPr>
+      </w:pPr>
+      <w:r>
+        <w:rPr>
+          <w:rFonts w:ascii="Segoe UI Emoji" w:hAnsi="Segoe UI Emoji" w:cs="Segoe UI Emoji"/>
+        </w:rPr>
+        <w:t xml:space="preserve">Será necessário criar funil de vendas também para os SDRs </w:t>
+      </w:r>
+      <w:r>
+        <w:rPr>
+          <w:rFonts w:ascii="Segoe UI Emoji" w:hAnsi="Segoe UI Emoji" w:cs="Segoe UI Emoji"/>
+        </w:rPr>
+        <w:t>⌛</w:t>
+      </w:r>
+    </w:p>
+    <w:p>
+      <w:pPr>
+        <w:pStyle w:val="PargrafodaLista"/>
+        <w:numPr>
+          <w:ilvl w:val="0"/>
+          <w:numId w:val="16"/>
+        </w:numPr>
+        <w:rPr>
+          <w:rFonts w:ascii="Segoe UI Emoji" w:hAnsi="Segoe UI Emoji" w:cs="Segoe UI Emoji"/>
+          <w:b/>
+          <w:bCs/>
+        </w:rPr>
+      </w:pPr>
+      <w:r>
+        <w:rPr>
+          <w:rFonts w:ascii="Segoe UI Emoji" w:hAnsi="Segoe UI Emoji" w:cs="Segoe UI Emoji"/>
+        </w:rPr>
+        <w:t>Testar e atualizar o novo formulário da Rayanna, para verificar integração com o Painel do Corretor.</w:t>
+      </w:r>
+      <w:r>
+        <w:rPr>
+          <w:rFonts w:ascii="Segoe UI Emoji" w:hAnsi="Segoe UI Emoji" w:cs="Segoe UI Emoji"/>
+        </w:rPr>
+        <w:t xml:space="preserve"> </w:t>
+      </w:r>
+      <w:r>
+        <w:rPr>
+          <w:rFonts w:ascii="Segoe UI Emoji" w:hAnsi="Segoe UI Emoji" w:cs="Segoe UI Emoji"/>
+        </w:rPr>
+        <w:t>⌛</w:t>
+      </w:r>
+    </w:p>
+    <w:p>
+      <w:pPr>
+        <w:pStyle w:val="PargrafodaLista"/>
+        <w:numPr>
+          <w:ilvl w:val="0"/>
+          <w:numId w:val="16"/>
+        </w:numPr>
+        <w:rPr>
+          <w:rFonts w:ascii="Segoe UI Emoji" w:hAnsi="Segoe UI Emoji" w:cs="Segoe UI Emoji"/>
+          <w:b/>
+          <w:bCs/>
+        </w:rPr>
+      </w:pPr>
+      <w:r>
+        <w:rPr>
+          <w:rFonts w:ascii="Segoe UI Emoji" w:hAnsi="Segoe UI Emoji" w:cs="Segoe UI Emoji"/>
+        </w:rPr>
+        <w:t xml:space="preserve">Atualização cards “Equipe Comercial” via design e percepção interna </w:t>
+      </w:r>
+      <w:r>
+        <w:rPr>
+          <w:rFonts w:ascii="Segoe UI Emoji" w:hAnsi="Segoe UI Emoji" w:cs="Segoe UI Emoji"/>
+        </w:rPr>
+        <w:t>✅</w:t>
+      </w:r>
+    </w:p>
+    <w:p>
+      <w:pPr>
+        <w:pStyle w:val="PargrafodaLista"/>
+        <w:numPr>
+          <w:ilvl w:val="0"/>
+          <w:numId w:val="16"/>
+        </w:numPr>
+        <w:rPr>
+          <w:rFonts w:ascii="Segoe UI Emoji" w:hAnsi="Segoe UI Emoji" w:cs="Segoe UI Emoji"/>
+          <w:b/>
+          <w:bCs/>
+        </w:rPr>
+      </w:pPr>
+      <w:r>
+        <w:rPr>
+          <w:rFonts w:ascii="Segoe UI Emoji" w:hAnsi="Segoe UI Emoji" w:cs="Segoe UI Emoji"/>
+        </w:rPr>
+        <w:t xml:space="preserve">Criação de “Estágio do lead” </w:t>
+      </w:r>
+      <w:r>
+        <w:rPr>
+          <w:rFonts w:ascii="Segoe UI Emoji" w:hAnsi="Segoe UI Emoji" w:cs="Segoe UI Emoji"/>
+        </w:rPr>
+        <w:t>✅</w:t>
+      </w:r>
+    </w:p>
+    <w:p>
+      <w:pPr>
+        <w:pStyle w:val="PargrafodaLista"/>
+        <w:numPr>
+          <w:ilvl w:val="0"/>
+          <w:numId w:val="16"/>
+        </w:numPr>
+        <w:rPr>
+          <w:rFonts w:ascii="Segoe UI Emoji" w:hAnsi="Segoe UI Emoji" w:cs="Segoe UI Emoji"/>
+          <w:b/>
+          <w:bCs/>
+        </w:rPr>
+      </w:pPr>
+      <w:r>
+        <w:rPr>
+          <w:rFonts w:ascii="Segoe UI Emoji" w:hAnsi="Segoe UI Emoji" w:cs="Segoe UI Emoji"/>
+        </w:rPr>
+        <w:t xml:space="preserve">Aprimorar CRM </w:t>
+      </w:r>
+      <w:r>
+        <w:rPr>
+          <w:rFonts w:ascii="Segoe UI Emoji" w:hAnsi="Segoe UI Emoji" w:cs="Segoe UI Emoji"/>
+        </w:rPr>
+        <w:t>✅</w:t>
+      </w:r>
+    </w:p>
+    <w:p>
+      <w:pPr>
+        <w:pStyle w:val="PargrafodaLista"/>
+        <w:numPr>
+          <w:ilvl w:val="0"/>
+          <w:numId w:val="16"/>
+        </w:numPr>
+        <w:rPr>
+          <w:rFonts w:ascii="Segoe UI Emoji" w:hAnsi="Segoe UI Emoji" w:cs="Segoe UI Emoji"/>
+          <w:b/>
+          <w:bCs/>
+        </w:rPr>
+      </w:pPr>
+      <w:r>
+        <w:rPr>
+          <w:rFonts w:ascii="Segoe UI Emoji" w:hAnsi="Segoe UI Emoji" w:cs="Segoe UI Emoji"/>
+        </w:rPr>
+        <w:t xml:space="preserve">Aprimorar “Estágio do lead” via design e KPIs </w:t>
+      </w:r>
+      <w:r>
+        <w:rPr>
+          <w:rFonts w:ascii="Segoe UI Emoji" w:hAnsi="Segoe UI Emoji" w:cs="Segoe UI Emoji"/>
+        </w:rPr>
+        <w:t>✅</w:t>
+      </w:r>
+    </w:p>
+    <w:p>
+      <w:pPr>
+        <w:pStyle w:val="PargrafodaLista"/>
+        <w:numPr>
+          <w:ilvl w:val="0"/>
+          <w:numId w:val="16"/>
+        </w:numPr>
+        <w:rPr>
+          <w:rFonts w:ascii="Segoe UI Emoji" w:hAnsi="Segoe UI Emoji" w:cs="Segoe UI Emoji"/>
+          <w:b/>
+          <w:bCs/>
+        </w:rPr>
+      </w:pPr>
+      <w:r>
+        <w:rPr>
+          <w:rFonts w:ascii="Segoe UI Emoji" w:hAnsi="Segoe UI Emoji" w:cs="Segoe UI Emoji"/>
+        </w:rPr>
+        <w:t xml:space="preserve">“Detalhamento por dia” precisa ter </w:t>
+      </w:r>
+      <w:r>
+        <w:rPr>
+          <w:rFonts w:ascii="Segoe UI Emoji" w:hAnsi="Segoe UI Emoji" w:cs="Segoe UI Emoji"/>
+        </w:rPr>
+        <w:t xml:space="preserve">a tabela de clientes logo abaixo do card dos operadores </w:t>
+      </w:r>
+      <w:r>
+        <w:rPr>
+          <w:rFonts w:ascii="Segoe UI Emoji" w:hAnsi="Segoe UI Emoji" w:cs="Segoe UI Emoji"/>
+        </w:rPr>
+        <w:t>⌛</w:t>
+      </w:r>
+    </w:p>
     <w:sectPr>
       <w:pgSz w:w="11906" w:h="16838"/>
       <w:pgMar w:top="1417" w:right="1701" w:bottom="1417" w:left="1701" w:header="708" w:footer="708" w:gutter="0"/>
@@ -3937,6 +4157,119 @@
     </w:lvl>
   </w:abstractNum>
   <w:abstractNum w:abstractNumId="6" w15:restartNumberingAfterBreak="0">
+    <w:nsid w:val="4A3E655E"/>
+    <w:multiLevelType w:val="hybridMultilevel"/>
+    <w:tmpl w:val="337C7E12"/>
+    <w:lvl w:ilvl="0" w:tplc="04160001">
+      <w:start w:val="1"/>
+      <w:numFmt w:val="bullet"/>
+      <w:lvlText w:val=""/>
+      <w:lvlJc w:val="left"/>
+      <w:pPr>
+        <w:ind w:left="720" w:hanging="360"/>
+      </w:pPr>
+      <w:rPr>
+        <w:rFonts w:ascii="Symbol" w:hAnsi="Symbol" w:hint="default"/>
+      </w:rPr>
+    </w:lvl>
+    <w:lvl w:ilvl="1" w:tplc="04160003" w:tentative="1">
+      <w:start w:val="1"/>
+      <w:numFmt w:val="bullet"/>
+      <w:lvlText w:val="o"/>
+      <w:lvlJc w:val="left"/>
+      <w:pPr>
+        <w:ind w:left="1440" w:hanging="360"/>
+      </w:pPr>
+      <w:rPr>
+        <w:rFonts w:ascii="Courier New" w:hAnsi="Courier New" w:cs="Courier New" w:hint="default"/>
+      </w:rPr>
+    </w:lvl>
+    <w:lvl w:ilvl="2" w:tplc="04160005" w:tentative="1">
+      <w:start w:val="1"/>
+      <w:numFmt w:val="bullet"/>
+      <w:lvlText w:val=""/>
+      <w:lvlJc w:val="left"/>
+      <w:pPr>
+        <w:ind w:left="2160" w:hanging="360"/>
+      </w:pPr>
+      <w:rPr>
+        <w:rFonts w:ascii="Wingdings" w:hAnsi="Wingdings" w:hint="default"/>
+      </w:rPr>
+    </w:lvl>
+    <w:lvl w:ilvl="3" w:tplc="04160001" w:tentative="1">
+      <w:start w:val="1"/>
+      <w:numFmt w:val="bullet"/>
+      <w:lvlText w:val=""/>
+      <w:lvlJc w:val="left"/>
+      <w:pPr>
+        <w:ind w:left="2880" w:hanging="360"/>
+      </w:pPr>
+      <w:rPr>
+        <w:rFonts w:ascii="Symbol" w:hAnsi="Symbol" w:hint="default"/>
+      </w:rPr>
+    </w:lvl>
+    <w:lvl w:ilvl="4" w:tplc="04160003" w:tentative="1">
+      <w:start w:val="1"/>
+      <w:numFmt w:val="bullet"/>
+      <w:lvlText w:val="o"/>
+      <w:lvlJc w:val="left"/>
+      <w:pPr>
+        <w:ind w:left="3600" w:hanging="360"/>
+      </w:pPr>
+      <w:rPr>
+        <w:rFonts w:ascii="Courier New" w:hAnsi="Courier New" w:cs="Courier New" w:hint="default"/>
+      </w:rPr>
+    </w:lvl>
+    <w:lvl w:ilvl="5" w:tplc="04160005" w:tentative="1">
+      <w:start w:val="1"/>
+      <w:numFmt w:val="bullet"/>
+      <w:lvlText w:val=""/>
+      <w:lvlJc w:val="left"/>
+      <w:pPr>
+        <w:ind w:left="4320" w:hanging="360"/>
+      </w:pPr>
+      <w:rPr>
+        <w:rFonts w:ascii="Wingdings" w:hAnsi="Wingdings" w:hint="default"/>
+      </w:rPr>
+    </w:lvl>
+    <w:lvl w:ilvl="6" w:tplc="04160001" w:tentative="1">
+      <w:start w:val="1"/>
+      <w:numFmt w:val="bullet"/>
+      <w:lvlText w:val=""/>
+      <w:lvlJc w:val="left"/>
+      <w:pPr>
+        <w:ind w:left="5040" w:hanging="360"/>
+      </w:pPr>
+      <w:rPr>
+        <w:rFonts w:ascii="Symbol" w:hAnsi="Symbol" w:hint="default"/>
+      </w:rPr>
+    </w:lvl>
+    <w:lvl w:ilvl="7" w:tplc="04160003" w:tentative="1">
+      <w:start w:val="1"/>
+      <w:numFmt w:val="bullet"/>
+      <w:lvlText w:val="o"/>
+      <w:lvlJc w:val="left"/>
+      <w:pPr>
+        <w:ind w:left="5760" w:hanging="360"/>
+      </w:pPr>
+      <w:rPr>
+        <w:rFonts w:ascii="Courier New" w:hAnsi="Courier New" w:cs="Courier New" w:hint="default"/>
+      </w:rPr>
+    </w:lvl>
+    <w:lvl w:ilvl="8" w:tplc="04160005" w:tentative="1">
+      <w:start w:val="1"/>
+      <w:numFmt w:val="bullet"/>
+      <w:lvlText w:val=""/>
+      <w:lvlJc w:val="left"/>
+      <w:pPr>
+        <w:ind w:left="6480" w:hanging="360"/>
+      </w:pPr>
+      <w:rPr>
+        <w:rFonts w:ascii="Wingdings" w:hAnsi="Wingdings" w:hint="default"/>
+      </w:rPr>
+    </w:lvl>
+  </w:abstractNum>
+  <w:abstractNum w:abstractNumId="7" w15:restartNumberingAfterBreak="0">
     <w:nsid w:val="4B5707C9"/>
     <w:multiLevelType w:val="hybridMultilevel"/>
     <w:tmpl w:val="A64C2126"/>
@@ -4022,7 +4355,7 @@
       </w:pPr>
     </w:lvl>
   </w:abstractNum>
-  <w:abstractNum w:abstractNumId="7" w15:restartNumberingAfterBreak="0">
+  <w:abstractNum w:abstractNumId="8" w15:restartNumberingAfterBreak="0">
     <w:nsid w:val="4EA83C7F"/>
     <w:multiLevelType w:val="hybridMultilevel"/>
     <w:tmpl w:val="26C81A40"/>
@@ -4135,7 +4468,7 @@
       </w:rPr>
     </w:lvl>
   </w:abstractNum>
-  <w:abstractNum w:abstractNumId="8" w15:restartNumberingAfterBreak="0">
+  <w:abstractNum w:abstractNumId="9" w15:restartNumberingAfterBreak="0">
     <w:nsid w:val="589A62FB"/>
     <w:multiLevelType w:val="hybridMultilevel"/>
     <w:tmpl w:val="E4809B6E"/>
@@ -4248,7 +4581,7 @@
       </w:rPr>
     </w:lvl>
   </w:abstractNum>
-  <w:abstractNum w:abstractNumId="9" w15:restartNumberingAfterBreak="0">
+  <w:abstractNum w:abstractNumId="10" w15:restartNumberingAfterBreak="0">
     <w:nsid w:val="5A7B769C"/>
     <w:multiLevelType w:val="hybridMultilevel"/>
     <w:tmpl w:val="4576260C"/>
@@ -4361,7 +4694,7 @@
       </w:rPr>
     </w:lvl>
   </w:abstractNum>
-  <w:abstractNum w:abstractNumId="10" w15:restartNumberingAfterBreak="0">
+  <w:abstractNum w:abstractNumId="11" w15:restartNumberingAfterBreak="0">
     <w:nsid w:val="5C0C737E"/>
     <w:multiLevelType w:val="multilevel"/>
     <w:tmpl w:val="D3DC257C"/>
@@ -4510,7 +4843,7 @@
       </w:rPr>
     </w:lvl>
   </w:abstractNum>
-  <w:abstractNum w:abstractNumId="11" w15:restartNumberingAfterBreak="0">
+  <w:abstractNum w:abstractNumId="12" w15:restartNumberingAfterBreak="0">
     <w:nsid w:val="5DFA1C62"/>
     <w:multiLevelType w:val="hybridMultilevel"/>
     <w:tmpl w:val="14345D90"/>
@@ -4623,7 +4956,7 @@
       </w:rPr>
     </w:lvl>
   </w:abstractNum>
-  <w:abstractNum w:abstractNumId="12" w15:restartNumberingAfterBreak="0">
+  <w:abstractNum w:abstractNumId="13" w15:restartNumberingAfterBreak="0">
     <w:nsid w:val="632256CD"/>
     <w:multiLevelType w:val="hybridMultilevel"/>
     <w:tmpl w:val="A11E6AB2"/>
@@ -4736,7 +5069,7 @@
       </w:rPr>
     </w:lvl>
   </w:abstractNum>
-  <w:abstractNum w:abstractNumId="13" w15:restartNumberingAfterBreak="0">
+  <w:abstractNum w:abstractNumId="14" w15:restartNumberingAfterBreak="0">
     <w:nsid w:val="67FF678E"/>
     <w:multiLevelType w:val="hybridMultilevel"/>
     <w:tmpl w:val="E7FC5CAC"/>
@@ -4849,7 +5182,7 @@
       </w:rPr>
     </w:lvl>
   </w:abstractNum>
-  <w:abstractNum w:abstractNumId="14" w15:restartNumberingAfterBreak="0">
+  <w:abstractNum w:abstractNumId="15" w15:restartNumberingAfterBreak="0">
     <w:nsid w:val="721973AF"/>
     <w:multiLevelType w:val="multilevel"/>
     <w:tmpl w:val="945C34E0"/>
@@ -4999,49 +5332,52 @@
     </w:lvl>
   </w:abstractNum>
   <w:num w:numId="1" w16cid:durableId="1845120210">
-    <w:abstractNumId w:val="12"/>
+    <w:abstractNumId w:val="13"/>
   </w:num>
   <w:num w:numId="2" w16cid:durableId="1208224393">
-    <w:abstractNumId w:val="10"/>
+    <w:abstractNumId w:val="11"/>
   </w:num>
   <w:num w:numId="3" w16cid:durableId="1522545533">
     <w:abstractNumId w:val="0"/>
   </w:num>
   <w:num w:numId="4" w16cid:durableId="1300649518">
-    <w:abstractNumId w:val="11"/>
+    <w:abstractNumId w:val="12"/>
   </w:num>
   <w:num w:numId="5" w16cid:durableId="1394237260">
     <w:abstractNumId w:val="4"/>
   </w:num>
   <w:num w:numId="6" w16cid:durableId="1944221231">
-    <w:abstractNumId w:val="6"/>
+    <w:abstractNumId w:val="7"/>
   </w:num>
   <w:num w:numId="7" w16cid:durableId="1984657101">
-    <w:abstractNumId w:val="9"/>
+    <w:abstractNumId w:val="10"/>
   </w:num>
   <w:num w:numId="8" w16cid:durableId="1326395759">
     <w:abstractNumId w:val="2"/>
   </w:num>
   <w:num w:numId="9" w16cid:durableId="818304017">
-    <w:abstractNumId w:val="13"/>
+    <w:abstractNumId w:val="14"/>
   </w:num>
   <w:num w:numId="10" w16cid:durableId="1857383228">
-    <w:abstractNumId w:val="14"/>
+    <w:abstractNumId w:val="15"/>
   </w:num>
   <w:num w:numId="11" w16cid:durableId="1779400553">
     <w:abstractNumId w:val="3"/>
   </w:num>
   <w:num w:numId="12" w16cid:durableId="794250166">
-    <w:abstractNumId w:val="8"/>
+    <w:abstractNumId w:val="9"/>
   </w:num>
   <w:num w:numId="13" w16cid:durableId="1275475085">
     <w:abstractNumId w:val="5"/>
   </w:num>
   <w:num w:numId="14" w16cid:durableId="814641638">
-    <w:abstractNumId w:val="7"/>
+    <w:abstractNumId w:val="8"/>
   </w:num>
   <w:num w:numId="15" w16cid:durableId="1554468009">
     <w:abstractNumId w:val="1"/>
+  </w:num>
+  <w:num w:numId="16" w16cid:durableId="2002736655">
+    <w:abstractNumId w:val="6"/>
   </w:num>
 </w:numbering>
 </file>
@@ -5650,6 +5986,7 @@
   <w:style w:type="character" w:default="1" w:styleId="Fontepargpadro">
     <w:name w:val="Default Paragraph Font"/>
     <w:uiPriority w:val="1"/>
+    <w:semiHidden/>
     <w:unhideWhenUsed/>
   </w:style>
   <w:style w:type="table" w:default="1" w:styleId="Tabelanormal">

</xml_diff>

<commit_message>
Adiciona auto-refresh por detecção de pkl e atualiza dependências
- _watcher_pkl: fragment que verifica mtime dos pkl a cada 30s e recarrega o dashboard automaticamente quando o updater.py salva novos dados
- requirements.txt: streamlit>=1.37.0 (necessário para st.fragment run_every)
- Remove dashboard_tv_teste.py

Co-Authored-By: Claude Sonnet 4.6 <noreply@anthropic.com>
</commit_message>
<xml_diff>
--- a/Pauta Claude.docx
+++ b/Pauta Claude.docx
@@ -3259,7 +3259,7 @@
         <w:rPr>
           <w:rFonts w:ascii="Segoe UI Emoji" w:hAnsi="Segoe UI Emoji" w:cs="Segoe UI Emoji"/>
         </w:rPr>
-        <w:t>⌛</w:t>
+        <w:t>✅</w:t>
       </w:r>
     </w:p>
     <w:p>
@@ -3427,9 +3427,822 @@
         <w:rPr>
           <w:rFonts w:ascii="Segoe UI Emoji" w:hAnsi="Segoe UI Emoji" w:cs="Segoe UI Emoji"/>
         </w:rPr>
+        <w:t>✅</w:t>
+      </w:r>
+    </w:p>
+    <w:p>
+      <w:pPr>
+        <w:rPr>
+          <w:rFonts w:ascii="Segoe UI Emoji" w:hAnsi="Segoe UI Emoji" w:cs="Segoe UI Emoji"/>
+          <w:b/>
+          <w:bCs/>
+        </w:rPr>
+      </w:pPr>
+    </w:p>
+    <w:p>
+      <w:pPr>
+        <w:rPr>
+          <w:rFonts w:ascii="Segoe UI Emoji" w:hAnsi="Segoe UI Emoji" w:cs="Segoe UI Emoji"/>
+          <w:b/>
+          <w:bCs/>
+        </w:rPr>
+      </w:pPr>
+    </w:p>
+    <w:p>
+      <w:pPr>
+        <w:ind w:left="3192"/>
+        <w:rPr>
+          <w:rFonts w:ascii="Segoe UI Emoji" w:hAnsi="Segoe UI Emoji" w:cs="Segoe UI Emoji"/>
+          <w:b/>
+          <w:bCs/>
+        </w:rPr>
+      </w:pPr>
+      <w:r>
+        <w:rPr>
+          <w:rFonts w:ascii="Segoe UI Emoji" w:hAnsi="Segoe UI Emoji" w:cs="Segoe UI Emoji"/>
+          <w:b/>
+          <w:bCs/>
+        </w:rPr>
+        <w:lastRenderedPageBreak/>
+        <w:t xml:space="preserve">Pauta Claude – </w:t>
+      </w:r>
+      <w:r>
+        <w:rPr>
+          <w:rFonts w:ascii="Segoe UI Emoji" w:hAnsi="Segoe UI Emoji" w:cs="Segoe UI Emoji"/>
+          <w:b/>
+          <w:bCs/>
+        </w:rPr>
+        <w:t>20</w:t>
+      </w:r>
+      <w:r>
+        <w:rPr>
+          <w:rFonts w:ascii="Segoe UI Emoji" w:hAnsi="Segoe UI Emoji" w:cs="Segoe UI Emoji"/>
+          <w:b/>
+          <w:bCs/>
+        </w:rPr>
+        <w:t>/05</w:t>
+      </w:r>
+    </w:p>
+    <w:p>
+      <w:pPr>
+        <w:rPr>
+          <w:rFonts w:ascii="Segoe UI Emoji" w:hAnsi="Segoe UI Emoji" w:cs="Segoe UI Emoji"/>
+          <w:b/>
+          <w:bCs/>
+        </w:rPr>
+      </w:pPr>
+    </w:p>
+    <w:p>
+      <w:pPr>
+        <w:rPr>
+          <w:rFonts w:ascii="Segoe UI Emoji" w:hAnsi="Segoe UI Emoji" w:cs="Segoe UI Emoji"/>
+          <w:b/>
+          <w:bCs/>
+        </w:rPr>
+      </w:pPr>
+      <w:r>
+        <w:rPr>
+          <w:rFonts w:ascii="Segoe UI Emoji" w:hAnsi="Segoe UI Emoji" w:cs="Segoe UI Emoji"/>
+        </w:rPr>
+        <w:t>Primeira skill realizada para o dashboard de ligações ✅</w:t>
+      </w:r>
+    </w:p>
+    <w:p>
+      <w:pPr>
+        <w:rPr>
+          <w:rFonts w:ascii="Segoe UI Emoji" w:hAnsi="Segoe UI Emoji" w:cs="Segoe UI Emoji"/>
+          <w:b/>
+          <w:bCs/>
+        </w:rPr>
+      </w:pPr>
+      <w:r>
+        <w:rPr>
+          <w:rFonts w:ascii="Segoe UI Emoji" w:hAnsi="Segoe UI Emoji" w:cs="Segoe UI Emoji"/>
+        </w:rPr>
+        <w:t>Formulário leads fazer com que a caixa de input da base seja menu suspenso em que eu adicione a cada manhã as bases que serão operadas para que o SDR clique apenas, e assim seja lançada para o Followize e contabilize no Dashboard. ✅</w:t>
+      </w:r>
+    </w:p>
+    <w:p>
+      <w:pPr>
+        <w:rPr>
+          <w:rFonts w:ascii="Segoe UI Emoji" w:hAnsi="Segoe UI Emoji" w:cs="Segoe UI Emoji"/>
+          <w:b/>
+          <w:bCs/>
+        </w:rPr>
+      </w:pPr>
+      <w:r>
+        <w:rPr>
+          <w:rFonts w:ascii="Segoe UI Emoji" w:hAnsi="Segoe UI Emoji" w:cs="Segoe UI Emoji"/>
+        </w:rPr>
+        <w:t>Skill para o Dashboard TV ⌛</w:t>
+      </w:r>
+    </w:p>
+    <w:p>
+      <w:pPr>
+        <w:rPr>
+          <w:rFonts w:ascii="Segoe UI Emoji" w:hAnsi="Segoe UI Emoji" w:cs="Segoe UI Emoji"/>
+          <w:b/>
+          <w:bCs/>
+        </w:rPr>
+      </w:pPr>
+      <w:r>
+        <w:rPr>
+          <w:rFonts w:ascii="Segoe UI Emoji" w:hAnsi="Segoe UI Emoji" w:cs="Segoe UI Emoji"/>
+        </w:rPr>
+        <w:t>Aprimorar o funil de vendas para cada um dos operadores ⌛</w:t>
+      </w:r>
+    </w:p>
+    <w:p>
+      <w:pPr>
+        <w:rPr>
+          <w:rFonts w:ascii="Segoe UI Emoji" w:hAnsi="Segoe UI Emoji" w:cs="Segoe UI Emoji"/>
+          <w:b/>
+          <w:bCs/>
+        </w:rPr>
+      </w:pPr>
+      <w:r>
+        <w:rPr>
+          <w:rFonts w:ascii="Segoe UI Emoji" w:hAnsi="Segoe UI Emoji" w:cs="Segoe UI Emoji"/>
+          <w:highlight w:val="yellow"/>
+        </w:rPr>
+        <w:t>A grande urgência: criar o link do Streamlit para o Dash e liberar para cada um dos operadores, mantendo:</w:t>
+      </w:r>
+      <w:r>
+        <w:rPr>
+          <w:rFonts w:ascii="Segoe UI Emoji" w:hAnsi="Segoe UI Emoji" w:cs="Segoe UI Emoji"/>
+        </w:rPr>
+        <w:t xml:space="preserve"> ⌛</w:t>
+      </w:r>
+    </w:p>
+    <w:p>
+      <w:pPr>
+        <w:rPr>
+          <w:rFonts w:ascii="Segoe UI Emoji" w:hAnsi="Segoe UI Emoji" w:cs="Segoe UI Emoji"/>
+          <w:b/>
+          <w:bCs/>
+        </w:rPr>
+      </w:pPr>
+      <w:r>
+        <w:rPr>
+          <w:rFonts w:ascii="Segoe UI Emoji" w:hAnsi="Segoe UI Emoji" w:cs="Segoe UI Emoji"/>
+        </w:rPr>
+        <w:t>Cada operador deverá visualizar apenas as próprias propostas ⌛</w:t>
+      </w:r>
+    </w:p>
+    <w:p>
+      <w:pPr>
+        <w:rPr>
+          <w:rFonts w:ascii="Segoe UI Emoji" w:hAnsi="Segoe UI Emoji" w:cs="Segoe UI Emoji"/>
+          <w:b/>
+          <w:bCs/>
+        </w:rPr>
+      </w:pPr>
+      <w:r>
+        <w:rPr>
+          <w:rFonts w:ascii="Segoe UI Emoji" w:hAnsi="Segoe UI Emoji" w:cs="Segoe UI Emoji"/>
+        </w:rPr>
+        <w:t>O perfil será: Supervisor (enxerga tudo), Comercial (enxerga tudo somado dos SDRs) e SDR (cada um enxergando sua própria vida na empresa). ⌛</w:t>
+      </w:r>
+    </w:p>
+    <w:p>
+      <w:pPr>
+        <w:rPr>
+          <w:rFonts w:ascii="Segoe UI Emoji" w:hAnsi="Segoe UI Emoji" w:cs="Segoe UI Emoji"/>
+          <w:b/>
+          <w:bCs/>
+        </w:rPr>
+      </w:pPr>
+      <w:r>
+        <w:rPr>
+          <w:rFonts w:ascii="Segoe UI Emoji" w:hAnsi="Segoe UI Emoji" w:cs="Segoe UI Emoji"/>
+        </w:rPr>
+        <w:t>Possivelmente um dashboard inicial no login de cada um com as mudanças gerais, notificações etc. ⌛</w:t>
+      </w:r>
+    </w:p>
+    <w:p>
+      <w:pPr>
+        <w:rPr>
+          <w:rFonts w:ascii="Segoe UI Emoji" w:hAnsi="Segoe UI Emoji" w:cs="Segoe UI Emoji"/>
+          <w:b/>
+          <w:bCs/>
+        </w:rPr>
+      </w:pPr>
+      <w:r>
+        <w:rPr>
+          <w:rFonts w:ascii="Segoe UI Emoji" w:hAnsi="Segoe UI Emoji" w:cs="Segoe UI Emoji"/>
+        </w:rPr>
+        <w:t>Abas necessárias para os SDRs: Visão geral, funil de vendas,</w:t>
+      </w:r>
+      <w:r>
+        <w:rPr>
+          <w:rFonts w:ascii="Segoe UI Emoji" w:hAnsi="Segoe UI Emoji" w:cs="Segoe UI Emoji"/>
+        </w:rPr>
+        <w:t xml:space="preserve"> </w:t>
+      </w:r>
+      <w:r>
+        <w:rPr>
+          <w:rFonts w:ascii="Segoe UI Emoji" w:hAnsi="Segoe UI Emoji" w:cs="Segoe UI Emoji"/>
+        </w:rPr>
+        <w:t>Detalhamento por dia e possivelmente estágio do lead ⌛</w:t>
+      </w:r>
+    </w:p>
+    <w:p>
+      <w:pPr>
+        <w:rPr>
+          <w:rFonts w:ascii="Segoe UI Emoji" w:hAnsi="Segoe UI Emoji" w:cs="Segoe UI Emoji"/>
+          <w:b/>
+          <w:bCs/>
+        </w:rPr>
+      </w:pPr>
+      <w:r>
+        <w:rPr>
+          <w:rFonts w:ascii="Segoe UI Emoji" w:hAnsi="Segoe UI Emoji" w:cs="Segoe UI Emoji"/>
+        </w:rPr>
+        <w:t>Na Visão Geral, cada SDR deve enxergar o Equipe comercial respectivo aos seus próprios leads, vulgo: pote da ganância, em esteira, realizadas com a percepção. ⌛</w:t>
+      </w:r>
+    </w:p>
+    <w:p>
+      <w:pPr>
+        <w:rPr>
+          <w:rFonts w:ascii="Segoe UI Emoji" w:hAnsi="Segoe UI Emoji" w:cs="Segoe UI Emoji"/>
+        </w:rPr>
+      </w:pPr>
+      <w:r>
+        <w:rPr>
+          <w:rFonts w:ascii="Segoe UI Emoji" w:hAnsi="Segoe UI Emoji" w:cs="Segoe UI Emoji"/>
+        </w:rPr>
+        <w:t xml:space="preserve">Em “funil de vendas”, colocar o mesmo estilo de menu suspenso para o filtro, data, origem etc. </w:t>
+      </w:r>
+      <w:r>
+        <w:rPr>
+          <w:rFonts w:ascii="Segoe UI Emoji" w:hAnsi="Segoe UI Emoji" w:cs="Segoe UI Emoji"/>
+        </w:rPr>
+        <w:t>✅</w:t>
+      </w:r>
+    </w:p>
+    <w:p>
+      <w:pPr>
+        <w:rPr>
+          <w:rFonts w:ascii="Segoe UI Emoji" w:hAnsi="Segoe UI Emoji" w:cs="Segoe UI Emoji"/>
+        </w:rPr>
+      </w:pPr>
+      <w:r>
+        <w:rPr>
+          <w:rFonts w:ascii="Segoe UI Emoji" w:hAnsi="Segoe UI Emoji" w:cs="Segoe UI Emoji"/>
+        </w:rPr>
+        <w:t>Botão “Aplicar” em CRM -&gt; Histórico de bases para facilitar o carregamento</w:t>
+      </w:r>
+      <w:r>
+        <w:rPr>
+          <w:rFonts w:ascii="Segoe UI Emoji" w:hAnsi="Segoe UI Emoji" w:cs="Segoe UI Emoji"/>
+        </w:rPr>
+        <w:t xml:space="preserve"> </w:t>
+      </w:r>
+      <w:r>
+        <w:rPr>
+          <w:rFonts w:ascii="Segoe UI Emoji" w:hAnsi="Segoe UI Emoji" w:cs="Segoe UI Emoji"/>
+        </w:rPr>
+        <w:t>✅</w:t>
+      </w:r>
+    </w:p>
+    <w:p>
+      <w:pPr>
+        <w:rPr>
+          <w:rFonts w:ascii="Segoe UI Emoji" w:hAnsi="Segoe UI Emoji" w:cs="Segoe UI Emoji"/>
+        </w:rPr>
+      </w:pPr>
+      <w:r>
+        <w:rPr>
+          <w:rFonts w:ascii="Segoe UI Emoji" w:hAnsi="Segoe UI Emoji" w:cs="Segoe UI Emoji"/>
+        </w:rPr>
+        <w:t xml:space="preserve">Data em “por operador” </w:t>
+      </w:r>
+      <w:r>
+        <w:rPr>
+          <w:rFonts w:ascii="Segoe UI Emoji" w:hAnsi="Segoe UI Emoji" w:cs="Segoe UI Emoji"/>
+        </w:rPr>
+        <w:t>✅</w:t>
+      </w:r>
+    </w:p>
+    <w:p>
+      <w:pPr>
+        <w:rPr>
+          <w:rFonts w:ascii="Segoe UI Emoji" w:hAnsi="Segoe UI Emoji" w:cs="Segoe UI Emoji"/>
+        </w:rPr>
+      </w:pPr>
+      <w:r>
+        <w:rPr>
+          <w:rFonts w:ascii="Segoe UI Emoji" w:hAnsi="Segoe UI Emoji" w:cs="Segoe UI Emoji"/>
+        </w:rPr>
+        <w:t xml:space="preserve">Hoje, foi criado o login de Rodolfo – processo feito e depois git add, commit e push </w:t>
+      </w:r>
+      <w:r>
+        <w:rPr>
+          <w:rFonts w:ascii="Segoe UI Emoji" w:hAnsi="Segoe UI Emoji" w:cs="Segoe UI Emoji"/>
+        </w:rPr>
+        <w:t>✅</w:t>
+      </w:r>
+    </w:p>
+    <w:p>
+      <w:pPr>
+        <w:rPr>
+          <w:rFonts w:ascii="Segoe UI Emoji" w:hAnsi="Segoe UI Emoji" w:cs="Segoe UI Emoji"/>
+        </w:rPr>
+      </w:pPr>
+    </w:p>
+    <w:p>
+      <w:pPr>
+        <w:rPr>
+          <w:rFonts w:ascii="Segoe UI Emoji" w:hAnsi="Segoe UI Emoji" w:cs="Segoe UI Emoji"/>
+        </w:rPr>
+      </w:pPr>
+    </w:p>
+    <w:p>
+      <w:pPr>
+        <w:rPr>
+          <w:rFonts w:ascii="Segoe UI Emoji" w:hAnsi="Segoe UI Emoji" w:cs="Segoe UI Emoji"/>
+          <w:b/>
+          <w:bCs/>
+        </w:rPr>
+      </w:pPr>
+    </w:p>
+    <w:p>
+      <w:pPr>
+        <w:ind w:left="2124" w:firstLine="708"/>
+        <w:rPr>
+          <w:rFonts w:ascii="Segoe UI Emoji" w:hAnsi="Segoe UI Emoji" w:cs="Segoe UI Emoji"/>
+          <w:b/>
+          <w:bCs/>
+        </w:rPr>
+      </w:pPr>
+      <w:r>
+        <w:rPr>
+          <w:rFonts w:ascii="Segoe UI Emoji" w:hAnsi="Segoe UI Emoji" w:cs="Segoe UI Emoji"/>
+          <w:b/>
+          <w:bCs/>
+        </w:rPr>
+        <w:lastRenderedPageBreak/>
+        <w:t xml:space="preserve">Pauta Claude – </w:t>
+      </w:r>
+      <w:r>
+        <w:rPr>
+          <w:rFonts w:ascii="Segoe UI Emoji" w:hAnsi="Segoe UI Emoji" w:cs="Segoe UI Emoji"/>
+          <w:b/>
+          <w:bCs/>
+        </w:rPr>
+        <w:t>2</w:t>
+      </w:r>
+      <w:r>
+        <w:rPr>
+          <w:rFonts w:ascii="Segoe UI Emoji" w:hAnsi="Segoe UI Emoji" w:cs="Segoe UI Emoji"/>
+          <w:b/>
+          <w:bCs/>
+        </w:rPr>
+        <w:t>3</w:t>
+      </w:r>
+      <w:r>
+        <w:rPr>
+          <w:rFonts w:ascii="Segoe UI Emoji" w:hAnsi="Segoe UI Emoji" w:cs="Segoe UI Emoji"/>
+          <w:b/>
+          <w:bCs/>
+        </w:rPr>
+        <w:t>/05</w:t>
+      </w:r>
+    </w:p>
+    <w:p>
+      <w:pPr>
+        <w:rPr>
+          <w:rFonts w:ascii="Segoe UI Emoji" w:hAnsi="Segoe UI Emoji" w:cs="Segoe UI Emoji"/>
+          <w:b/>
+          <w:bCs/>
+        </w:rPr>
+      </w:pPr>
+    </w:p>
+    <w:p>
+      <w:pPr>
+        <w:rPr>
+          <w:rFonts w:ascii="Segoe UI Emoji" w:hAnsi="Segoe UI Emoji" w:cs="Segoe UI Emoji"/>
+        </w:rPr>
+      </w:pPr>
+      <w:r>
+        <w:rPr>
+          <w:rFonts w:ascii="Segoe UI Emoji" w:hAnsi="Segoe UI Emoji" w:cs="Segoe UI Emoji"/>
+        </w:rPr>
+        <w:t xml:space="preserve">O botão “aplicar” em “visão geral – SDR” só atualiza os leads </w:t>
+      </w:r>
+      <w:r>
+        <w:rPr>
+          <w:rFonts w:ascii="Segoe UI Emoji" w:hAnsi="Segoe UI Emoji" w:cs="Segoe UI Emoji"/>
+        </w:rPr>
+        <w:t>captados hoje, nos cards abaixo a atualização não vem</w:t>
+      </w:r>
+      <w:r>
+        <w:rPr>
+          <w:rFonts w:ascii="Segoe UI Emoji" w:hAnsi="Segoe UI Emoji" w:cs="Segoe UI Emoji"/>
+        </w:rPr>
+        <w:t xml:space="preserve"> </w:t>
+      </w:r>
+      <w:r>
+        <w:rPr>
+          <w:rFonts w:ascii="Segoe UI Emoji" w:hAnsi="Segoe UI Emoji" w:cs="Segoe UI Emoji"/>
+        </w:rPr>
+        <w:t>✅</w:t>
+      </w:r>
+    </w:p>
+    <w:p>
+      <w:pPr>
+        <w:rPr>
+          <w:rFonts w:ascii="Segoe UI Emoji" w:hAnsi="Segoe UI Emoji" w:cs="Segoe UI Emoji"/>
+        </w:rPr>
+      </w:pPr>
+      <w:r>
+        <w:rPr>
+          <w:rFonts w:ascii="Segoe UI Emoji" w:hAnsi="Segoe UI Emoji" w:cs="Segoe UI Emoji"/>
+          <w:highlight w:val="yellow"/>
+        </w:rPr>
+        <w:t>Grande mudança feita: os dados da API agora são salvos em disco, onde o botão “atualizar” puxa os dados do disco que são armazenados e atualizados a cada 5 minutos; antes, com o mesmo botão, ele limpava todo o cache, buscava na API e o st.rerun buscava de novo, acarretando mais lentidão ainda. Tudo solucionado.</w:t>
+      </w:r>
+      <w:r>
+        <w:t xml:space="preserve"> </w:t>
+      </w:r>
+      <w:r>
+        <w:rPr>
+          <w:rFonts w:ascii="Segoe UI Emoji" w:hAnsi="Segoe UI Emoji" w:cs="Segoe UI Emoji"/>
+        </w:rPr>
+        <w:t>✅</w:t>
+      </w:r>
+    </w:p>
+    <w:p>
+      <w:pPr>
+        <w:rPr>
+          <w:rFonts w:ascii="Segoe UI Emoji" w:hAnsi="Segoe UI Emoji" w:cs="Segoe UI Emoji"/>
+        </w:rPr>
+      </w:pPr>
+      <w:r>
+        <w:rPr>
+          <w:rFonts w:ascii="Segoe UI Emoji" w:hAnsi="Segoe UI Emoji" w:cs="Segoe UI Emoji"/>
+        </w:rPr>
+        <w:t>Subir arquivo para o Streamlit Community Cloud</w:t>
+      </w:r>
+      <w:r>
+        <w:rPr>
+          <w:rFonts w:ascii="Segoe UI Emoji" w:hAnsi="Segoe UI Emoji" w:cs="Segoe UI Emoji"/>
+        </w:rPr>
+        <w:t xml:space="preserve"> </w:t>
+      </w:r>
+      <w:r>
+        <w:rPr>
+          <w:rFonts w:ascii="Segoe UI Emoji" w:hAnsi="Segoe UI Emoji" w:cs="Segoe UI Emoji"/>
+        </w:rPr>
+        <w:t>✅</w:t>
+      </w:r>
+    </w:p>
+    <w:p>
+      <w:pPr>
+        <w:rPr>
+          <w:rFonts w:ascii="Segoe UI Emoji" w:hAnsi="Segoe UI Emoji" w:cs="Segoe UI Emoji"/>
+        </w:rPr>
+      </w:pPr>
+      <w:r>
+        <w:rPr>
+          <w:rFonts w:ascii="Segoe UI Emoji" w:hAnsi="Segoe UI Emoji" w:cs="Segoe UI Emoji"/>
+        </w:rPr>
+        <w:t xml:space="preserve">Padronizar logins e visualização para cada operador </w:t>
+      </w:r>
+      <w:r>
+        <w:rPr>
+          <w:rFonts w:ascii="Segoe UI Emoji" w:hAnsi="Segoe UI Emoji" w:cs="Segoe UI Emoji"/>
+        </w:rPr>
         <w:t>⌛</w:t>
       </w:r>
     </w:p>
+    <w:p>
+      <w:pPr>
+        <w:rPr>
+          <w:rFonts w:ascii="Segoe UI Emoji" w:hAnsi="Segoe UI Emoji" w:cs="Segoe UI Emoji"/>
+        </w:rPr>
+      </w:pPr>
+      <w:r>
+        <w:rPr>
+          <w:rFonts w:ascii="Segoe UI Emoji" w:hAnsi="Segoe UI Emoji" w:cs="Segoe UI Emoji"/>
+        </w:rPr>
+        <w:t>Skill para renovar o refresh token e acess token do Followize</w:t>
+      </w:r>
+      <w:r>
+        <w:rPr>
+          <w:rFonts w:ascii="Segoe UI Emoji" w:hAnsi="Segoe UI Emoji" w:cs="Segoe UI Emoji"/>
+        </w:rPr>
+        <w:t xml:space="preserve"> - Sempre chamar via terminal a skill “renovar token” ou “erro 401</w:t>
+      </w:r>
+      <w:r>
+        <w:rPr>
+          <w:rFonts w:ascii="Segoe UI Emoji" w:hAnsi="Segoe UI Emoji" w:cs="Segoe UI Emoji"/>
+          <w:i/>
+          <w:iCs/>
+        </w:rPr>
+        <w:t xml:space="preserve">, </w:t>
+      </w:r>
+      <w:r>
+        <w:rPr>
+          <w:rFonts w:ascii="Segoe UI Emoji" w:hAnsi="Segoe UI Emoji" w:cs="Segoe UI Emoji"/>
+        </w:rPr>
+        <w:t>onde ele irá renovar os tokens por meio do renovar_token.py</w:t>
+      </w:r>
+      <w:r>
+        <w:rPr>
+          <w:rFonts w:ascii="Segoe UI Emoji" w:hAnsi="Segoe UI Emoji" w:cs="Segoe UI Emoji"/>
+        </w:rPr>
+        <w:t>, atualiza automaticamente o .env</w:t>
+      </w:r>
+      <w:r>
+        <w:rPr>
+          <w:rFonts w:ascii="Segoe UI Emoji" w:hAnsi="Segoe UI Emoji" w:cs="Segoe UI Emoji"/>
+        </w:rPr>
+        <w:t xml:space="preserve">. </w:t>
+      </w:r>
+      <w:r>
+        <w:rPr>
+          <w:rFonts w:ascii="Segoe UI Emoji" w:hAnsi="Segoe UI Emoji" w:cs="Segoe UI Emoji"/>
+        </w:rPr>
+        <w:t>✅</w:t>
+      </w:r>
+    </w:p>
+    <w:p>
+      <w:pPr>
+        <w:rPr>
+          <w:rFonts w:ascii="Segoe UI Emoji" w:hAnsi="Segoe UI Emoji" w:cs="Segoe UI Emoji"/>
+        </w:rPr>
+      </w:pPr>
+      <w:r>
+        <w:rPr>
+          <w:rFonts w:ascii="Segoe UI Emoji" w:hAnsi="Segoe UI Emoji" w:cs="Segoe UI Emoji"/>
+        </w:rPr>
+        <w:t>A grande questão: o Streamlit Community Cloud não roda arquivos em background, semelhante ao updater.py. Terei de encontrar outra solução</w:t>
+      </w:r>
+      <w:r>
+        <w:rPr>
+          <w:rFonts w:ascii="Segoe UI Emoji" w:hAnsi="Segoe UI Emoji" w:cs="Segoe UI Emoji"/>
+        </w:rPr>
+        <w:t>. Leia:</w:t>
+      </w:r>
+    </w:p>
+    <w:p>
+      <w:pPr>
+        <w:rPr>
+          <w:rFonts w:ascii="Segoe UI Emoji" w:hAnsi="Segoe UI Emoji" w:cs="Segoe UI Emoji"/>
+        </w:rPr>
+      </w:pPr>
+    </w:p>
+    <w:p>
+      <w:pPr>
+        <w:rPr>
+          <w:rFonts w:ascii="Segoe UI Emoji" w:hAnsi="Segoe UI Emoji" w:cs="Segoe UI Emoji"/>
+          <w:b/>
+          <w:bCs/>
+          <w:u w:val="single"/>
+        </w:rPr>
+      </w:pPr>
+      <w:r>
+        <w:rPr>
+          <w:rFonts w:ascii="Segoe UI Emoji" w:hAnsi="Segoe UI Emoji" w:cs="Segoe UI Emoji"/>
+          <w:b/>
+          <w:bCs/>
+          <w:u w:val="single"/>
+        </w:rPr>
+        <w:t>O problema</w:t>
+      </w:r>
+    </w:p>
+    <w:p>
+      <w:pPr>
+        <w:rPr>
+          <w:rFonts w:ascii="Segoe UI Emoji" w:hAnsi="Segoe UI Emoji" w:cs="Segoe UI Emoji"/>
+          <w:u w:val="single"/>
+        </w:rPr>
+      </w:pPr>
+      <w:r>
+        <w:rPr>
+          <w:rFonts w:ascii="Segoe UI Emoji" w:hAnsi="Segoe UI Emoji" w:cs="Segoe UI Emoji"/>
+          <w:b/>
+          <w:bCs/>
+          <w:u w:val="single"/>
+        </w:rPr>
+        <w:t>1. O Streamlit Cloud não roda processos em background</w:t>
+      </w:r>
+      <w:r>
+        <w:rPr>
+          <w:rFonts w:ascii="Segoe UI Emoji" w:hAnsi="Segoe UI Emoji" w:cs="Segoe UI Emoji"/>
+          <w:u w:val="single"/>
+        </w:rPr>
+        <w:t xml:space="preserve"> O updater.py precisa rodar separado do dashboard, em paralelo. No Cloud, só o streamlit run dashboard_tv_novo.py é executado — não tem como subir o updater.py junto.</w:t>
+      </w:r>
+    </w:p>
+    <w:p>
+      <w:pPr>
+        <w:rPr>
+          <w:rFonts w:ascii="Segoe UI Emoji" w:hAnsi="Segoe UI Emoji" w:cs="Segoe UI Emoji"/>
+          <w:u w:val="single"/>
+        </w:rPr>
+      </w:pPr>
+      <w:r>
+        <w:rPr>
+          <w:rFonts w:ascii="Segoe UI Emoji" w:hAnsi="Segoe UI Emoji" w:cs="Segoe UI Emoji"/>
+          <w:b/>
+          <w:bCs/>
+          <w:u w:val="single"/>
+        </w:rPr>
+        <w:t>2. O filesystem do Streamlit Cloud é efêmero</w:t>
+      </w:r>
+      <w:r>
+        <w:rPr>
+          <w:rFonts w:ascii="Segoe UI Emoji" w:hAnsi="Segoe UI Emoji" w:cs="Segoe UI Emoji"/>
+          <w:u w:val="single"/>
+        </w:rPr>
+        <w:t xml:space="preserve"> Mesmo que o updater rodasse, os arquivos .pkl gravados em disco (cache_30dias.pkl, etc.) somem quando o app reinicia ou entra em modo de espera.</w:t>
+      </w:r>
+    </w:p>
+    <w:p>
+      <w:pPr>
+        <w:rPr>
+          <w:rFonts w:ascii="Segoe UI Emoji" w:hAnsi="Segoe UI Emoji" w:cs="Segoe UI Emoji"/>
+          <w:b/>
+          <w:bCs/>
+          <w:u w:val="single"/>
+        </w:rPr>
+      </w:pPr>
+      <w:r>
+        <w:rPr>
+          <w:rFonts w:ascii="Segoe UI Emoji" w:hAnsi="Segoe UI Emoji" w:cs="Segoe UI Emoji"/>
+          <w:b/>
+          <w:bCs/>
+          <w:u w:val="single"/>
+        </w:rPr>
+        <w:t>O que acontece na prática</w:t>
+      </w:r>
+    </w:p>
+    <w:p>
+      <w:pPr>
+        <w:rPr>
+          <w:rFonts w:ascii="Segoe UI Emoji" w:hAnsi="Segoe UI Emoji" w:cs="Segoe UI Emoji"/>
+          <w:u w:val="single"/>
+        </w:rPr>
+      </w:pPr>
+      <w:r>
+        <w:rPr>
+          <w:rFonts w:ascii="Segoe UI Emoji" w:hAnsi="Segoe UI Emoji" w:cs="Segoe UI Emoji"/>
+          <w:u w:val="single"/>
+        </w:rPr>
+        <w:t>O dashboard vai tentar ler os .pkl — se não encontrar, vai direto na API (mais lento) ou vai dar erro, dependendo de como está implementado. Deixa eu checar isso rapidamente.</w:t>
+      </w:r>
+    </w:p>
+    <w:p>
+      <w:pPr>
+        <w:rPr>
+          <w:rFonts w:ascii="Segoe UI Emoji" w:hAnsi="Segoe UI Emoji" w:cs="Segoe UI Emoji"/>
+          <w:i/>
+          <w:iCs/>
+          <w:u w:val="single"/>
+        </w:rPr>
+      </w:pPr>
+      <w:r>
+        <w:rPr>
+          <w:rFonts w:ascii="Segoe UI Emoji" w:hAnsi="Segoe UI Emoji" w:cs="Segoe UI Emoji"/>
+          <w:u w:val="single"/>
+        </w:rPr>
+        <w:t xml:space="preserve"> </w:t>
+      </w:r>
+    </w:p>
+    <w:p>
+      <w:r>
+        <w:t xml:space="preserve"> </w:t>
+      </w:r>
+    </w:p>
+    <w:p/>
+    <w:p>
+      <w:pPr>
+        <w:ind w:left="2124"/>
+        <w:rPr>
+          <w:rFonts w:ascii="Segoe UI Emoji" w:hAnsi="Segoe UI Emoji" w:cs="Segoe UI Emoji"/>
+          <w:b/>
+          <w:bCs/>
+        </w:rPr>
+      </w:pPr>
+      <w:r>
+        <w:rPr>
+          <w:rFonts w:ascii="Segoe UI Emoji" w:hAnsi="Segoe UI Emoji" w:cs="Segoe UI Emoji"/>
+          <w:b/>
+          <w:bCs/>
+        </w:rPr>
+        <w:lastRenderedPageBreak/>
+        <w:t xml:space="preserve">Pauta Claude – </w:t>
+      </w:r>
+      <w:r>
+        <w:rPr>
+          <w:rFonts w:ascii="Segoe UI Emoji" w:hAnsi="Segoe UI Emoji" w:cs="Segoe UI Emoji"/>
+          <w:b/>
+          <w:bCs/>
+        </w:rPr>
+        <w:t>23</w:t>
+      </w:r>
+      <w:r>
+        <w:rPr>
+          <w:rFonts w:ascii="Segoe UI Emoji" w:hAnsi="Segoe UI Emoji" w:cs="Segoe UI Emoji"/>
+          <w:b/>
+          <w:bCs/>
+        </w:rPr>
+        <w:t>/05</w:t>
+      </w:r>
+    </w:p>
+    <w:p>
+      <w:pPr>
+        <w:rPr>
+          <w:rFonts w:ascii="Segoe UI Emoji" w:hAnsi="Segoe UI Emoji" w:cs="Segoe UI Emoji"/>
+        </w:rPr>
+      </w:pPr>
+    </w:p>
+    <w:p>
+      <w:pPr>
+        <w:rPr>
+          <w:rFonts w:ascii="Segoe UI Emoji" w:hAnsi="Segoe UI Emoji" w:cs="Segoe UI Emoji"/>
+        </w:rPr>
+      </w:pPr>
+      <w:r>
+        <w:rPr>
+          <w:rFonts w:ascii="Segoe UI Emoji" w:hAnsi="Segoe UI Emoji" w:cs="Segoe UI Emoji"/>
+        </w:rPr>
+        <w:t xml:space="preserve">Criação do AWS Lightsail para </w:t>
+      </w:r>
+      <w:r>
+        <w:rPr>
+          <w:rFonts w:ascii="Segoe UI Emoji" w:hAnsi="Segoe UI Emoji" w:cs="Segoe UI Emoji"/>
+        </w:rPr>
+        <w:t>ter o Dashboard disponível para o time</w:t>
+      </w:r>
+      <w:r>
+        <w:rPr>
+          <w:rFonts w:ascii="Segoe UI Emoji" w:hAnsi="Segoe UI Emoji" w:cs="Segoe UI Emoji"/>
+        </w:rPr>
+        <w:t xml:space="preserve"> </w:t>
+      </w:r>
+      <w:r>
+        <w:rPr>
+          <w:rFonts w:ascii="Segoe UI Emoji" w:hAnsi="Segoe UI Emoji" w:cs="Segoe UI Emoji"/>
+        </w:rPr>
+        <w:t>✅</w:t>
+      </w:r>
+    </w:p>
+    <w:p>
+      <w:pPr>
+        <w:rPr>
+          <w:rFonts w:ascii="Segoe UI Emoji" w:hAnsi="Segoe UI Emoji" w:cs="Segoe UI Emoji"/>
+        </w:rPr>
+      </w:pPr>
+      <w:r>
+        <w:rPr>
+          <w:rFonts w:ascii="Segoe UI Emoji" w:hAnsi="Segoe UI Emoji" w:cs="Segoe UI Emoji"/>
+        </w:rPr>
+        <w:t>kainonAWS12</w:t>
+      </w:r>
+    </w:p>
+    <w:p>
+      <w:pPr>
+        <w:rPr>
+          <w:rFonts w:ascii="Segoe UI Emoji" w:hAnsi="Segoe UI Emoji" w:cs="Segoe UI Emoji"/>
+        </w:rPr>
+      </w:pPr>
+      <w:r>
+        <w:rPr>
+          <w:rFonts w:ascii="Segoe UI Emoji" w:hAnsi="Segoe UI Emoji" w:cs="Segoe UI Emoji"/>
+        </w:rPr>
+        <w:t>AWSsolutions12</w:t>
+      </w:r>
+    </w:p>
+    <w:p>
+      <w:pPr>
+        <w:rPr>
+          <w:rFonts w:ascii="Segoe UI Emoji" w:hAnsi="Segoe UI Emoji" w:cs="Segoe UI Emoji"/>
+        </w:rPr>
+      </w:pPr>
+      <w:r>
+        <w:rPr>
+          <w:rFonts w:ascii="Segoe UI Emoji" w:hAnsi="Segoe UI Emoji" w:cs="Segoe UI Emoji"/>
+        </w:rPr>
+        <w:t xml:space="preserve">Salvar automaticamente os processos no GitHub via Claude Code </w:t>
+      </w:r>
+      <w:r>
+        <w:rPr>
+          <w:rFonts w:ascii="Segoe UI Emoji" w:hAnsi="Segoe UI Emoji" w:cs="Segoe UI Emoji"/>
+        </w:rPr>
+        <w:t>✅</w:t>
+      </w:r>
+    </w:p>
+    <w:p>
+      <w:pPr>
+        <w:rPr>
+          <w:rFonts w:ascii="Segoe UI Emoji" w:hAnsi="Segoe UI Emoji" w:cs="Segoe UI Emoji"/>
+        </w:rPr>
+      </w:pPr>
+    </w:p>
+    <w:p/>
     <w:sectPr>
       <w:pgSz w:w="11906" w:h="16838"/>
       <w:pgMar w:top="1417" w:right="1701" w:bottom="1417" w:left="1701" w:header="708" w:footer="708" w:gutter="0"/>
@@ -3705,6 +4518,232 @@
     </w:lvl>
   </w:abstractNum>
   <w:abstractNum w:abstractNumId="2" w15:restartNumberingAfterBreak="0">
+    <w:nsid w:val="10984A51"/>
+    <w:multiLevelType w:val="hybridMultilevel"/>
+    <w:tmpl w:val="B8A8BCFE"/>
+    <w:lvl w:ilvl="0" w:tplc="04160001">
+      <w:start w:val="1"/>
+      <w:numFmt w:val="bullet"/>
+      <w:lvlText w:val=""/>
+      <w:lvlJc w:val="left"/>
+      <w:pPr>
+        <w:ind w:left="720" w:hanging="360"/>
+      </w:pPr>
+      <w:rPr>
+        <w:rFonts w:ascii="Symbol" w:hAnsi="Symbol" w:hint="default"/>
+      </w:rPr>
+    </w:lvl>
+    <w:lvl w:ilvl="1" w:tplc="04160003" w:tentative="1">
+      <w:start w:val="1"/>
+      <w:numFmt w:val="bullet"/>
+      <w:lvlText w:val="o"/>
+      <w:lvlJc w:val="left"/>
+      <w:pPr>
+        <w:ind w:left="1440" w:hanging="360"/>
+      </w:pPr>
+      <w:rPr>
+        <w:rFonts w:ascii="Courier New" w:hAnsi="Courier New" w:cs="Courier New" w:hint="default"/>
+      </w:rPr>
+    </w:lvl>
+    <w:lvl w:ilvl="2" w:tplc="04160005" w:tentative="1">
+      <w:start w:val="1"/>
+      <w:numFmt w:val="bullet"/>
+      <w:lvlText w:val=""/>
+      <w:lvlJc w:val="left"/>
+      <w:pPr>
+        <w:ind w:left="2160" w:hanging="360"/>
+      </w:pPr>
+      <w:rPr>
+        <w:rFonts w:ascii="Wingdings" w:hAnsi="Wingdings" w:hint="default"/>
+      </w:rPr>
+    </w:lvl>
+    <w:lvl w:ilvl="3" w:tplc="04160001" w:tentative="1">
+      <w:start w:val="1"/>
+      <w:numFmt w:val="bullet"/>
+      <w:lvlText w:val=""/>
+      <w:lvlJc w:val="left"/>
+      <w:pPr>
+        <w:ind w:left="2880" w:hanging="360"/>
+      </w:pPr>
+      <w:rPr>
+        <w:rFonts w:ascii="Symbol" w:hAnsi="Symbol" w:hint="default"/>
+      </w:rPr>
+    </w:lvl>
+    <w:lvl w:ilvl="4" w:tplc="04160003" w:tentative="1">
+      <w:start w:val="1"/>
+      <w:numFmt w:val="bullet"/>
+      <w:lvlText w:val="o"/>
+      <w:lvlJc w:val="left"/>
+      <w:pPr>
+        <w:ind w:left="3600" w:hanging="360"/>
+      </w:pPr>
+      <w:rPr>
+        <w:rFonts w:ascii="Courier New" w:hAnsi="Courier New" w:cs="Courier New" w:hint="default"/>
+      </w:rPr>
+    </w:lvl>
+    <w:lvl w:ilvl="5" w:tplc="04160005" w:tentative="1">
+      <w:start w:val="1"/>
+      <w:numFmt w:val="bullet"/>
+      <w:lvlText w:val=""/>
+      <w:lvlJc w:val="left"/>
+      <w:pPr>
+        <w:ind w:left="4320" w:hanging="360"/>
+      </w:pPr>
+      <w:rPr>
+        <w:rFonts w:ascii="Wingdings" w:hAnsi="Wingdings" w:hint="default"/>
+      </w:rPr>
+    </w:lvl>
+    <w:lvl w:ilvl="6" w:tplc="04160001" w:tentative="1">
+      <w:start w:val="1"/>
+      <w:numFmt w:val="bullet"/>
+      <w:lvlText w:val=""/>
+      <w:lvlJc w:val="left"/>
+      <w:pPr>
+        <w:ind w:left="5040" w:hanging="360"/>
+      </w:pPr>
+      <w:rPr>
+        <w:rFonts w:ascii="Symbol" w:hAnsi="Symbol" w:hint="default"/>
+      </w:rPr>
+    </w:lvl>
+    <w:lvl w:ilvl="7" w:tplc="04160003" w:tentative="1">
+      <w:start w:val="1"/>
+      <w:numFmt w:val="bullet"/>
+      <w:lvlText w:val="o"/>
+      <w:lvlJc w:val="left"/>
+      <w:pPr>
+        <w:ind w:left="5760" w:hanging="360"/>
+      </w:pPr>
+      <w:rPr>
+        <w:rFonts w:ascii="Courier New" w:hAnsi="Courier New" w:cs="Courier New" w:hint="default"/>
+      </w:rPr>
+    </w:lvl>
+    <w:lvl w:ilvl="8" w:tplc="04160005" w:tentative="1">
+      <w:start w:val="1"/>
+      <w:numFmt w:val="bullet"/>
+      <w:lvlText w:val=""/>
+      <w:lvlJc w:val="left"/>
+      <w:pPr>
+        <w:ind w:left="6480" w:hanging="360"/>
+      </w:pPr>
+      <w:rPr>
+        <w:rFonts w:ascii="Wingdings" w:hAnsi="Wingdings" w:hint="default"/>
+      </w:rPr>
+    </w:lvl>
+  </w:abstractNum>
+  <w:abstractNum w:abstractNumId="3" w15:restartNumberingAfterBreak="0">
+    <w:nsid w:val="1264425B"/>
+    <w:multiLevelType w:val="hybridMultilevel"/>
+    <w:tmpl w:val="A3BC1442"/>
+    <w:lvl w:ilvl="0" w:tplc="04160001">
+      <w:start w:val="1"/>
+      <w:numFmt w:val="bullet"/>
+      <w:lvlText w:val=""/>
+      <w:lvlJc w:val="left"/>
+      <w:pPr>
+        <w:ind w:left="1440" w:hanging="360"/>
+      </w:pPr>
+      <w:rPr>
+        <w:rFonts w:ascii="Symbol" w:hAnsi="Symbol" w:hint="default"/>
+      </w:rPr>
+    </w:lvl>
+    <w:lvl w:ilvl="1" w:tplc="04160003">
+      <w:start w:val="1"/>
+      <w:numFmt w:val="bullet"/>
+      <w:lvlText w:val="o"/>
+      <w:lvlJc w:val="left"/>
+      <w:pPr>
+        <w:ind w:left="2160" w:hanging="360"/>
+      </w:pPr>
+      <w:rPr>
+        <w:rFonts w:ascii="Courier New" w:hAnsi="Courier New" w:cs="Courier New" w:hint="default"/>
+      </w:rPr>
+    </w:lvl>
+    <w:lvl w:ilvl="2" w:tplc="04160005" w:tentative="1">
+      <w:start w:val="1"/>
+      <w:numFmt w:val="bullet"/>
+      <w:lvlText w:val=""/>
+      <w:lvlJc w:val="left"/>
+      <w:pPr>
+        <w:ind w:left="2880" w:hanging="360"/>
+      </w:pPr>
+      <w:rPr>
+        <w:rFonts w:ascii="Wingdings" w:hAnsi="Wingdings" w:hint="default"/>
+      </w:rPr>
+    </w:lvl>
+    <w:lvl w:ilvl="3" w:tplc="04160001" w:tentative="1">
+      <w:start w:val="1"/>
+      <w:numFmt w:val="bullet"/>
+      <w:lvlText w:val=""/>
+      <w:lvlJc w:val="left"/>
+      <w:pPr>
+        <w:ind w:left="3600" w:hanging="360"/>
+      </w:pPr>
+      <w:rPr>
+        <w:rFonts w:ascii="Symbol" w:hAnsi="Symbol" w:hint="default"/>
+      </w:rPr>
+    </w:lvl>
+    <w:lvl w:ilvl="4" w:tplc="04160003" w:tentative="1">
+      <w:start w:val="1"/>
+      <w:numFmt w:val="bullet"/>
+      <w:lvlText w:val="o"/>
+      <w:lvlJc w:val="left"/>
+      <w:pPr>
+        <w:ind w:left="4320" w:hanging="360"/>
+      </w:pPr>
+      <w:rPr>
+        <w:rFonts w:ascii="Courier New" w:hAnsi="Courier New" w:cs="Courier New" w:hint="default"/>
+      </w:rPr>
+    </w:lvl>
+    <w:lvl w:ilvl="5" w:tplc="04160005" w:tentative="1">
+      <w:start w:val="1"/>
+      <w:numFmt w:val="bullet"/>
+      <w:lvlText w:val=""/>
+      <w:lvlJc w:val="left"/>
+      <w:pPr>
+        <w:ind w:left="5040" w:hanging="360"/>
+      </w:pPr>
+      <w:rPr>
+        <w:rFonts w:ascii="Wingdings" w:hAnsi="Wingdings" w:hint="default"/>
+      </w:rPr>
+    </w:lvl>
+    <w:lvl w:ilvl="6" w:tplc="04160001" w:tentative="1">
+      <w:start w:val="1"/>
+      <w:numFmt w:val="bullet"/>
+      <w:lvlText w:val=""/>
+      <w:lvlJc w:val="left"/>
+      <w:pPr>
+        <w:ind w:left="5760" w:hanging="360"/>
+      </w:pPr>
+      <w:rPr>
+        <w:rFonts w:ascii="Symbol" w:hAnsi="Symbol" w:hint="default"/>
+      </w:rPr>
+    </w:lvl>
+    <w:lvl w:ilvl="7" w:tplc="04160003" w:tentative="1">
+      <w:start w:val="1"/>
+      <w:numFmt w:val="bullet"/>
+      <w:lvlText w:val="o"/>
+      <w:lvlJc w:val="left"/>
+      <w:pPr>
+        <w:ind w:left="6480" w:hanging="360"/>
+      </w:pPr>
+      <w:rPr>
+        <w:rFonts w:ascii="Courier New" w:hAnsi="Courier New" w:cs="Courier New" w:hint="default"/>
+      </w:rPr>
+    </w:lvl>
+    <w:lvl w:ilvl="8" w:tplc="04160005" w:tentative="1">
+      <w:start w:val="1"/>
+      <w:numFmt w:val="bullet"/>
+      <w:lvlText w:val=""/>
+      <w:lvlJc w:val="left"/>
+      <w:pPr>
+        <w:ind w:left="7200" w:hanging="360"/>
+      </w:pPr>
+      <w:rPr>
+        <w:rFonts w:ascii="Wingdings" w:hAnsi="Wingdings" w:hint="default"/>
+      </w:rPr>
+    </w:lvl>
+  </w:abstractNum>
+  <w:abstractNum w:abstractNumId="4" w15:restartNumberingAfterBreak="0">
     <w:nsid w:val="272C0E6A"/>
     <w:multiLevelType w:val="hybridMultilevel"/>
     <w:tmpl w:val="6C10104A"/>
@@ -3817,7 +4856,7 @@
       </w:rPr>
     </w:lvl>
   </w:abstractNum>
-  <w:abstractNum w:abstractNumId="3" w15:restartNumberingAfterBreak="0">
+  <w:abstractNum w:abstractNumId="5" w15:restartNumberingAfterBreak="0">
     <w:nsid w:val="2A3025D4"/>
     <w:multiLevelType w:val="hybridMultilevel"/>
     <w:tmpl w:val="C74E7AAA"/>
@@ -3930,7 +4969,7 @@
       </w:rPr>
     </w:lvl>
   </w:abstractNum>
-  <w:abstractNum w:abstractNumId="4" w15:restartNumberingAfterBreak="0">
+  <w:abstractNum w:abstractNumId="6" w15:restartNumberingAfterBreak="0">
     <w:nsid w:val="3DBF1ABA"/>
     <w:multiLevelType w:val="hybridMultilevel"/>
     <w:tmpl w:val="F544D0E0"/>
@@ -4043,7 +5082,7 @@
       </w:rPr>
     </w:lvl>
   </w:abstractNum>
-  <w:abstractNum w:abstractNumId="5" w15:restartNumberingAfterBreak="0">
+  <w:abstractNum w:abstractNumId="7" w15:restartNumberingAfterBreak="0">
     <w:nsid w:val="424174E0"/>
     <w:multiLevelType w:val="hybridMultilevel"/>
     <w:tmpl w:val="01EC36D0"/>
@@ -4156,7 +5195,7 @@
       </w:rPr>
     </w:lvl>
   </w:abstractNum>
-  <w:abstractNum w:abstractNumId="6" w15:restartNumberingAfterBreak="0">
+  <w:abstractNum w:abstractNumId="8" w15:restartNumberingAfterBreak="0">
     <w:nsid w:val="4A3E655E"/>
     <w:multiLevelType w:val="hybridMultilevel"/>
     <w:tmpl w:val="337C7E12"/>
@@ -4269,7 +5308,7 @@
       </w:rPr>
     </w:lvl>
   </w:abstractNum>
-  <w:abstractNum w:abstractNumId="7" w15:restartNumberingAfterBreak="0">
+  <w:abstractNum w:abstractNumId="9" w15:restartNumberingAfterBreak="0">
     <w:nsid w:val="4B5707C9"/>
     <w:multiLevelType w:val="hybridMultilevel"/>
     <w:tmpl w:val="A64C2126"/>
@@ -4355,7 +5394,7 @@
       </w:pPr>
     </w:lvl>
   </w:abstractNum>
-  <w:abstractNum w:abstractNumId="8" w15:restartNumberingAfterBreak="0">
+  <w:abstractNum w:abstractNumId="10" w15:restartNumberingAfterBreak="0">
     <w:nsid w:val="4EA83C7F"/>
     <w:multiLevelType w:val="hybridMultilevel"/>
     <w:tmpl w:val="26C81A40"/>
@@ -4468,7 +5507,7 @@
       </w:rPr>
     </w:lvl>
   </w:abstractNum>
-  <w:abstractNum w:abstractNumId="9" w15:restartNumberingAfterBreak="0">
+  <w:abstractNum w:abstractNumId="11" w15:restartNumberingAfterBreak="0">
     <w:nsid w:val="589A62FB"/>
     <w:multiLevelType w:val="hybridMultilevel"/>
     <w:tmpl w:val="E4809B6E"/>
@@ -4581,7 +5620,7 @@
       </w:rPr>
     </w:lvl>
   </w:abstractNum>
-  <w:abstractNum w:abstractNumId="10" w15:restartNumberingAfterBreak="0">
+  <w:abstractNum w:abstractNumId="12" w15:restartNumberingAfterBreak="0">
     <w:nsid w:val="5A7B769C"/>
     <w:multiLevelType w:val="hybridMultilevel"/>
     <w:tmpl w:val="4576260C"/>
@@ -4694,7 +5733,7 @@
       </w:rPr>
     </w:lvl>
   </w:abstractNum>
-  <w:abstractNum w:abstractNumId="11" w15:restartNumberingAfterBreak="0">
+  <w:abstractNum w:abstractNumId="13" w15:restartNumberingAfterBreak="0">
     <w:nsid w:val="5C0C737E"/>
     <w:multiLevelType w:val="multilevel"/>
     <w:tmpl w:val="D3DC257C"/>
@@ -4843,7 +5882,7 @@
       </w:rPr>
     </w:lvl>
   </w:abstractNum>
-  <w:abstractNum w:abstractNumId="12" w15:restartNumberingAfterBreak="0">
+  <w:abstractNum w:abstractNumId="14" w15:restartNumberingAfterBreak="0">
     <w:nsid w:val="5DFA1C62"/>
     <w:multiLevelType w:val="hybridMultilevel"/>
     <w:tmpl w:val="14345D90"/>
@@ -4956,7 +5995,7 @@
       </w:rPr>
     </w:lvl>
   </w:abstractNum>
-  <w:abstractNum w:abstractNumId="13" w15:restartNumberingAfterBreak="0">
+  <w:abstractNum w:abstractNumId="15" w15:restartNumberingAfterBreak="0">
     <w:nsid w:val="632256CD"/>
     <w:multiLevelType w:val="hybridMultilevel"/>
     <w:tmpl w:val="A11E6AB2"/>
@@ -5069,7 +6108,7 @@
       </w:rPr>
     </w:lvl>
   </w:abstractNum>
-  <w:abstractNum w:abstractNumId="14" w15:restartNumberingAfterBreak="0">
+  <w:abstractNum w:abstractNumId="16" w15:restartNumberingAfterBreak="0">
     <w:nsid w:val="67FF678E"/>
     <w:multiLevelType w:val="hybridMultilevel"/>
     <w:tmpl w:val="E7FC5CAC"/>
@@ -5182,7 +6221,120 @@
       </w:rPr>
     </w:lvl>
   </w:abstractNum>
-  <w:abstractNum w:abstractNumId="15" w15:restartNumberingAfterBreak="0">
+  <w:abstractNum w:abstractNumId="17" w15:restartNumberingAfterBreak="0">
+    <w:nsid w:val="6E021F0A"/>
+    <w:multiLevelType w:val="hybridMultilevel"/>
+    <w:tmpl w:val="0A4A32CC"/>
+    <w:lvl w:ilvl="0" w:tplc="04160001">
+      <w:start w:val="1"/>
+      <w:numFmt w:val="bullet"/>
+      <w:lvlText w:val=""/>
+      <w:lvlJc w:val="left"/>
+      <w:pPr>
+        <w:ind w:left="720" w:hanging="360"/>
+      </w:pPr>
+      <w:rPr>
+        <w:rFonts w:ascii="Symbol" w:hAnsi="Symbol" w:hint="default"/>
+      </w:rPr>
+    </w:lvl>
+    <w:lvl w:ilvl="1" w:tplc="04160003" w:tentative="1">
+      <w:start w:val="1"/>
+      <w:numFmt w:val="bullet"/>
+      <w:lvlText w:val="o"/>
+      <w:lvlJc w:val="left"/>
+      <w:pPr>
+        <w:ind w:left="1440" w:hanging="360"/>
+      </w:pPr>
+      <w:rPr>
+        <w:rFonts w:ascii="Courier New" w:hAnsi="Courier New" w:cs="Courier New" w:hint="default"/>
+      </w:rPr>
+    </w:lvl>
+    <w:lvl w:ilvl="2" w:tplc="04160005" w:tentative="1">
+      <w:start w:val="1"/>
+      <w:numFmt w:val="bullet"/>
+      <w:lvlText w:val=""/>
+      <w:lvlJc w:val="left"/>
+      <w:pPr>
+        <w:ind w:left="2160" w:hanging="360"/>
+      </w:pPr>
+      <w:rPr>
+        <w:rFonts w:ascii="Wingdings" w:hAnsi="Wingdings" w:hint="default"/>
+      </w:rPr>
+    </w:lvl>
+    <w:lvl w:ilvl="3" w:tplc="04160001" w:tentative="1">
+      <w:start w:val="1"/>
+      <w:numFmt w:val="bullet"/>
+      <w:lvlText w:val=""/>
+      <w:lvlJc w:val="left"/>
+      <w:pPr>
+        <w:ind w:left="2880" w:hanging="360"/>
+      </w:pPr>
+      <w:rPr>
+        <w:rFonts w:ascii="Symbol" w:hAnsi="Symbol" w:hint="default"/>
+      </w:rPr>
+    </w:lvl>
+    <w:lvl w:ilvl="4" w:tplc="04160003" w:tentative="1">
+      <w:start w:val="1"/>
+      <w:numFmt w:val="bullet"/>
+      <w:lvlText w:val="o"/>
+      <w:lvlJc w:val="left"/>
+      <w:pPr>
+        <w:ind w:left="3600" w:hanging="360"/>
+      </w:pPr>
+      <w:rPr>
+        <w:rFonts w:ascii="Courier New" w:hAnsi="Courier New" w:cs="Courier New" w:hint="default"/>
+      </w:rPr>
+    </w:lvl>
+    <w:lvl w:ilvl="5" w:tplc="04160005" w:tentative="1">
+      <w:start w:val="1"/>
+      <w:numFmt w:val="bullet"/>
+      <w:lvlText w:val=""/>
+      <w:lvlJc w:val="left"/>
+      <w:pPr>
+        <w:ind w:left="4320" w:hanging="360"/>
+      </w:pPr>
+      <w:rPr>
+        <w:rFonts w:ascii="Wingdings" w:hAnsi="Wingdings" w:hint="default"/>
+      </w:rPr>
+    </w:lvl>
+    <w:lvl w:ilvl="6" w:tplc="04160001" w:tentative="1">
+      <w:start w:val="1"/>
+      <w:numFmt w:val="bullet"/>
+      <w:lvlText w:val=""/>
+      <w:lvlJc w:val="left"/>
+      <w:pPr>
+        <w:ind w:left="5040" w:hanging="360"/>
+      </w:pPr>
+      <w:rPr>
+        <w:rFonts w:ascii="Symbol" w:hAnsi="Symbol" w:hint="default"/>
+      </w:rPr>
+    </w:lvl>
+    <w:lvl w:ilvl="7" w:tplc="04160003" w:tentative="1">
+      <w:start w:val="1"/>
+      <w:numFmt w:val="bullet"/>
+      <w:lvlText w:val="o"/>
+      <w:lvlJc w:val="left"/>
+      <w:pPr>
+        <w:ind w:left="5760" w:hanging="360"/>
+      </w:pPr>
+      <w:rPr>
+        <w:rFonts w:ascii="Courier New" w:hAnsi="Courier New" w:cs="Courier New" w:hint="default"/>
+      </w:rPr>
+    </w:lvl>
+    <w:lvl w:ilvl="8" w:tplc="04160005" w:tentative="1">
+      <w:start w:val="1"/>
+      <w:numFmt w:val="bullet"/>
+      <w:lvlText w:val=""/>
+      <w:lvlJc w:val="left"/>
+      <w:pPr>
+        <w:ind w:left="6480" w:hanging="360"/>
+      </w:pPr>
+      <w:rPr>
+        <w:rFonts w:ascii="Wingdings" w:hAnsi="Wingdings" w:hint="default"/>
+      </w:rPr>
+    </w:lvl>
+  </w:abstractNum>
+  <w:abstractNum w:abstractNumId="18" w15:restartNumberingAfterBreak="0">
     <w:nsid w:val="721973AF"/>
     <w:multiLevelType w:val="multilevel"/>
     <w:tmpl w:val="945C34E0"/>
@@ -5332,52 +6484,61 @@
     </w:lvl>
   </w:abstractNum>
   <w:num w:numId="1" w16cid:durableId="1845120210">
-    <w:abstractNumId w:val="13"/>
+    <w:abstractNumId w:val="15"/>
   </w:num>
   <w:num w:numId="2" w16cid:durableId="1208224393">
-    <w:abstractNumId w:val="11"/>
+    <w:abstractNumId w:val="13"/>
   </w:num>
   <w:num w:numId="3" w16cid:durableId="1522545533">
     <w:abstractNumId w:val="0"/>
   </w:num>
   <w:num w:numId="4" w16cid:durableId="1300649518">
+    <w:abstractNumId w:val="14"/>
+  </w:num>
+  <w:num w:numId="5" w16cid:durableId="1394237260">
+    <w:abstractNumId w:val="6"/>
+  </w:num>
+  <w:num w:numId="6" w16cid:durableId="1944221231">
+    <w:abstractNumId w:val="9"/>
+  </w:num>
+  <w:num w:numId="7" w16cid:durableId="1984657101">
     <w:abstractNumId w:val="12"/>
   </w:num>
-  <w:num w:numId="5" w16cid:durableId="1394237260">
+  <w:num w:numId="8" w16cid:durableId="1326395759">
     <w:abstractNumId w:val="4"/>
   </w:num>
-  <w:num w:numId="6" w16cid:durableId="1944221231">
+  <w:num w:numId="9" w16cid:durableId="818304017">
+    <w:abstractNumId w:val="16"/>
+  </w:num>
+  <w:num w:numId="10" w16cid:durableId="1857383228">
+    <w:abstractNumId w:val="18"/>
+  </w:num>
+  <w:num w:numId="11" w16cid:durableId="1779400553">
+    <w:abstractNumId w:val="5"/>
+  </w:num>
+  <w:num w:numId="12" w16cid:durableId="794250166">
+    <w:abstractNumId w:val="11"/>
+  </w:num>
+  <w:num w:numId="13" w16cid:durableId="1275475085">
     <w:abstractNumId w:val="7"/>
   </w:num>
-  <w:num w:numId="7" w16cid:durableId="1984657101">
+  <w:num w:numId="14" w16cid:durableId="814641638">
     <w:abstractNumId w:val="10"/>
-  </w:num>
-  <w:num w:numId="8" w16cid:durableId="1326395759">
-    <w:abstractNumId w:val="2"/>
-  </w:num>
-  <w:num w:numId="9" w16cid:durableId="818304017">
-    <w:abstractNumId w:val="14"/>
-  </w:num>
-  <w:num w:numId="10" w16cid:durableId="1857383228">
-    <w:abstractNumId w:val="15"/>
-  </w:num>
-  <w:num w:numId="11" w16cid:durableId="1779400553">
-    <w:abstractNumId w:val="3"/>
-  </w:num>
-  <w:num w:numId="12" w16cid:durableId="794250166">
-    <w:abstractNumId w:val="9"/>
-  </w:num>
-  <w:num w:numId="13" w16cid:durableId="1275475085">
-    <w:abstractNumId w:val="5"/>
-  </w:num>
-  <w:num w:numId="14" w16cid:durableId="814641638">
-    <w:abstractNumId w:val="8"/>
   </w:num>
   <w:num w:numId="15" w16cid:durableId="1554468009">
     <w:abstractNumId w:val="1"/>
   </w:num>
   <w:num w:numId="16" w16cid:durableId="2002736655">
-    <w:abstractNumId w:val="6"/>
+    <w:abstractNumId w:val="8"/>
+  </w:num>
+  <w:num w:numId="17" w16cid:durableId="1113786648">
+    <w:abstractNumId w:val="2"/>
+  </w:num>
+  <w:num w:numId="18" w16cid:durableId="1646084500">
+    <w:abstractNumId w:val="3"/>
+  </w:num>
+  <w:num w:numId="19" w16cid:durableId="1301887442">
+    <w:abstractNumId w:val="17"/>
   </w:num>
 </w:numbering>
 </file>
@@ -5782,7 +6943,7 @@
   <w:style w:type="paragraph" w:default="1" w:styleId="Normal">
     <w:name w:val="Normal"/>
     <w:qFormat/>
-    <w:rsid w:val="004925AC"/>
+    <w:rsid w:val="00E771AA"/>
   </w:style>
   <w:style w:type="paragraph" w:styleId="Ttulo1">
     <w:name w:val="heading 1"/>

</xml_diff>